<commit_message>
Revise manuscript around audited findings
Co-Authored-By: Tatsuki Onishi <bougtoir@gmail.com>
</commit_message>
<xml_diff>
--- a/manuscript/build/manuscript.docx
+++ b/manuscript/build/manuscript.docx
@@ -45,7 +45,7 @@
     </w:p>
     <w:p>
       <w:r>
-        <w:t>Passive roof-snow strategies face a modeled trade-off between retaining snow mass and releasing large discrete snow-shedding events. This study tests whether spatial variation in roof slope and snow-surface interaction changes that trade-off relative to optimized spatially uniform roofs. A unit-width roof was discretized into cells with slope, static and kinetic friction, adhesion, snow mass, age, volume, and density states. Synthetic weather scenarios were used for primary optimization; official Japanese Meteorological Agency daily observations provided supplementary scenario evaluation rather than validation. Uniform designs were mapped before checkpointed, multi-seed NSGA-II optimization of geometry-only, surface-only, and joint heterogeneous profiles. Primary outcomes were maximum modeled roof snow mass per metre and maximum eave-release mass per timestep. Convergence, ablation, parameter sensitivity, Monte Carlo perturbation, continuous-to-discrete surface mapping, and labor-scarcity decision weights were evaluated. At the normalized-distance knee, the selected joint profile had Lmax=3210.6 kg m-1 and Smax=40.00 kg m-1. Relative to the selected uniform knee, these values changed by +3913.3% and -50.0%, respectively. This knee comparison is illustrative and does not establish front-wide superiority. The results define conditional modeled trade-offs, not structural or pedestrian safety. The reduced-order model omits wind redistribution and requires calibration against roof-scale observations before design use.</w:t>
+        <w:t>Passive roof-snow strategies trade retained modeled snow mass against discrete eave-release mass. We tested whether spatial variation in slope, friction, and adhesion changed that trade-off relative to an exhaustively mapped uniform design space. A unit-width, cell-based threshold-release model was evaluated under synthetic weather, with Japanese Meteorological Agency daily observations used only as supplementary forcing. Multi-seed NSGA-II generated geometry-only, surface-only, and joint heterogeneous sets. The uniform set contained 2 unique objective pairs, whereas the joint set contained 8, including the uniform endpoints and additional intermediate trade-offs. Under the frozen common reference, their normalized hypervolumes were 0.402 and 0.611; joint additive epsilon versus uniform was 0.000. The joint set had 6 intermediate objective pairs unavailable to the uniform set under the same objective caps. 6 candidates tied the minimum robustness score. Mapping the continuous joint knee to feasible generic segments changed modeled retained mass by 0.36% and release mass by 11.03%. All 3 selected designs failed the frozen composite timestep criterion at 1 h. Spatial grading therefore expanded modeled intermediate trade-off regions, but no front-wide superiority, structural safety, or validated roof performance is established.</w:t>
       </w:r>
     </w:p>
     <w:p>
@@ -68,7 +68,7 @@
     </w:p>
     <w:p>
       <w:r>
-        <w:t>Japanese technical and administrative sources distinguish retention, shedding, melting, and load-resisting strategies and document the importance of surface condition, aging, snow guards, drainage, cornices, and site context [13-21]. These sources do not establish universal material coefficients or safety thresholds. They instead motivate the present comparison of generic spatially uniform and graded design spaces.</w:t>
+        <w:t>Japanese technical and administrative sources distinguish retention, shedding, melting, and load-resisting strategies and document the importance of surface condition, aging, snow guards, drainage, cornices, and site context [13-22]. Retention can reduce required snow-fall space at dense sites, whereas shedding requires a suitable receiving zone; retained snow instead imposes long-duration load and drainage obligations. These sources do not establish universal material coefficients, safety thresholds, or one preferable strategy. They motivate a conditional comparison of generic uniform and graded design spaces.</w:t>
       </w:r>
     </w:p>
     <w:p>
@@ -170,12 +170,12 @@
     </w:p>
     <w:p>
       <w:r>
-        <w:t>A full 30 x 30 x 7 uniform slope-friction-adhesion map preceded heterogeneous optimization. Geometry-only, surface-only, and joint profiles were parameterized by 4 control points interpolated across the roof. Checkpointed NSGA-II used a population of 48, 45 generations, and seeds 1701, 2903, 4517. Feasible historical evaluations from every seed were combined and filtered to complete nondominated sets. Normalized hypervolume, additive epsilon versus the uniform front, combined-set dominance, and matched-objective improvement were calculated. Per-seed hypervolume and additive epsilon summarized optimizer stochasticity in a machine-readable supplement. Figure 6 reports numerical convergence; Figure 7 reports prespecified one-at-a-time sensitivity.</w:t>
+        <w:t>A full 30 x 30 x 7 uniform slope-friction-adhesion map preceded heterogeneous optimization. Geometry-only, surface-only, and joint profiles were parameterized by 4 control points interpolated across the roof. Checkpointed NSGA-II used a population of 48, 45 generations, and seeds 1701, 2903, 4517. Feasible historical evaluations from every seed were combined and filtered to approximate nondominated heterogeneous sets; only the uniform grid was exhaustively enumerated. Objective pairs were deduplicated at six decimal places for frontier metrics while design rows remained available for robustness and constructability analyses. Normalized hypervolume used common bounds and a reference at 105% of the joint objective maxima. Additive epsilon versus uniform, combined-set dominance, matched-objective constraints, and reference-point sensitivity were calculated. A normalized-distance knee was reported only as a within-front descriptive selection; common and front-specific normalizations were audited separately. Per-seed metrics summarized optimizer stochasticity in a machine-readable supplement. Figure 6 reports numerical convergence; Figure 7 reports prespecified one-at-a-time sensitivity.</w:t>
       </w:r>
     </w:p>
     <w:p>
       <w:r>
-        <w:t>Monte Carlo robustness used 250 deterministic draws perturbing friction, adhesion, fresh-snow density, snowfall, and temperature for prespecified candidates sampled across the uniform and joint fronts. Continuous joint profiles were mapped to 3 generic surface classes and piecewise roof segments of at least 3 cells, with at most 6 transitions, without claiming proprietary material performance. Frozen manual-intervention weights generated low, medium, and high labor-scarcity choices across configured snowfall, shedding-penalty, and allowable-release scenarios. Figures 8-9 and Tables 4-8 summarize these analyses.</w:t>
+        <w:t>Monte Carlo robustness used 250 deterministic draws perturbing friction, adhesion, fresh-snow density, snowfall, and temperature for prespecified candidates sampled across the uniform and joint fronts. Every candidate received the same factor vector within each draw, permitting paired comparisons; Monte Carlo quantiles were not interpreted as empirical confidence intervals. Continuous optimization enforced only maximum adjacent slope change. Minimum segment length, maximum transition count, and generic surface classes were audited after optimization. Continuous joint profiles were mapped to 3 generic surface classes and piecewise roof segments of at least 3 cells, with at most 6 transitions, without claiming that the mapped design was a constrained optimum or represented proprietary material performance. Frozen manual-intervention weights generated low, medium, and high labor-scarcity choices across configured snowfall, shedding-penalty, and allowable-release scenarios. Figures 8-9 and Tables 4-8 summarize these analyses.</w:t>
       </w:r>
     </w:p>
     <w:p>
@@ -196,7 +196,7 @@
     </w:p>
     <w:p>
       <w:r>
-        <w:t>Across the synthetic scenarios, the retention baseline produced Lmax=6417.0 kg m-1 and Smax=0.000 kg m-1, whereas the shedding baseline produced Lmax=80.00 kg m-1 and Smax=80.00 kg m-1. These are modeled unit-width masses, not structural loads. The frozen 8% four-metric convergence tolerance was met by 3 of 9 tested resolution combinations. The kinetic-energy proxy was invariant to cell count for the uniform regression case.</w:t>
+        <w:t>Across the synthetic scenarios, the retention baseline produced Lmax=6417.0 kg m-1 and Smax=0.000 kg m-1, whereas the shedding baseline produced Lmax=80.00 kg m-1 and Smax=80.00 kg m-1. These are modeled unit-width masses, not structural loads. The frozen 8% four-metric convergence tolerance was met by 3 of 9 tested resolution combinations. At the production 1 h interval, all 3 selected uniform, continuous-joint, and mapped-joint designs failed the same composite criterion. Smax is release mass in one model interval and therefore must be interpreted with the stated timestep.</w:t>
       </w:r>
     </w:p>
     <w:p>
@@ -204,17 +204,12 @@
         <w:pStyle w:val="Heading2"/>
       </w:pPr>
       <w:r>
-        <w:t>3.2 Uniform and heterogeneous Pareto sets</w:t>
+        <w:t>3.2 Optimized uniform reference</w:t>
       </w:r>
     </w:p>
     <w:p>
       <w:r>
-        <w:t>At the normalized-distance knee, the selected joint profile had Lmax=3210.6 kg m-1 and Smax=40.00 kg m-1. Relative to the selected uniform knee, these values changed by +3913.3% and -50.0%, respectively. This knee comparison is illustrative and does not establish front-wide superiority.</w:t>
-      </w:r>
-    </w:p>
-    <w:p>
-      <w:r>
-        <w:t>The complete frontier summary was uniform: 2912 points, normalized hypervolume 0.402, additive epsilon versus uniform 0.000; geometry: 320 points, normalized hypervolume 0.267, additive epsilon versus uniform 0.205; surface: 1731 points, normalized hypervolume 0.402, additive epsilon versus uniform 0.000; joint: 1928 points, normalized hypervolume 0.611, additive epsilon versus uniform 0.000. Because repeated objective pairs can correspond to distinct design profiles, all nondominated design rows were retained in machine-readable results.</w:t>
+        <w:t>The exhaustive uniform grid produced 2912 nondominated design rows but only 2 objective pairs: 80.00/80.00 kg m-1 and 6417.0/0.000 kg m-1 for Lmax/Smax. The multiplicity reflects objective-equivalent profiles rather than a dense uniform trade-off curve. Surface-only optimization reproduced the same two objective pairs.</w:t>
       </w:r>
     </w:p>
     <w:p>
@@ -222,22 +217,22 @@
         <w:pStyle w:val="Heading2"/>
       </w:pPr>
       <w:r>
-        <w:t>3.3 Robustness, complexity, and decision scenarios</w:t>
+        <w:t>3.3 Heterogeneous Pareto comparisons</w:t>
       </w:r>
     </w:p>
     <w:p>
       <w:r>
-        <w:t>Under the prespecified perturbation model, joint: median Lmax 85.75 kg m-1 and median Smax 78.10 kg m-1; uniform: median Lmax 5854.6 kg m-1 and median Smax 0.000 kg m-1. These distributions quantify parameter perturbations around selected designs and are not empirical confidence intervals.</w:t>
+        <w:t>The uniform set contained 2 unique objective pairs, whereas the joint set contained 8, including the uniform endpoints and additional intermediate trade-offs. Under the frozen common reference, their normalized hypervolumes were 0.402 and 0.611; joint additive epsilon versus uniform was 0.000.</w:t>
       </w:r>
     </w:p>
     <w:p>
       <w:r>
-        <w:t>Among the prespecified frontier candidates, the robust selection was joint_02 (joint); its configured upper-quantile Lmax and Smax were 103.8 and 103.8 kg m-1. Table 8 compares this result with 2 nominal knees and the remaining candidate set.</w:t>
+        <w:t>The complete frontier summary was uniform: 2 objective pairs, normalized hypervolume 0.402, additive epsilon versus uniform 0.000; geometry: 15 objective pairs, normalized hypervolume 0.267, additive epsilon versus uniform 0.205; surface: 2 objective pairs, normalized hypervolume 0.402, additive epsilon versus uniform 0.000; joint: 8 objective pairs, normalized hypervolume 0.611, additive epsilon versus uniform 0.000. Joint hypervolume exceeded uniform because the joint set included the uniform objective pairs and 6 additional intermediate pairs. Joint additive epsilon versus uniform was nevertheless zero because every uniform reference point was weakly matched; this does not imply front-wide superiority. Hypervolume ordering was unchanged under the audited origin and reference-margin choices.</w:t>
       </w:r>
     </w:p>
     <w:p>
       <w:r>
-        <w:t>Manufacturable segment mapping, generic surface mapping, and slope rounding changed the primary outcomes by the amounts reported in Table 3. Frontier-wide complexity and manufacturing-screen metrics are reported in Table 6; Table 7 reports choices under no, base, and high transition penalties. Labor-scarcity scenarios weight manual intervention directly (Table 5) and were not assigned to actual communities. Table 4 varies snowfall severity, shedding penalties, allowable release, and labor scarcity. Strategy classifications are model-derived labels rather than building-code recommendations.</w:t>
+        <w:t>The front-specific joint knee was 3210.6/40.00 kg m-1, whereas common normalization selected 2941.9/43.33 kg m-1. The normalization dependence precludes a cross-front percentage headline. At the strictest prespecified Smax limit of 20 kg m-1, the minimum observed Lmax was 5082.2 kg m-1 for joint and 6417.0 kg m-1 for uniform.</w:t>
       </w:r>
     </w:p>
     <w:p>
@@ -245,12 +240,38 @@
         <w:pStyle w:val="Heading2"/>
       </w:pPr>
       <w:r>
-        <w:t>3.4 JMA station-winter scenarios</w:t>
+        <w:t>3.4 Robustness</w:t>
       </w:r>
     </w:p>
     <w:p>
       <w:r>
-        <w:t>Daily forcing covered 4 stations and 12 station-winters. Table 9 reports the selected uniform and joint profiles under these observations. Daily aggregation coarsens event timing, so these outputs are supplementary scenario checks and not comparable to hourly shedding observations.</w:t>
+        <w:t>Among 14 candidates with the nominal 80.00/80.00 kg m-1 objective pair, Q95 Lmax ranged from 103.8 to 7465.5 kg m-1, Q95 Smax ranged from 103.8 to 5482.6 kg m-1, and manual-intervention probability ranged from 0.000 to 0.432. The minimum scalar robustness score was shared by 6 candidates, so the retained selected flag is only a deterministic row-order tie-break. Monte Carlo quantiles describe the configured perturbation model, not empirical confidence intervals.</w:t>
+      </w:r>
+    </w:p>
+    <w:p>
+      <w:pPr>
+        <w:pStyle w:val="Heading2"/>
+      </w:pPr>
+      <w:r>
+        <w:t>3.5 Constructability and decision scenarios</w:t>
+      </w:r>
+    </w:p>
+    <w:p>
+      <w:r>
+        <w:t>Only 9 of the 1928 joint design rows met all post hoc constructability checks, and all belonged to the 80.00/80.00 kg m-1 objective pair. The selected continuous joint knee had 23 slope and 23 surface transitions and minimum segment length 1 cell. Generic mapping reduced these to 6 and 3 transitions; Lmax changed by 11.68 kg m-1 (0.36%) and Smax by 4.41 kg m-1 (11.03%). The mapped profile is a feasible translation, not a constrained optimum. Every frozen transition-penalty setting selected a uniform design. Labor-scarcity and phase-diagram classifications remain illustrative decision weights, not community or building-code recommendations.</w:t>
+      </w:r>
+    </w:p>
+    <w:p>
+      <w:pPr>
+        <w:pStyle w:val="Heading2"/>
+      </w:pPr>
+      <w:r>
+        <w:t>3.6 JMA station-winter scenarios</w:t>
+      </w:r>
+    </w:p>
+    <w:p>
+      <w:r>
+        <w:t>Daily forcing covered 4 stations and 12 station-winters without missing temperature or snowfall days. Joint-to-uniform Lmax ratios ranged from 1.21 to 11.62, while Smax reductions ranged from 48.96% to 50.00%. These paired modeled trade-offs were strongly station-winter dependent. Daily ground observations are supplementary forcing, not roof-scale validation, and daily Smax is not directly comparable with hourly Smax.</w:t>
       </w:r>
     </w:p>
     <w:p>
@@ -263,12 +284,22 @@
     </w:p>
     <w:p>
       <w:r>
-        <w:t>The analysis demonstrates how spatial grading can be evaluated against a fully optimized uniform reference rather than a single hand-picked roof. The computed fronts support only conditional statements within the reduced-order model. A larger normalized hypervolume or a favorable selected knee does not imply that every heterogeneous design is better, nor that the same relation persists under unmodeled wind, geometry, or material behavior.</w:t>
+        <w:t>The frozen research question can be answered narrowly: under identical modeled forcing, spatial variation did not improve the 2 uniform objective regimes, but it introduced 6 observed intermediate Lmax-Smax combinations that the exhaustive uniform grid did not attain under the same objective caps. This is an expansion of the modeled trade-off set, not universal superiority. The joint front's larger hypervolume and zero additive epsilon are compatible because it contains the uniform endpoints while filling intermediate regions.</w:t>
       </w:r>
     </w:p>
     <w:p>
       <w:r>
-        <w:t>The main design implication is methodological: passive snow-management concepts should be compared as trade-off sets, with manufacturability and operational preferences included explicitly. The generic surface mapping shows how a smooth continuous optimum can be translated into a small material-class vocabulary while measuring the resulting objective loss.</w:t>
+        <w:t>Knee selection is unsuitable as the primary cross-front claim: front-specific normalization and common normalization selected different joint designs. Matched objective caps provide a clearer interpretation. Robustness also cannot be inferred from nominal objectives, because nominally equivalent profiles had widely different upper-tail outcomes and the best scalar score was tied.</w:t>
+      </w:r>
+    </w:p>
+    <w:p>
+      <w:r>
+        <w:t>Constructability materially changes the interpretation. The intermediate joint trade-offs were found in continuous profiles that did not directly satisfy all segment and transition limits. Post hoc mapping incurred modest Lmax change but an 11.03% Smax increase, and every frozen transition penalty selected a uniform regime. Graded concepts therefore require constrained reoptimization and physical testing before practical comparison.</w:t>
+      </w:r>
+    </w:p>
+    <w:p>
+      <w:r>
+        <w:t>Retention, shedding, active melting, manual removal, and hybrid systems solve different site problems. Retention can limit routine eave release and reduce snow-fall-space demand, but requires verified structural capacity, drainage, waterproofing, inspection, and maintenance. Shedding can reduce retained mass but requires a controlled receiving area and falling-snow measures. The model does not invalidate either strategy, and Japanese guidance cannot be generalized to other climates, building traditions, or regulatory systems without local evidence [13-22].</w:t>
       </w:r>
     </w:p>
     <w:p>
@@ -281,7 +312,7 @@
     </w:p>
     <w:p>
       <w:r>
-        <w:t>The model has not been calibrated or validated against roof-scale shedding measurements. It omits wind redistribution, three-dimensional flow, snow fracture and slab mechanics, cornices, local roof details, heat transfer through the assembly, impact trajectories, drainage blockage, structural response, and pedestrian exposure. Friction, adhesion, compaction, melt, and aging parameters include explicit assumptions. Daily JMA observations do not resolve subdaily events, and ground snowfall or snow depth is not roof snow mass. Accordingly, the study does not establish structural safety, pedestrian safety, code compliance, injury reduction, lifecycle cost, or universal effectiveness.</w:t>
+        <w:t>The model has not been calibrated or validated against roof-scale shedding measurements. It omits wind redistribution, three-dimensional flow, snow fracture and slab mechanics, cornices, local roof details, heat transfer through the assembly, impact trajectories, drainage blockage, structural response, and pedestrian exposure. Friction, adhesion, compaction, melt, and aging parameters include explicit assumptions. The 1 h production setting failed the frozen composite timestep criterion for all selected designs; event mass, event count, and SSCI were particularly interval sensitive. The heterogeneous sets are multi-seed heuristic results rather than guaranteed complete fronts. Daily JMA observations do not resolve subdaily events, and ground snowfall or snow depth is not roof snow mass. Accordingly, the study does not establish structural safety, pedestrian safety, code compliance, injury reduction, lifecycle cost, or universal effectiveness.</w:t>
       </w:r>
     </w:p>
     <w:p>
@@ -294,7 +325,7 @@
     </w:p>
     <w:p>
       <w:r>
-        <w:t>Future work should calibrate interface parameters across temperature, liquid-water content, roughness, aging, and load; validate mass and release timing against instrumented roofs; add wind redistribution and three-dimensional edge effects; and predefine external-validation metrics before fitting.</w:t>
+        <w:t>Future work should calibrate interface parameters across temperature, liquid-water content, roughness, aging, and load; validate mass and release timing against instrumented roofs; add wind redistribution and three-dimensional edge effects; reoptimize at finer timesteps with explicitly constrained segments and surface classes; and predefine external-validation metrics before fitting.</w:t>
       </w:r>
     </w:p>
     <w:p>
@@ -307,7 +338,7 @@
     </w:p>
     <w:p>
       <w:r>
-        <w:t>A reproducible reduced-order workflow compared complete optimized uniform and spatially heterogeneous passive roof-snow trade-off sets. The results quantify how grading changes modeled retained-mass and discrete-release objectives under synthetic and supplementary JMA forcing, with explicit convergence, ablation, sensitivity, robustness, and complexity analyses. The outputs are hypotheses and design-space evidence for future roof-scale validation, not design approval or safety certification.</w:t>
+        <w:t>An exhaustive uniform reference had 2 modeled objective regimes. Heuristic joint spatial grading preserved those regimes and added 6 intermediate trade-off combinations, but the intermediate continuous profiles were not directly constructable under all frozen checks, nominal objectives did not determine robustness, and the 1 h production timestep was not converged under the composite criterion. The findings are reproducible design-space hypotheses for constrained reoptimization and roof-scale validation, not design approval or safety certification.</w:t>
       </w:r>
     </w:p>
     <w:p>
@@ -353,67 +384,67 @@
     </w:p>
     <w:p>
       <w:r>
-        <w:t>1. Giever PM, Sack RL. Similitude considerations for roof snow loads. Cold Regions Science and Technology. 1990. https://doi.org/10.1016/0165-232X(90)90018-R.</w:t>
+        <w:t>1. Giever PM, Sack RL. Similitude considerations for roof snow loads. Cold Regions Science and Technology. 1990;19(1):59-71. https://doi.org/10.1016/0165-232X(90)90018-R.</w:t>
       </w:r>
     </w:p>
     <w:p>
       <w:r>
-        <w:t>2. Thiis TK, Gjessing Y. Large-scale measurements of snowdrifts around flat-roofed and single-pitch-roofed buildings. Cold Regions Science and Technology. 1999. https://doi.org/10.1016/S0165-232X(99)00021-X.</w:t>
+        <w:t>2. Thiis TK, Gjessing Y. Large-scale measurements of snowdrifts around flat-roofed and single-pitch-roofed buildings. Cold Regions Science and Technology. 1999;30(1-3):175-181. https://doi.org/10.1016/S0165-232X(99)00021-X.</w:t>
       </w:r>
     </w:p>
     <w:p>
       <w:r>
-        <w:t>3. Zhou X, Kang L, Yuan X, Gu M. Wind tunnel test of snow redistribution on flat roofs. Cold Regions Science and Technology. 2016. https://doi.org/10.1016/j.coldregions.2016.04.006.</w:t>
+        <w:t>3. Zhou X, Kang L, Yuan X, Gu M. Wind tunnel test of snow redistribution on flat roofs. Cold Regions Science and Technology. 2016;127:49-56. https://doi.org/10.1016/j.coldregions.2016.04.006.</w:t>
       </w:r>
     </w:p>
     <w:p>
       <w:r>
-        <w:t>4. Tominaga Y. Computational fluid dynamics simulation of snowdrift around buildings: Past achievements and future perspectives. Cold Regions Science and Technology. 2018. https://doi.org/10.1016/j.coldregions.2017.05.004.</w:t>
+        <w:t>4. Tominaga Y. Computational fluid dynamics simulation of snowdrift around buildings: Past achievements and future perspectives. Cold Regions Science and Technology. 2018;150:2-14. https://doi.org/10.1016/j.coldregions.2017.05.004.</w:t>
       </w:r>
     </w:p>
     <w:p>
       <w:r>
-        <w:t>5. Sun X, He R, Wu Y. Numerical simulation of snowdrift on a membrane roof and the mechanical performance under snow loads. Cold Regions Science and Technology. 2018. https://doi.org/10.1016/j.coldregions.2017.09.007.</w:t>
+        <w:t>5. Sun X, He R, Wu Y. Numerical simulation of snowdrift on a membrane roof and the mechanical performance under snow loads. Cold Regions Science and Technology. 2018;150:15-24. https://doi.org/10.1016/j.coldregions.2017.09.007.</w:t>
       </w:r>
     </w:p>
     <w:p>
       <w:r>
-        <w:t>6. Zhang G, Zhang Q, Fan F, Shen S. Numerical simulations of development of snowdrifts on long-span spherical roofs. Cold Regions Science and Technology. 2021. https://doi.org/10.1016/j.coldregions.2020.103211.</w:t>
+        <w:t>6. Zhang G, Zhang Q, Fan F, Shen S. Numerical simulations of development of snowdrifts on long-span spherical roofs. Cold Regions Science and Technology. 2021;182:103211. https://doi.org/10.1016/j.coldregions.2020.103211.</w:t>
       </w:r>
     </w:p>
     <w:p>
       <w:r>
-        <w:t>7. Pawluk RE, Rezvanpour M, Chen Y, She Y. A sensitivity analysis on effective parameters for sliding/melting prediction of snow cover on solar photovoltaic panels. Cold Regions Science and Technology. 2021. https://doi.org/10.1016/j.coldregions.2021.103262.</w:t>
+        <w:t>7. Pawluk RE, Rezvanpour M, Chen Y, She Y. A sensitivity analysis on effective parameters for sliding/melting prediction of snow cover on solar photovoltaic panels. Cold Regions Science and Technology. 2021;185:103262. https://doi.org/10.1016/j.coldregions.2021.103262.</w:t>
       </w:r>
     </w:p>
     <w:p>
       <w:r>
-        <w:t>8. Zhang B, Zhang Q, Mo H, Fan F, Lehning M. Considering snow depositions and transport mechanisms in meteorological analysis of predicting snow loads on buildings. Cold Regions Science and Technology. 2022. https://doi.org/10.1016/j.coldregions.2022.103614.</w:t>
+        <w:t>8. Zhang B, Zhang Q, Mo H, Fan F, Lehning M. Considering snow depositions and transport mechanisms in meteorological analysis of predicting snow loads on buildings. Cold Regions Science and Technology. 2022;201:103614. https://doi.org/10.1016/j.coldregions.2022.103614.</w:t>
       </w:r>
     </w:p>
     <w:p>
       <w:r>
-        <w:t>9. Zhou X, Zhang T, Liu Z, Gu M. A study of snow drifting on monoslope roofs during snowfall: Wind tunnel test and numerical simulation. Cold Regions Science and Technology. 2023. https://doi.org/10.1016/j.coldregions.2022.103731.</w:t>
+        <w:t>9. Zhou X, Zhang T, Liu Z, Gu M. A study of snow drifting on monoslope roofs during snowfall: Wind tunnel test and numerical simulation. Cold Regions Science and Technology. 2023;206:103731. https://doi.org/10.1016/j.coldregions.2022.103731.</w:t>
       </w:r>
     </w:p>
     <w:p>
       <w:r>
-        <w:t>10. Zou J, Sun X, Zhou H. Sensitivity analysis and practical application of an automatic snow-melting membrane roof. Cold Regions Science and Technology. 2023. https://doi.org/10.1016/j.coldregions.2022.103754.</w:t>
+        <w:t>10. Zou J, Sun X, Zhou H. Sensitivity analysis and practical application of an automatic snow-melting membrane roof. Cold Regions Science and Technology. 2023;206:103754. https://doi.org/10.1016/j.coldregions.2022.103754.</w:t>
       </w:r>
     </w:p>
     <w:p>
       <w:r>
-        <w:t>11. Tominaga Y, Igarashi K, Wakui M, Motoyoshi H, Ito Y. Measurement and estimation of temporal variations of roof snow load on semi-full-scale building model. Cold Regions Science and Technology. 2025. https://doi.org/10.1016/j.coldregions.2025.104445.</w:t>
+        <w:t>11. Tominaga Y, Igarashi K, Wakui M, Motoyoshi H, Ito Y. Measurement and estimation of temporal variations of roof snow load on semi-full-scale building model. Cold Regions Science and Technology. 2025;232:104445. https://doi.org/10.1016/j.coldregions.2025.104445.</w:t>
       </w:r>
     </w:p>
     <w:p>
       <w:r>
-        <w:t>12. Fasani D, Cernuschi F, Wolfsperger F, Balordi M, Colombo LPM. Shear and tensile adhesion of dry and wet snow on metallic surfaces. Cold Regions Science and Technology. 2026. https://doi.org/10.1016/j.coldregions.2026.104971.</w:t>
+        <w:t>12. Fasani D, Cernuschi F, Wolfsperger F, Balordi M, Colombo LPM. Shear and tensile adhesion of dry and wet snow on metallic surfaces. Cold Regions Science and Technology. 2026;249:104971. https://doi.org/10.1016/j.coldregions.2026.104971.</w:t>
       </w:r>
     </w:p>
     <w:p>
       <w:r>
-        <w:t>13. Kimura T. Change of removing technique of snow on roof and recent situation of its technical development. Snow and Ice. 1989. https://doi.org/10.5331/seppyo.51.111.</w:t>
+        <w:t>13. Kimura T. Change of removing technique of snow on roof and recent situation of its technical development. Snow and Ice. 1989;51(2):111-117. https://doi.org/10.5331/seppyo.51.111.</w:t>
       </w:r>
     </w:p>
     <w:p>
@@ -428,36 +459,43 @@
     </w:p>
     <w:p>
       <w:r>
-        <w:t>16. Takakura M, Ito T, Tomabechi T. Assessment of the effectiveness of snow guards on a sloped roof. AIJ Journal of Technology and Design. 2003. https://doi.org/10.3130/aijt.9.67_1.</w:t>
+        <w:t>16. Takakura M, Ito T, Tomabechi T. Assessment of the effectiveness of snow guards on a sloped roof. AIJ Journal of Technology and Design. 2003;9(17):67-70. https://doi.org/10.3130/aijt.9.67_1.</w:t>
       </w:r>
     </w:p>
     <w:p>
       <w:r>
-        <w:t>17. Tomabechi T, Takakura M, Ito T. Influence of the surface roughness of roofing materials on snow sliding. Journal of Snow Engineering of Japan. 1996. https://doi.org/10.4106/jsse.12.205.</w:t>
+        <w:t>17. Tomabechi T, Takakura M, Ito T. Influence of the surface roughness of roofing materials on snow sliding. Journal of Snow Engineering of Japan. 1996;12(3):205-211. https://doi.org/10.4106/jsse.12.205.</w:t>
       </w:r>
     </w:p>
     <w:p>
       <w:r>
-        <w:t>18. Ito T, Tomabechi T, Mitsuhashi H. Evaluation and Maintenance of Snow Sliding Performance of Coated Steel Roofing Used for Sloped Roof. Journal of Snow Engineering of Japan. 1997. https://doi.org/10.4106/jsse.13.244.</w:t>
+        <w:t>18. Ito T, Tomabechi T, Mitsuhashi H. Evaluation and Maintenance of Snow Sliding Performance of Coated Steel Roofing Used for Sloped Roof. Journal of Snow Engineering of Japan. 1997;13(3):244-252. https://doi.org/10.4106/jsse.13.244.</w:t>
       </w:r>
     </w:p>
     <w:p>
       <w:r>
-        <w:t>19. Asano Y, Iwai K. Experimental Study on the Snow Removal on the Roof by Snow-Melting System in Northern Area of Nagano Prefecture. Journal of Architecture Planning and Environmental Engineering. 1995. https://doi.org/10.3130/aija.60.57_3.</w:t>
+        <w:t>19. Asano Y, Iwai K. Experimental Study on the Snow Removal on the Roof by Snow-Melting System in Northern Area of Nagano Prefecture. Journal of Architecture Planning and Environmental Engineering. 1995;60(476):57-65. https://doi.org/10.3130/aija.60.57_3.</w:t>
       </w:r>
     </w:p>
     <w:p>
       <w:r>
-        <w:t>20. Chiba T et al.. Fundamental study for elucidating snow cornice formation mechanism of flat roofs based on wind tunnel test using natural snow. Snow and Ice. 2021. https://doi.org/10.5331/seppyo.83.3_249.</w:t>
+        <w:t>20. Chiba T et al.. Fundamental study for elucidating snow cornice formation mechanism of flat roofs based on wind tunnel test using natural snow. Snow and Ice. 2021;83(3):249-258. https://doi.org/10.5331/seppyo.83.3_249.</w:t>
       </w:r>
     </w:p>
     <w:p>
       <w:r>
-        <w:t>21. Sapporo City. Measures to prevent hazards caused by falling ice and snow. Municipal administrative guidance. 2026. Sapporo Building Standards Ordinance Article 12 guidance.</w:t>
+        <w:t>21. Sapporo City. Measures to prevent hazards caused by falling ice and snow. Municipal administrative guidance. 2025. Sapporo Building Standards Ordinance Article 12 guidance.</w:t>
       </w:r>
     </w:p>
     <w:p>
-      <w:r/>
+      <w:r>
+        <w:t>22. Watanabe M, Takita M. Fundamental Study on Control of Roof Snow Sliding. Journal of Snow Engineering of Japan. 1997;13(1):3-12. https://doi.org/10.4106/jsse.13.3.</w:t>
+      </w:r>
+    </w:p>
+    <w:p>
+      <w:r>
+        <w:br w:type="page"/>
+      </w:r>
     </w:p>
     <w:p>
       <w:pPr>

</xml_diff>

<commit_message>
Complete CRST format and language audit
Co-Authored-By: Tatsuki Onishi <bougtoir@gmail.com>
</commit_message>
<xml_diff>
--- a/manuscript/build/manuscript.docx
+++ b/manuscript/build/manuscript.docx
@@ -63,12 +63,12 @@
     </w:p>
     <w:p>
       <w:r>
-        <w:t>Roof snow is spatially variable, evolves with weather, and can either remain on the roof or leave in discrete releases. Roof-scale experiments and deposition studies show that geometry, wind, and scale influence snow distributions, while validation remains essential for computational models [1-6]. Adjacent photovoltaic, membrane-roof, meteorological, and field studies further motivate explicit sensitivity analysis and independent validation [7-12].</w:t>
+        <w:t>Roof snow is spatially variable, evolves with weather, and can either remain on the roof or leave in discrete releases. Roof-scale experiments and deposition studies show that geometry, wind, and scale influence snow distributions, while validation remains essential for computational models (Giever and Sack, 1990; Sun et al., 2018; Thiis and Gjessing, 1999; Tominaga, 2018; Zhang et al., 2021; Zhou et al., 2016). Adjacent photovoltaic, membrane-roof, meteorological, and field studies further motivate explicit sensitivity analysis and independent validation (Fasani et al., 2026; Pawluk et al., 2021; Tominaga et al., 2025; Zhang et al., 2022; Zhou et al., 2023; Zou et al., 2023).</w:t>
       </w:r>
     </w:p>
     <w:p>
       <w:r>
-        <w:t>Japanese technical and administrative sources distinguish retention, shedding, melting, and load-resisting strategies and document the importance of surface condition, aging, snow guards, drainage, cornices, and site context [13-22]. Retention can reduce required snow-fall space at dense sites, whereas shedding requires a suitable receiving zone; retained snow instead imposes long-duration load and drainage obligations. These sources do not establish universal material coefficients, safety thresholds, or one preferable strategy. They motivate a conditional comparison of generic uniform and graded design spaces.</w:t>
+        <w:t>Japanese technical and administrative sources distinguish retention, shedding, melting, and load-resisting strategies and document the importance of surface condition, aging, snow guards, drainage, cornices, and site context (Asano and Iwai, 1995; Chiba et al., 2021; Hokkaido Research Organization and Hokkaido Building Guidance Center, 2017; Ito et al., 1997; Kimura, 1989; Niigata Prefecture, 2006; Sapporo City, 2025; Takakura et al., 2003; Tomabechi et al., 1996; Watanabe and Takita, 1997). Retention can reduce required snow-fall space at dense sites, whereas shedding requires a suitable receiving zone; retained snow instead imposes long-duration load and drainage obligations. These sources do not establish universal material coefficients, safety thresholds, or one preferable strategy. They motivate a conditional comparison of generic uniform and graded design spaces.</w:t>
       </w:r>
     </w:p>
     <w:p>
@@ -196,7 +196,43 @@
     </w:p>
     <w:p>
       <w:r>
-        <w:t>Across the synthetic scenarios, the retention baseline produced Lmax=6417.0 kg m-1 and Smax=0.000 kg m-1, whereas the shedding baseline produced Lmax=80.00 kg m-1 and Smax=80.00 kg m-1. These are modeled unit-width masses, not structural loads. The frozen 8% four-metric convergence tolerance was met by 3 of 9 tested resolution combinations. At the production 1 h interval, all 3 selected uniform, continuous-joint, and mapped-joint designs failed the same composite criterion. Smax is release mass in one model interval and therefore must be interpreted with the stated timestep.</w:t>
+        <w:t>Across the synthetic scenarios, the retention baseline produced Lmax=6417.0 kg m</w:t>
+      </w:r>
+      <w:r>
+        <w:rPr>
+          <w:vertAlign w:val="superscript"/>
+        </w:rPr>
+        <w:t>−1</w:t>
+      </w:r>
+      <w:r>
+        <w:t xml:space="preserve"> and Smax=0.000 kg m</w:t>
+      </w:r>
+      <w:r>
+        <w:rPr>
+          <w:vertAlign w:val="superscript"/>
+        </w:rPr>
+        <w:t>−1</w:t>
+      </w:r>
+      <w:r>
+        <w:t>, whereas the shedding baseline produced Lmax=80.00 kg m</w:t>
+      </w:r>
+      <w:r>
+        <w:rPr>
+          <w:vertAlign w:val="superscript"/>
+        </w:rPr>
+        <w:t>−1</w:t>
+      </w:r>
+      <w:r>
+        <w:t xml:space="preserve"> and Smax=80.00 kg m</w:t>
+      </w:r>
+      <w:r>
+        <w:rPr>
+          <w:vertAlign w:val="superscript"/>
+        </w:rPr>
+        <w:t>−1</w:t>
+      </w:r>
+      <w:r>
+        <w:t>. These are modeled unit-width masses, not structural loads. The frozen 8% four-metric convergence tolerance was met by 3 of 9 tested resolution combinations. At the production 1 h interval, all 3 selected uniform, continuous-joint, and mapped-joint designs failed the same composite criterion. Smax is release mass in one model interval and therefore must be interpreted with the stated timestep.</w:t>
       </w:r>
     </w:p>
     <w:p>
@@ -209,7 +245,25 @@
     </w:p>
     <w:p>
       <w:r>
-        <w:t>The exhaustive uniform grid produced 2912 nondominated design rows but only 2 objective pairs: 80.00/80.00 kg m-1 and 6417.0/0.000 kg m-1 for Lmax/Smax. The multiplicity reflects objective-equivalent profiles rather than a dense uniform trade-off curve. Surface-only optimization reproduced the same two objective pairs.</w:t>
+        <w:t>The exhaustive uniform grid produced 2912 nondominated design rows but only 2 objective pairs: 80.00/80.00 kg m</w:t>
+      </w:r>
+      <w:r>
+        <w:rPr>
+          <w:vertAlign w:val="superscript"/>
+        </w:rPr>
+        <w:t>−1</w:t>
+      </w:r>
+      <w:r>
+        <w:t xml:space="preserve"> and 6417.0/0.000 kg m</w:t>
+      </w:r>
+      <w:r>
+        <w:rPr>
+          <w:vertAlign w:val="superscript"/>
+        </w:rPr>
+        <w:t>−1</w:t>
+      </w:r>
+      <w:r>
+        <w:t xml:space="preserve"> for Lmax/Smax. The multiplicity reflects objective-equivalent profiles rather than a dense uniform trade-off curve. Surface-only optimization reproduced the same two objective pairs.</w:t>
       </w:r>
     </w:p>
     <w:p>
@@ -232,7 +286,52 @@
     </w:p>
     <w:p>
       <w:r>
-        <w:t>The front-specific joint knee was 3210.6/40.00 kg m-1, whereas common normalization selected 2941.9/43.33 kg m-1. The normalization dependence precludes a cross-front percentage headline. At the strictest prespecified Smax limit of 20 kg m-1, the minimum observed Lmax was 5082.2 kg m-1 for joint and 6417.0 kg m-1 for uniform.</w:t>
+        <w:t>The front-specific joint knee was 3210.6/40.00 kg m</w:t>
+      </w:r>
+      <w:r>
+        <w:rPr>
+          <w:vertAlign w:val="superscript"/>
+        </w:rPr>
+        <w:t>−1</w:t>
+      </w:r>
+      <w:r>
+        <w:t>, whereas common normalization selected 2941.9/43.33 kg m</w:t>
+      </w:r>
+      <w:r>
+        <w:rPr>
+          <w:vertAlign w:val="superscript"/>
+        </w:rPr>
+        <w:t>−1</w:t>
+      </w:r>
+      <w:r>
+        <w:t>. The normalization dependence precludes a cross-front percentage headline. At the strictest prespecified Smax limit of 20 kg m</w:t>
+      </w:r>
+      <w:r>
+        <w:rPr>
+          <w:vertAlign w:val="superscript"/>
+        </w:rPr>
+        <w:t>−1</w:t>
+      </w:r>
+      <w:r>
+        <w:t>, the minimum observed Lmax was 5082.2 kg m</w:t>
+      </w:r>
+      <w:r>
+        <w:rPr>
+          <w:vertAlign w:val="superscript"/>
+        </w:rPr>
+        <w:t>−1</w:t>
+      </w:r>
+      <w:r>
+        <w:t xml:space="preserve"> for joint and 6417.0 kg m</w:t>
+      </w:r>
+      <w:r>
+        <w:rPr>
+          <w:vertAlign w:val="superscript"/>
+        </w:rPr>
+        <w:t>−1</w:t>
+      </w:r>
+      <w:r>
+        <w:t xml:space="preserve"> for uniform.</w:t>
       </w:r>
     </w:p>
     <w:p>
@@ -245,7 +344,34 @@
     </w:p>
     <w:p>
       <w:r>
-        <w:t>Among 14 candidates with the nominal 80.00/80.00 kg m-1 objective pair, Q95 Lmax ranged from 103.8 to 7465.5 kg m-1, Q95 Smax ranged from 103.8 to 5482.6 kg m-1, and manual-intervention probability ranged from 0.000 to 0.432. The minimum scalar robustness score was shared by 6 candidates, so the retained selected flag is only a deterministic row-order tie-break. Monte Carlo quantiles describe the configured perturbation model, not empirical confidence intervals.</w:t>
+        <w:t>Among 14 candidates with the nominal 80.00/80.00 kg m</w:t>
+      </w:r>
+      <w:r>
+        <w:rPr>
+          <w:vertAlign w:val="superscript"/>
+        </w:rPr>
+        <w:t>−1</w:t>
+      </w:r>
+      <w:r>
+        <w:t xml:space="preserve"> objective pair, Q95 Lmax ranged from 103.8 to 7465.5 kg m</w:t>
+      </w:r>
+      <w:r>
+        <w:rPr>
+          <w:vertAlign w:val="superscript"/>
+        </w:rPr>
+        <w:t>−1</w:t>
+      </w:r>
+      <w:r>
+        <w:t>, Q95 Smax ranged from 103.8 to 5482.6 kg m</w:t>
+      </w:r>
+      <w:r>
+        <w:rPr>
+          <w:vertAlign w:val="superscript"/>
+        </w:rPr>
+        <w:t>−1</w:t>
+      </w:r>
+      <w:r>
+        <w:t>, and manual-intervention probability ranged from 0.000 to 0.432. The minimum scalar robustness score was shared by 6 candidates, so the retained selected flag is only a deterministic row-order tie-break. Monte Carlo quantiles describe the configured perturbation model, not empirical confidence intervals.</w:t>
       </w:r>
     </w:p>
     <w:p>
@@ -258,7 +384,34 @@
     </w:p>
     <w:p>
       <w:r>
-        <w:t>Only 9 of the 1928 joint design rows met all post hoc constructability checks, and all belonged to the 80.00/80.00 kg m-1 objective pair. The selected continuous joint knee had 23 slope and 23 surface transitions and minimum segment length 1 cell. Generic mapping reduced these to 6 and 3 transitions; Lmax changed by 11.68 kg m-1 (0.36%) and Smax by 4.41 kg m-1 (11.03%). The mapped profile is a feasible translation, not a constrained optimum. Every frozen transition-penalty setting selected a uniform design. Labor-scarcity and phase-diagram classifications remain illustrative decision weights, not community or building-code recommendations.</w:t>
+        <w:t>Only 9 of the 1928 joint design rows met all post hoc constructability checks, and all belonged to the 80.00/80.00 kg m</w:t>
+      </w:r>
+      <w:r>
+        <w:rPr>
+          <w:vertAlign w:val="superscript"/>
+        </w:rPr>
+        <w:t>−1</w:t>
+      </w:r>
+      <w:r>
+        <w:t xml:space="preserve"> objective pair. The selected continuous joint knee had 23 slope and 23 surface transitions and minimum segment length 1 cell. Generic mapping reduced these to 6 and 3 transitions; Lmax changed by 11.68 kg m</w:t>
+      </w:r>
+      <w:r>
+        <w:rPr>
+          <w:vertAlign w:val="superscript"/>
+        </w:rPr>
+        <w:t>−1</w:t>
+      </w:r>
+      <w:r>
+        <w:t xml:space="preserve"> (0.36%) and Smax by 4.41 kg m</w:t>
+      </w:r>
+      <w:r>
+        <w:rPr>
+          <w:vertAlign w:val="superscript"/>
+        </w:rPr>
+        <w:t>−1</w:t>
+      </w:r>
+      <w:r>
+        <w:t xml:space="preserve"> (11.03%). The mapped profile is a feasible translation, not a constrained optimum. Every frozen transition-penalty setting selected a uniform design. Labor-scarcity and phase-diagram classifications remain illustrative decision weights, not community or building-code recommendations.</w:t>
       </w:r>
     </w:p>
     <w:p>
@@ -299,7 +452,7 @@
     </w:p>
     <w:p>
       <w:r>
-        <w:t>Retention, shedding, active melting, manual removal, and hybrid systems solve different site problems. Retention can limit routine eave release and reduce snow-fall-space demand, but requires verified structural capacity, drainage, waterproofing, inspection, and maintenance. Shedding can reduce retained mass but requires a controlled receiving area and falling-snow measures. The model does not invalidate either strategy, and Japanese guidance cannot be generalized to other climates, building traditions, or regulatory systems without local evidence [13-22].</w:t>
+        <w:t>Retention, shedding, active melting, manual removal, and hybrid systems solve different site problems. Retention can limit routine eave release and reduce snow-fall-space demand, but requires verified structural capacity, drainage, waterproofing, inspection, and maintenance. Shedding can reduce retained mass but requires a controlled receiving area and falling-snow measures. The model does not invalidate either strategy, and Japanese guidance cannot be generalized to other climates, building traditions, or regulatory systems without local evidence (Asano and Iwai, 1995; Chiba et al., 2021; Hokkaido Research Organization and Hokkaido Building Guidance Center, 2017; Ito et al., 1997; Kimura, 1989; Niigata Prefecture, 2006; Sapporo City, 2025; Takakura et al., 2003; Tomabechi et al., 1996; Watanabe and Takita, 1997).</w:t>
       </w:r>
     </w:p>
     <w:p>
@@ -365,8 +518,16 @@
       </w:r>
     </w:p>
     <w:p>
+      <w:pPr>
+        <w:pStyle w:val="Heading2"/>
+      </w:pPr>
       <w:r>
-        <w:t>Generative AI statement: During preparation, the author used Devin (Cognition AI) to support coding, public-data acquisition, analysis scripting, and drafting. The author must review and edit the final submission and remains responsible for its content.</w:t>
+        <w:t>Declaration of generative AI and AI-assisted technologies in the manuscript preparation process</w:t>
+      </w:r>
+    </w:p>
+    <w:p>
+      <w:r>
+        <w:t>During the preparation of this work, the author used Devin (Cognition AI) to support coding, public-data acquisition, analysis scripting, and drafting. Before submission, the author must review and edit the content as needed and replace this sentence with confirmation that the author takes full responsibility for the content of the published article.</w:t>
       </w:r>
     </w:p>
     <w:p>
@@ -384,112 +545,112 @@
     </w:p>
     <w:p>
       <w:r>
-        <w:t>1. Giever PM, Sack RL. Similitude considerations for roof snow loads. Cold Regions Science and Technology. 1990;19(1):59-71. https://doi.org/10.1016/0165-232X(90)90018-R.</w:t>
+        <w:t>Asano, Y., Iwai, K., 1995. 60(476), 57-65 Experimental Study on the Snow Removal on the Roof by Snow-Melting System in Northern Area of Nagano Prefecture. Journal of Architecture Planning and Environmental Engineering. https://doi.org/10.3130/aija.60.57_3.</w:t>
       </w:r>
     </w:p>
     <w:p>
       <w:r>
-        <w:t>2. Thiis TK, Gjessing Y. Large-scale measurements of snowdrifts around flat-roofed and single-pitch-roofed buildings. Cold Regions Science and Technology. 1999;30(1-3):175-181. https://doi.org/10.1016/S0165-232X(99)00021-X.</w:t>
+        <w:t>Chiba T et al., 2021. 83(3), 249-258 Fundamental study for elucidating snow cornice formation mechanism of flat roofs based on wind tunnel test using natural snow. Snow and Ice. https://doi.org/10.5331/seppyo.83.3_249.</w:t>
       </w:r>
     </w:p>
     <w:p>
       <w:r>
-        <w:t>3. Zhou X, Kang L, Yuan X, Gu M. Wind tunnel test of snow redistribution on flat roofs. Cold Regions Science and Technology. 2016;127:49-56. https://doi.org/10.1016/j.coldregions.2016.04.006.</w:t>
+        <w:t>Fasani, D., Cernuschi, F., Wolfsperger, F., Balordi, M., Colombo, L.P.M., 2026. 249, 104971 Shear and tensile adhesion of dry and wet snow on metallic surfaces. Cold Regions Science and Technology. https://doi.org/10.1016/j.coldregions.2026.104971.</w:t>
       </w:r>
     </w:p>
     <w:p>
       <w:r>
-        <w:t>4. Tominaga Y. Computational fluid dynamics simulation of snowdrift around buildings: Past achievements and future perspectives. Cold Regions Science and Technology. 2018;150:2-14. https://doi.org/10.1016/j.coldregions.2017.05.004.</w:t>
+        <w:t>Giever, P.M., Sack, R.L., 1990. 19(1), 59-71 Similitude considerations for roof snow loads. Cold Regions Science and Technology. https://doi.org/10.1016/0165-232X(90)90018-R.</w:t>
       </w:r>
     </w:p>
     <w:p>
       <w:r>
-        <w:t>5. Sun X, He R, Wu Y. Numerical simulation of snowdrift on a membrane roof and the mechanical performance under snow loads. Cold Regions Science and Technology. 2018;150:15-24. https://doi.org/10.1016/j.coldregions.2017.09.007.</w:t>
+        <w:t>Hokkaido Research Organization, Hokkaido Building Guidance Center, 2017. Planning roof-snow treatment for detached houses. Official technical guide. official guide.</w:t>
       </w:r>
     </w:p>
     <w:p>
       <w:r>
-        <w:t>6. Zhang G, Zhang Q, Fan F, Shen S. Numerical simulations of development of snowdrifts on long-span spherical roofs. Cold Regions Science and Technology. 2021;182:103211. https://doi.org/10.1016/j.coldregions.2020.103211.</w:t>
+        <w:t>Ito, T., Tomabechi, T., Mitsuhashi, H., 1997. 13(3), 244-252 Evaluation and Maintenance of Snow Sliding Performance of Coated Steel Roofing Used for Sloped Roof. Journal of Snow Engineering of Japan. https://doi.org/10.4106/jsse.13.244.</w:t>
       </w:r>
     </w:p>
     <w:p>
       <w:r>
-        <w:t>7. Pawluk RE, Rezvanpour M, Chen Y, She Y. A sensitivity analysis on effective parameters for sliding/melting prediction of snow cover on solar photovoltaic panels. Cold Regions Science and Technology. 2021;185:103262. https://doi.org/10.1016/j.coldregions.2021.103262.</w:t>
+        <w:t>Kimura, T., 1989. 51(2), 111-117 Change of removing technique of snow on roof and recent situation of its technical development. Snow and Ice. https://doi.org/10.5331/seppyo.51.111.</w:t>
       </w:r>
     </w:p>
     <w:p>
       <w:r>
-        <w:t>8. Zhang B, Zhang Q, Mo H, Fan F, Lehning M. Considering snow depositions and transport mechanisms in meteorological analysis of predicting snow loads on buildings. Cold Regions Science and Technology. 2022;201:103614. https://doi.org/10.1016/j.coldregions.2022.103614.</w:t>
+        <w:t>Niigata Prefecture, 2006. Technical material on characteristics and design ideas for roof-snow treatment. Official prefectural technical material. official guidance.</w:t>
       </w:r>
     </w:p>
     <w:p>
       <w:r>
-        <w:t>9. Zhou X, Zhang T, Liu Z, Gu M. A study of snow drifting on monoslope roofs during snowfall: Wind tunnel test and numerical simulation. Cold Regions Science and Technology. 2023;206:103731. https://doi.org/10.1016/j.coldregions.2022.103731.</w:t>
+        <w:t>Pawluk, R.E., Rezvanpour, M., Chen, Y., She, Y., 2021. 185, 103262 A sensitivity analysis on effective parameters for sliding/melting prediction of snow cover on solar photovoltaic panels. Cold Regions Science and Technology. https://doi.org/10.1016/j.coldregions.2021.103262.</w:t>
       </w:r>
     </w:p>
     <w:p>
       <w:r>
-        <w:t>10. Zou J, Sun X, Zhou H. Sensitivity analysis and practical application of an automatic snow-melting membrane roof. Cold Regions Science and Technology. 2023;206:103754. https://doi.org/10.1016/j.coldregions.2022.103754.</w:t>
+        <w:t>Sapporo City, 2025. Measures to prevent hazards caused by falling ice and snow. Municipal administrative guidance. Sapporo Building Standards Ordinance Article 12 guidance.</w:t>
       </w:r>
     </w:p>
     <w:p>
       <w:r>
-        <w:t>11. Tominaga Y, Igarashi K, Wakui M, Motoyoshi H, Ito Y. Measurement and estimation of temporal variations of roof snow load on semi-full-scale building model. Cold Regions Science and Technology. 2025;232:104445. https://doi.org/10.1016/j.coldregions.2025.104445.</w:t>
+        <w:t>Sun, X., He, R., Wu, Y., 2018. 150, 15-24 Numerical simulation of snowdrift on a membrane roof and the mechanical performance under snow loads. Cold Regions Science and Technology. https://doi.org/10.1016/j.coldregions.2017.09.007.</w:t>
       </w:r>
     </w:p>
     <w:p>
       <w:r>
-        <w:t>12. Fasani D, Cernuschi F, Wolfsperger F, Balordi M, Colombo LPM. Shear and tensile adhesion of dry and wet snow on metallic surfaces. Cold Regions Science and Technology. 2026;249:104971. https://doi.org/10.1016/j.coldregions.2026.104971.</w:t>
+        <w:t>Takakura, M., Ito, T., Tomabechi, T., 2003. 9(17), 67-70 Assessment of the effectiveness of snow guards on a sloped roof. AIJ Journal of Technology and Design. https://doi.org/10.3130/aijt.9.67_1.</w:t>
       </w:r>
     </w:p>
     <w:p>
       <w:r>
-        <w:t>13. Kimura T. Change of removing technique of snow on roof and recent situation of its technical development. Snow and Ice. 1989;51(2):111-117. https://doi.org/10.5331/seppyo.51.111.</w:t>
+        <w:t>Thiis, T.K., Gjessing, Y., 1999. 30(1-3), 175-181 Large-scale measurements of snowdrifts around flat-roofed and single-pitch-roofed buildings. Cold Regions Science and Technology. https://doi.org/10.1016/S0165-232X(99)00021-X.</w:t>
       </w:r>
     </w:p>
     <w:p>
       <w:r>
-        <w:t>14. Hokkaido Research Organization, Hokkaido Building Guidance Center. Planning roof-snow treatment for detached houses. Official technical guide. 2017. official guide.</w:t>
+        <w:t>Tomabechi, T., Takakura, M., Ito, T., 1996. 12(3), 205-211 Influence of the surface roughness of roofing materials on snow sliding. Journal of Snow Engineering of Japan. https://doi.org/10.4106/jsse.12.205.</w:t>
       </w:r>
     </w:p>
     <w:p>
       <w:r>
-        <w:t>15. Niigata Prefecture. Technical material on characteristics and design ideas for roof-snow treatment. Official prefectural technical material. 2006. official guidance.</w:t>
+        <w:t>Tominaga, Y., 2018. 150, 2-14 Computational fluid dynamics simulation of snowdrift around buildings: Past achievements and future perspectives. Cold Regions Science and Technology. https://doi.org/10.1016/j.coldregions.2017.05.004.</w:t>
       </w:r>
     </w:p>
     <w:p>
       <w:r>
-        <w:t>16. Takakura M, Ito T, Tomabechi T. Assessment of the effectiveness of snow guards on a sloped roof. AIJ Journal of Technology and Design. 2003;9(17):67-70. https://doi.org/10.3130/aijt.9.67_1.</w:t>
+        <w:t>Tominaga, Y., Igarashi, K., Wakui, M., Motoyoshi, H., Ito, Y., 2025. 232, 104445 Measurement and estimation of temporal variations of roof snow load on semi-full-scale building model. Cold Regions Science and Technology. https://doi.org/10.1016/j.coldregions.2025.104445.</w:t>
       </w:r>
     </w:p>
     <w:p>
       <w:r>
-        <w:t>17. Tomabechi T, Takakura M, Ito T. Influence of the surface roughness of roofing materials on snow sliding. Journal of Snow Engineering of Japan. 1996;12(3):205-211. https://doi.org/10.4106/jsse.12.205.</w:t>
+        <w:t>Watanabe, M., Takita, M., 1997. 13(1), 3-12 Fundamental Study on Control of Roof Snow Sliding. Journal of Snow Engineering of Japan. https://doi.org/10.4106/jsse.13.3.</w:t>
       </w:r>
     </w:p>
     <w:p>
       <w:r>
-        <w:t>18. Ito T, Tomabechi T, Mitsuhashi H. Evaluation and Maintenance of Snow Sliding Performance of Coated Steel Roofing Used for Sloped Roof. Journal of Snow Engineering of Japan. 1997;13(3):244-252. https://doi.org/10.4106/jsse.13.244.</w:t>
+        <w:t>Zhang, B., Zhang, Q., Mo, H., Fan, F., Lehning, M., 2022. 201, 103614 Considering snow depositions and transport mechanisms in meteorological analysis of predicting snow loads on buildings. Cold Regions Science and Technology. https://doi.org/10.1016/j.coldregions.2022.103614.</w:t>
       </w:r>
     </w:p>
     <w:p>
       <w:r>
-        <w:t>19. Asano Y, Iwai K. Experimental Study on the Snow Removal on the Roof by Snow-Melting System in Northern Area of Nagano Prefecture. Journal of Architecture Planning and Environmental Engineering. 1995;60(476):57-65. https://doi.org/10.3130/aija.60.57_3.</w:t>
+        <w:t>Zhang, G., Zhang, Q., Fan, F., Shen, S., 2021. 182, 103211 Numerical simulations of development of snowdrifts on long-span spherical roofs. Cold Regions Science and Technology. https://doi.org/10.1016/j.coldregions.2020.103211.</w:t>
       </w:r>
     </w:p>
     <w:p>
       <w:r>
-        <w:t>20. Chiba T et al.. Fundamental study for elucidating snow cornice formation mechanism of flat roofs based on wind tunnel test using natural snow. Snow and Ice. 2021;83(3):249-258. https://doi.org/10.5331/seppyo.83.3_249.</w:t>
+        <w:t>Zhou, X., Kang, L., Yuan, X., Gu, M., 2016. 127, 49-56 Wind tunnel test of snow redistribution on flat roofs. Cold Regions Science and Technology. https://doi.org/10.1016/j.coldregions.2016.04.006.</w:t>
       </w:r>
     </w:p>
     <w:p>
       <w:r>
-        <w:t>21. Sapporo City. Measures to prevent hazards caused by falling ice and snow. Municipal administrative guidance. 2025. Sapporo Building Standards Ordinance Article 12 guidance.</w:t>
+        <w:t>Zhou, X., Zhang, T., Liu, Z., Gu, M., 2023. 206, 103731 A study of snow drifting on monoslope roofs during snowfall: Wind tunnel test and numerical simulation. Cold Regions Science and Technology. https://doi.org/10.1016/j.coldregions.2022.103731.</w:t>
       </w:r>
     </w:p>
     <w:p>
       <w:r>
-        <w:t>22. Watanabe M, Takita M. Fundamental Study on Control of Roof Snow Sliding. Journal of Snow Engineering of Japan. 1997;13(1):3-12. https://doi.org/10.4106/jsse.13.3.</w:t>
+        <w:t>Zou, J., Sun, X., Zhou, H., 2023. 206, 103754 Sensitivity analysis and practical application of an automatic snow-melting membrane roof. Cold Regions Science and Technology. https://doi.org/10.1016/j.coldregions.2022.103754.</w:t>
       </w:r>
     </w:p>
     <w:p>
@@ -3166,7 +3327,22 @@
                 <w:b/>
                 <w:sz w:val="14"/>
               </w:rPr>
-              <w:t>Lmax change (kg m-1)</w:t>
+              <w:t>Lmax change (kg m</w:t>
+            </w:r>
+            <w:r>
+              <w:rPr>
+                <w:b/>
+                <w:sz w:val="14"/>
+                <w:vertAlign w:val="superscript"/>
+              </w:rPr>
+              <w:t>−1</w:t>
+            </w:r>
+            <w:r>
+              <w:rPr>
+                <w:b/>
+                <w:sz w:val="14"/>
+              </w:rPr>
+              <w:t>)</w:t>
             </w:r>
           </w:p>
         </w:tc>
@@ -3194,7 +3370,22 @@
                 <w:b/>
                 <w:sz w:val="14"/>
               </w:rPr>
-              <w:t>Smax change (kg m-1)</w:t>
+              <w:t>Smax change (kg m</w:t>
+            </w:r>
+            <w:r>
+              <w:rPr>
+                <w:b/>
+                <w:sz w:val="14"/>
+                <w:vertAlign w:val="superscript"/>
+              </w:rPr>
+              <w:t>−1</w:t>
+            </w:r>
+            <w:r>
+              <w:rPr>
+                <w:b/>
+                <w:sz w:val="14"/>
+              </w:rPr>
+              <w:t>)</w:t>
             </w:r>
           </w:p>
         </w:tc>

</xml_diff>

<commit_message>
Complete deterministic 0.5-hour production revision
Co-Authored-By: Tatsuki Onishi <bougtoir@gmail.com>
</commit_message>
<xml_diff>
--- a/manuscript/build/manuscript.docx
+++ b/manuscript/build/manuscript.docx
@@ -45,7 +45,7 @@
     </w:p>
     <w:p>
       <w:r>
-        <w:t>Passive roof-snow strategies trade retained modeled snow mass against discrete eave-release mass. We tested whether spatial variation in slope, friction, and adhesion changed that trade-off relative to an exhaustively mapped uniform design space. A unit-width, cell-based threshold-release model was evaluated under synthetic weather, with Japanese Meteorological Agency daily observations used only as supplementary forcing. Multi-seed NSGA-II generated geometry-only, surface-only, and joint heterogeneous sets. The uniform set contained two unique objective pairs, whereas the joint set contained eight, including the uniform endpoints and additional intermediate trade-offs. Under the frozen common reference, their normalized hypervolumes were 0.402 and 0.611; joint additive epsilon versus uniform was 0.000. The joint set had six intermediate objective pairs unavailable to the uniform set under the same objective caps. Six candidates tied the minimum robustness score. Mapping the continuous joint knee to feasible generic segments changed modeled retained mass by 0.36% and release mass by 11.03%. All three selected designs failed the frozen composite timestep criterion at 1 h. Spatial grading therefore expanded modeled intermediate trade-off regions, but no front-wide superiority, structural safety, or validated roof performance is established.</w:t>
+        <w:t>Passive roof-snow strategies trade retained modeled snow mass against discrete eave-release mass. We tested whether spatial variation in slope, friction, and adhesion changed that trade-off relative to an exhaustively mapped uniform design space. A unit-width, cell-based threshold-release model was evaluated under synthetic weather, with Japanese Meteorological Agency daily observations used only as supplementary forcing. Multi-seed NSGA-II generated geometry-only, surface-only, and joint heterogeneous sets. The uniform set contained 2 unique objective pairs, whereas the joint set contained 6, including the uniform endpoints and additional intermediate trade-offs. Under the common audit reference, their normalized hypervolumes were 0.701 and 0.762; joint additive epsilon versus uniform was 0.000. The joint set had 4 intermediate objective pairs unavailable to the uniform set under the same objective caps. 6 candidates tied the minimum robustness score. Mapping the continuous joint knee to rule-compliant generic segments changed modeled retained mass by -98.28% and release mass by +537.47%. A targeted 0.25-h sensitivity failed the four-metric tolerance for 3 of 3 selected designs relative to the 0.5-h production results. Spatial grading expanded the nominal modeled set, but constructability and interval sensitivity dominated the practical interpretation; no front-wide superiority, structural safety, or validated roof performance is established.</w:t>
       </w:r>
     </w:p>
     <w:p>
@@ -170,7 +170,7 @@
     </w:p>
     <w:p>
       <w:r>
-        <w:t>A full 30 x 30 x 7 uniform slope-friction-adhesion map preceded heterogeneous optimization. Geometry-only, surface-only, and joint profiles were parameterized by 4 control points interpolated across the roof. Checkpointed NSGA-II used a population of 48, 45 generations, and seeds 1701, 2903, 4517. Feasible historical evaluations from every seed were combined and filtered to approximate nondominated heterogeneous sets; only the uniform grid was exhaustively enumerated. Objective pairs were deduplicated at six decimal places for frontier metrics while design rows remained available for robustness and constructability analyses. Normalized hypervolume used common bounds and a reference at 105% of the joint objective maxima. Additive epsilon versus uniform, combined-set dominance, matched-objective constraints, and reference-point sensitivity were calculated. A normalized-distance knee was reported only as a within-front descriptive selection; common and front-specific normalizations were audited separately. Per-seed metrics summarized optimizer stochasticity in a machine-readable supplement. Figure 6 reports numerical convergence; Figure 7 reports prespecified one-at-a-time sensitivity.</w:t>
+        <w:t>A full 30 x 30 x 7 uniform slope-friction-adhesion map preceded heterogeneous optimization. Geometry-only, surface-only, and joint profiles were parameterized by 4 control points interpolated across the roof. Checkpointed NSGA-II used a population of 48, 45 generations, and seeds 1701, 2903, 4517. Feasible historical evaluations from every seed were combined and filtered to approximate nondominated heterogeneous sets; only the uniform grid was exhaustively enumerated. Objective pairs were deduplicated at six decimal places for frontier metrics while design rows remained available for robustness and constructability analyses. Normalized hypervolume used common bounds and a reference at 105% of the joint objective maxima. Additive epsilon versus uniform, combined-set dominance, matched-objective constraints, and reference-point sensitivity were calculated. A normalized-distance knee was reported only as a within-front descriptive selection; common and front-specific normalizations were audited separately. Per-seed metrics summarized optimizer stochasticity in a machine-readable supplement. Production used a 0.5-h timestep, the finest resolution in the frozen grid. A targeted 0.25-h reevaluation of selected designs was reported as post-freeze numerical sensitivity rather than a second optimization. Figure 6 reports numerical convergence; Figure 7 reports prespecified one-at-a-time sensitivity.</w:t>
       </w:r>
     </w:p>
     <w:p>
@@ -214,7 +214,7 @@
         <w:t>−1</w:t>
       </w:r>
       <w:r>
-        <w:t>, whereas the shedding baseline produced Lmax=80.00 kg m</w:t>
+        <w:t>, whereas the shedding baseline produced Lmax=40.00 kg m</w:t>
       </w:r>
       <w:r>
         <w:rPr>
@@ -223,7 +223,7 @@
         <w:t>−1</w:t>
       </w:r>
       <w:r>
-        <w:t xml:space="preserve"> and Smax=80.00 kg m</w:t>
+        <w:t xml:space="preserve"> and Smax=40.00 kg m</w:t>
       </w:r>
       <w:r>
         <w:rPr>
@@ -232,7 +232,7 @@
         <w:t>−1</w:t>
       </w:r>
       <w:r>
-        <w:t>. These are modeled unit-width masses, not structural loads. The frozen 8% four-metric convergence tolerance was met by 3 of 9 tested resolution combinations. At the production 1 h interval, all 3 selected uniform, continuous-joint, and mapped-joint designs failed the same composite criterion. Smax is release mass in one model interval and therefore must be interpreted with the stated timestep.</w:t>
+        <w:t>. These are modeled unit-width masses, not structural loads. The frozen 8% four-metric convergence tolerance was met by 3 of 9 tested resolution combinations. The 0.5-h interval was the frozen numerical reference and production resolution. At 1 h, 3 of 3 selected uniform, continuous-joint, and mapped-joint designs failed the same composite criterion relative to 0.5 h. The targeted 0.25-h check failed it for 3 of 3 selected designs relative to 0.25 h. Accordingly, 0.5 h is described as the production reference resolution, not as demonstrated convergence beyond that interval. Smax is release mass in one model interval and therefore must be interpreted with the stated timestep.</w:t>
       </w:r>
     </w:p>
     <w:p>
@@ -245,7 +245,7 @@
     </w:p>
     <w:p>
       <w:r>
-        <w:t>The exhaustive uniform grid produced 2912 nondominated design rows but only 2 objective pairs: 80.00/80.00 kg m</w:t>
+        <w:t>The exhaustive uniform grid produced 2910 nondominated design rows but only 2 objective pairs: 40.00/40.00 kg m</w:t>
       </w:r>
       <w:r>
         <w:rPr>
@@ -276,17 +276,17 @@
     </w:p>
     <w:p>
       <w:r>
-        <w:t>The uniform set contained two unique objective pairs, whereas the joint set contained eight, including the uniform endpoints and additional intermediate trade-offs. Under the frozen common reference, their normalized hypervolumes were 0.402 and 0.611; joint additive epsilon versus uniform was 0.000.</w:t>
+        <w:t>The uniform set contained 2 unique objective pairs, whereas the joint set contained 6, including the uniform endpoints and additional intermediate trade-offs. Under the common audit reference, their normalized hypervolumes were 0.701 and 0.762; joint additive epsilon versus uniform was 0.000.</w:t>
       </w:r>
     </w:p>
     <w:p>
       <w:r>
-        <w:t>The complete frontier summary was uniform: 2 objective pairs, normalized hypervolume 0.402, additive epsilon versus uniform 0.000; geometry: 15 objective pairs, normalized hypervolume 0.267, additive epsilon versus uniform 0.205; surface: 2 objective pairs, normalized hypervolume 0.402, additive epsilon versus uniform 0.000; joint: 8 objective pairs, normalized hypervolume 0.611, additive epsilon versus uniform 0.000. Joint hypervolume exceeded uniform because the joint set included the uniform objective pairs and 6 additional intermediate pairs. Joint additive epsilon versus uniform was nevertheless zero because every uniform reference point was weakly matched; this does not imply front-wide superiority. Hypervolume ordering was unchanged under the audited origin and reference-margin choices.</w:t>
+        <w:t>The complete frontier summary was uniform: 2 objective pairs, normalized hypervolume 0.701, additive epsilon versus uniform 0.000; geometry: 6 objective pairs, normalized hypervolume 0.504, additive epsilon versus uniform 0.209; surface: 2 objective pairs, normalized hypervolume 0.701, additive epsilon versus uniform 0.000; joint: 6 objective pairs, normalized hypervolume 0.762, additive epsilon versus uniform 0.000. Joint hypervolume exceeded uniform because the joint set included the uniform objective pairs and 4 additional intermediate pairs. Joint additive epsilon versus uniform was nevertheless zero because every uniform reference point was weakly matched; this does not imply front-wide superiority. Hypervolume ordering was unchanged under the audited origin and reference-margin choices.</w:t>
       </w:r>
     </w:p>
     <w:p>
       <w:r>
-        <w:t>The front-specific joint knee was 3210.6/40.00 kg m</w:t>
+        <w:t>The front-specific joint knee was 4547.4/12.28 kg m</w:t>
       </w:r>
       <w:r>
         <w:rPr>
@@ -295,7 +295,7 @@
         <w:t>−1</w:t>
       </w:r>
       <w:r>
-        <w:t>, whereas common normalization selected 2941.9/43.33 kg m</w:t>
+        <w:t>, whereas common normalization selected 40.00/40.00 kg m</w:t>
       </w:r>
       <w:r>
         <w:rPr>
@@ -313,7 +313,7 @@
         <w:t>−1</w:t>
       </w:r>
       <w:r>
-        <w:t>, the minimum observed Lmax was 5082.2 kg m</w:t>
+        <w:t>, the minimum observed Lmax was 4545.9 kg m</w:t>
       </w:r>
       <w:r>
         <w:rPr>
@@ -344,7 +344,7 @@
     </w:p>
     <w:p>
       <w:r>
-        <w:t>Among 14 candidates with the nominal 80.00/80.00 kg m</w:t>
+        <w:t>Among 12 candidates with the nominal 40.00/40.00 kg m</w:t>
       </w:r>
       <w:r>
         <w:rPr>
@@ -353,7 +353,7 @@
         <w:t>−1</w:t>
       </w:r>
       <w:r>
-        <w:t xml:space="preserve"> objective pair, Q95 Lmax ranged from 103.8 to 7465.5 kg m</w:t>
+        <w:t xml:space="preserve"> objective pair, Q95 Lmax ranged from 51.89 to 5816.7 kg m</w:t>
       </w:r>
       <w:r>
         <w:rPr>
@@ -362,7 +362,7 @@
         <w:t>−1</w:t>
       </w:r>
       <w:r>
-        <w:t>, Q95 Smax ranged from 103.8 to 5482.6 kg m</w:t>
+        <w:t>, Q95 Smax ranged from 51.89 to 2726.6 kg m</w:t>
       </w:r>
       <w:r>
         <w:rPr>
@@ -371,7 +371,7 @@
         <w:t>−1</w:t>
       </w:r>
       <w:r>
-        <w:t>, and manual-intervention probability ranged from 0.000 to 0.432. The minimum scalar robustness score was shared by 6 candidates, so the retained selected flag is only a deterministic row-order tie-break. Monte Carlo quantiles describe the configured perturbation model, not empirical confidence intervals.</w:t>
+        <w:t>, and manual-intervention probability ranged from 0.000 to 0.216. The minimum scalar robustness score was shared by 6 candidates, so the retained selected flag is only a deterministic row-order tie-break. Monte Carlo quantiles describe the configured perturbation model, not empirical confidence intervals.</w:t>
       </w:r>
     </w:p>
     <w:p>
@@ -384,7 +384,7 @@
     </w:p>
     <w:p>
       <w:r>
-        <w:t>Only 9 of the 1928 joint design rows met all post hoc constructability checks, and all belonged to the 80.00/80.00 kg m</w:t>
+        <w:t>No joint design row among the 1341 nondominated rows met all post hoc constructability checks. The selected continuous joint knee had 23 slope and 23 surface transitions and minimum segment length 1 cell. Generic mapping reduced these to 6 and 0 transitions; Lmax changed by -4469.09 kg m</w:t>
       </w:r>
       <w:r>
         <w:rPr>
@@ -393,7 +393,7 @@
         <w:t>−1</w:t>
       </w:r>
       <w:r>
-        <w:t xml:space="preserve"> objective pair. The selected continuous joint knee had 23 slope and 23 surface transitions and minimum segment length 1 cell. Generic mapping reduced these to 6 and 3 transitions; Lmax changed by 11.68 kg m</w:t>
+        <w:t xml:space="preserve"> (-98.28%) and Smax by +66.00 kg m</w:t>
       </w:r>
       <w:r>
         <w:rPr>
@@ -402,16 +402,7 @@
         <w:t>−1</w:t>
       </w:r>
       <w:r>
-        <w:t xml:space="preserve"> (0.36%) and Smax by 4.41 kg m</w:t>
-      </w:r>
-      <w:r>
-        <w:rPr>
-          <w:vertAlign w:val="superscript"/>
-        </w:rPr>
-        <w:t>−1</w:t>
-      </w:r>
-      <w:r>
-        <w:t xml:space="preserve"> (11.03%). The mapped profile is a feasible translation, not a constrained optimum. Every frozen transition-penalty setting selected a uniform design. Labor-scarcity and phase-diagram classifications remain illustrative decision weights, not community or building-code recommendations.</w:t>
+        <w:t xml:space="preserve"> (+537.47%). The mapped profile is a post hoc rule-compliant translation, not a constrained optimum. Every frozen transition-penalty setting selected a uniform design. Labor-scarcity and phase-diagram classifications remain illustrative decision weights, not community or building-code recommendations.</w:t>
       </w:r>
     </w:p>
     <w:p>
@@ -424,7 +415,7 @@
     </w:p>
     <w:p>
       <w:r>
-        <w:t>Daily forcing covered 4 stations and 12 station-winters without missing temperature or snowfall days. Joint-to-uniform Lmax ratios ranged from 1.21 to 11.62, while Smax reductions ranged from 48.96% to 50.00%. These paired modeled trade-offs were strongly station-winter dependent. Table 9 gives the paired station-winter results. Daily ground observations are supplementary forcing, not roof-scale validation, and daily Smax is not directly comparable with hourly Smax.</w:t>
+        <w:t>Daily forcing covered 4 stations and 12 station-winters without missing temperature or snowfall days. Joint-to-uniform Lmax ratios ranged from 2.84 to 16.68, while Smax reductions ranged from 67.01% to 70.83%. These paired modeled trade-offs were strongly station-winter dependent. Table 9 gives the paired station-winter results. Daily ground observations are supplementary forcing, not roof-scale validation, and daily Smax is not directly comparable with subdaily synthetic Smax.</w:t>
       </w:r>
     </w:p>
     <w:p>
@@ -437,7 +428,7 @@
     </w:p>
     <w:p>
       <w:r>
-        <w:t>The frozen research question can be answered narrowly: under identical modeled forcing, spatial variation did not improve the 2 uniform objective regimes, but it introduced 6 observed intermediate Lmax-Smax combinations that the exhaustive uniform grid did not attain under the same objective caps. This is an expansion of the modeled trade-off set, not universal superiority. The joint front's larger hypervolume and zero additive epsilon are compatible because it contains the uniform endpoints while filling intermediate regions.</w:t>
+        <w:t>The frozen research question can be answered narrowly: under identical modeled forcing, spatial variation did not improve the 2 uniform objective regimes, but it introduced 4 observed intermediate Lmax-Smax combinations that the exhaustive uniform grid did not attain under the same objective caps. This is an expansion of the modeled trade-off set, not universal superiority. The joint front's larger hypervolume and zero additive epsilon are compatible because it contains the uniform endpoints while filling intermediate regions.</w:t>
       </w:r>
     </w:p>
     <w:p>
@@ -447,7 +438,7 @@
     </w:p>
     <w:p>
       <w:r>
-        <w:t>Constructability materially changes the interpretation. The intermediate joint trade-offs were found in continuous profiles that did not directly satisfy all segment and transition limits. Post hoc mapping incurred modest Lmax change but an 11.03% Smax increase, and every frozen transition penalty selected a uniform regime. Graded concepts therefore require constrained reoptimization and physical testing before practical comparison.</w:t>
+        <w:t>Constructability materially changes the interpretation. The intermediate joint trade-offs were found in continuous profiles that did not directly satisfy all segment and transition limits. Post hoc mapping changed the selected knee's Lmax by -98.28% and Smax by +537.47%, and every frozen transition penalty selected a uniform regime. The nominal intermediate expansion therefore did not survive the constructability screen as a practical advantage. Graded concepts require constrained reoptimization and physical testing before practical comparison.</w:t>
       </w:r>
     </w:p>
     <w:p>
@@ -465,7 +456,7 @@
     </w:p>
     <w:p>
       <w:r>
-        <w:t>The model has not been calibrated or validated against roof-scale shedding measurements. It omits wind redistribution, three-dimensional flow, snow fracture and slab mechanics, cornices, local roof details, heat transfer through the assembly, impact trajectories, drainage blockage, structural response, and pedestrian exposure. Friction, adhesion, compaction, melt, and aging parameters include explicit assumptions. The 1 h production setting failed the frozen composite timestep criterion for all selected designs; event mass, event count, and SSCI were particularly interval sensitive. The heterogeneous sets are multi-seed heuristic results rather than guaranteed complete fronts. Daily JMA observations do not resolve subdaily events, and ground snowfall or snow depth is not roof snow mass. Accordingly, the study does not establish structural safety, pedestrian safety, code compliance, injury reduction, lifecycle cost, or universal effectiveness.</w:t>
+        <w:t>The model has not been calibrated or validated against roof-scale shedding measurements. It omits wind redistribution, three-dimensional flow, snow fracture and slab mechanics, cornices, local roof details, heat transfer through the assembly, impact trajectories, drainage blockage, structural response, and pedestrian exposure. Friction, adhesion, compaction, melt, and aging parameters include explicit assumptions. The 0.5-h production interval is the finest frozen-grid reference rather than proof of convergence beyond 0.5 h. The 1-h and targeted 0.25-h comparisons showed that event mass, event count, and SSCI were particularly interval sensitive. The heterogeneous sets are multi-seed heuristic results rather than guaranteed complete fronts. Daily JMA observations do not resolve subdaily events, and ground snowfall or snow depth is not roof snow mass. Accordingly, the study does not establish structural safety, pedestrian safety, code compliance, injury reduction, lifecycle cost, or universal effectiveness.</w:t>
       </w:r>
     </w:p>
     <w:p>
@@ -478,7 +469,7 @@
     </w:p>
     <w:p>
       <w:r>
-        <w:t>Future work should calibrate interface parameters across temperature, liquid-water content, roughness, aging, and load; validate mass and release timing against instrumented roofs; add wind redistribution and three-dimensional edge effects; reoptimize at finer timesteps with explicitly constrained segments and surface classes; and predefine external-validation metrics before fitting.</w:t>
+        <w:t>Future work should calibrate interface parameters across temperature, liquid-water content, roughness, aging, and load; validate mass and release timing against instrumented roofs; add wind redistribution and three-dimensional edge effects; define an interval-invariant release-rate outcome if cross-timestep comparison is required; optimize explicitly constrained segments and surface classes; and predefine external-validation metrics before fitting.</w:t>
       </w:r>
     </w:p>
     <w:p>
@@ -491,7 +482,7 @@
     </w:p>
     <w:p>
       <w:r>
-        <w:t>An exhaustive uniform reference had 2 modeled objective regimes. Heuristic joint spatial grading preserved those regimes and added 6 intermediate trade-off combinations, but the intermediate continuous profiles were not directly constructable under all frozen checks, nominal objectives did not determine robustness, and the 1 h production timestep was not converged under the composite criterion. The findings are reproducible design-space hypotheses for constrained reoptimization and roof-scale validation, not design approval or safety certification.</w:t>
+        <w:t>An exhaustive uniform reference had 2 modeled objective regimes. Heuristic joint spatial grading preserved those regimes and added 4 intermediate trade-off combinations. However, no joint row directly passed all frozen constructability checks, post hoc mapping removed the selected nominal intermediate advantage, nominal objectives did not determine robustness, and the targeted 0.25-h check confirmed interval sensitivity. Constructability and numerical interpretation therefore dominate the theoretical grading benefit. The findings are reproducible design-space hypotheses for constrained reoptimization and roof-scale validation, not design approval or safety certification.</w:t>
       </w:r>
     </w:p>
     <w:p>
@@ -812,7 +803,7 @@
               <w:rPr>
                 <w:sz w:val="14"/>
               </w:rPr>
-              <w:t>2912</w:t>
+              <w:t>2910</w:t>
             </w:r>
           </w:p>
         </w:tc>
@@ -838,7 +829,7 @@
               <w:rPr>
                 <w:sz w:val="14"/>
               </w:rPr>
-              <w:t>80.00</w:t>
+              <w:t>40.00</w:t>
             </w:r>
           </w:p>
         </w:tc>
@@ -851,7 +842,7 @@
               <w:rPr>
                 <w:sz w:val="14"/>
               </w:rPr>
-              <w:t>80.00</w:t>
+              <w:t>40.00</w:t>
             </w:r>
           </w:p>
         </w:tc>
@@ -864,7 +855,7 @@
               <w:rPr>
                 <w:sz w:val="14"/>
               </w:rPr>
-              <w:t>0.402</w:t>
+              <w:t>0.701</w:t>
             </w:r>
           </w:p>
         </w:tc>
@@ -905,7 +896,7 @@
               <w:rPr>
                 <w:sz w:val="14"/>
               </w:rPr>
-              <w:t>320</w:t>
+              <w:t>155</w:t>
             </w:r>
           </w:p>
         </w:tc>
@@ -918,7 +909,7 @@
               <w:rPr>
                 <w:sz w:val="14"/>
               </w:rPr>
-              <w:t>15</w:t>
+              <w:t>6</w:t>
             </w:r>
           </w:p>
         </w:tc>
@@ -931,7 +922,7 @@
               <w:rPr>
                 <w:sz w:val="14"/>
               </w:rPr>
-              <w:t>175.3</w:t>
+              <w:t>160.0</w:t>
             </w:r>
           </w:p>
         </w:tc>
@@ -944,7 +935,7 @@
               <w:rPr>
                 <w:sz w:val="14"/>
               </w:rPr>
-              <w:t>105.1</w:t>
+              <w:t>65.77</w:t>
             </w:r>
           </w:p>
         </w:tc>
@@ -957,7 +948,7 @@
               <w:rPr>
                 <w:sz w:val="14"/>
               </w:rPr>
-              <w:t>0.267</w:t>
+              <w:t>0.504</w:t>
             </w:r>
           </w:p>
         </w:tc>
@@ -970,7 +961,7 @@
               <w:rPr>
                 <w:sz w:val="14"/>
               </w:rPr>
-              <w:t>0.205</w:t>
+              <w:t>0.209</w:t>
             </w:r>
           </w:p>
         </w:tc>
@@ -998,7 +989,7 @@
               <w:rPr>
                 <w:sz w:val="14"/>
               </w:rPr>
-              <w:t>1731</w:t>
+              <w:t>270</w:t>
             </w:r>
           </w:p>
         </w:tc>
@@ -1024,7 +1015,7 @@
               <w:rPr>
                 <w:sz w:val="14"/>
               </w:rPr>
-              <w:t>80.00</w:t>
+              <w:t>40.00</w:t>
             </w:r>
           </w:p>
         </w:tc>
@@ -1037,7 +1028,7 @@
               <w:rPr>
                 <w:sz w:val="14"/>
               </w:rPr>
-              <w:t>80.00</w:t>
+              <w:t>40.00</w:t>
             </w:r>
           </w:p>
         </w:tc>
@@ -1050,7 +1041,7 @@
               <w:rPr>
                 <w:sz w:val="14"/>
               </w:rPr>
-              <w:t>0.402</w:t>
+              <w:t>0.701</w:t>
             </w:r>
           </w:p>
         </w:tc>
@@ -1091,7 +1082,7 @@
               <w:rPr>
                 <w:sz w:val="14"/>
               </w:rPr>
-              <w:t>1928</w:t>
+              <w:t>1341</w:t>
             </w:r>
           </w:p>
         </w:tc>
@@ -1104,7 +1095,7 @@
               <w:rPr>
                 <w:sz w:val="14"/>
               </w:rPr>
-              <w:t>8</w:t>
+              <w:t>6</w:t>
             </w:r>
           </w:p>
         </w:tc>
@@ -1117,7 +1108,7 @@
               <w:rPr>
                 <w:sz w:val="14"/>
               </w:rPr>
-              <w:t>3210.6</w:t>
+              <w:t>4547.4</w:t>
             </w:r>
           </w:p>
         </w:tc>
@@ -1130,7 +1121,7 @@
               <w:rPr>
                 <w:sz w:val="14"/>
               </w:rPr>
-              <w:t>40.00</w:t>
+              <w:t>12.28</w:t>
             </w:r>
           </w:p>
         </w:tc>
@@ -1143,7 +1134,7 @@
               <w:rPr>
                 <w:sz w:val="14"/>
               </w:rPr>
-              <w:t>0.611</w:t>
+              <w:t>0.762</w:t>
             </w:r>
           </w:p>
         </w:tc>
@@ -1293,7 +1284,7 @@
               <w:rPr>
                 <w:sz w:val="14"/>
               </w:rPr>
-              <w:t>39.97</w:t>
+              <w:t>36.96</w:t>
             </w:r>
           </w:p>
         </w:tc>
@@ -1306,7 +1297,7 @@
               <w:rPr>
                 <w:sz w:val="14"/>
               </w:rPr>
-              <w:t>33.00</w:t>
+              <w:t>38.00</w:t>
             </w:r>
           </w:p>
         </w:tc>
@@ -1319,7 +1310,7 @@
               <w:rPr>
                 <w:sz w:val="14"/>
               </w:rPr>
-              <w:t>0.464</w:t>
+              <w:t>0.213</w:t>
             </w:r>
           </w:p>
         </w:tc>
@@ -1332,7 +1323,7 @@
               <w:rPr>
                 <w:sz w:val="14"/>
               </w:rPr>
-              <w:t>202.3</w:t>
+              <w:t>20.94</w:t>
             </w:r>
           </w:p>
         </w:tc>
@@ -1345,7 +1336,7 @@
               <w:rPr>
                 <w:sz w:val="14"/>
               </w:rPr>
-              <w:t>rough_retention</w:t>
+              <w:t>smooth_metal</w:t>
             </w:r>
           </w:p>
         </w:tc>
@@ -1373,7 +1364,7 @@
               <w:rPr>
                 <w:sz w:val="14"/>
               </w:rPr>
-              <w:t>35.51</w:t>
+              <w:t>37.50</w:t>
             </w:r>
           </w:p>
         </w:tc>
@@ -1386,7 +1377,7 @@
               <w:rPr>
                 <w:sz w:val="14"/>
               </w:rPr>
-              <w:t>33.00</w:t>
+              <w:t>38.00</w:t>
             </w:r>
           </w:p>
         </w:tc>
@@ -1399,7 +1390,7 @@
               <w:rPr>
                 <w:sz w:val="14"/>
               </w:rPr>
-              <w:t>0.474</w:t>
+              <w:t>0.218</w:t>
             </w:r>
           </w:p>
         </w:tc>
@@ -1412,7 +1403,7 @@
               <w:rPr>
                 <w:sz w:val="14"/>
               </w:rPr>
-              <w:t>176.3</w:t>
+              <w:t>22.33</w:t>
             </w:r>
           </w:p>
         </w:tc>
@@ -1425,7 +1416,7 @@
               <w:rPr>
                 <w:sz w:val="14"/>
               </w:rPr>
-              <w:t>rough_retention</w:t>
+              <w:t>smooth_metal</w:t>
             </w:r>
           </w:p>
         </w:tc>
@@ -1453,7 +1444,7 @@
               <w:rPr>
                 <w:sz w:val="14"/>
               </w:rPr>
-              <w:t>31.04</w:t>
+              <w:t>38.04</w:t>
             </w:r>
           </w:p>
         </w:tc>
@@ -1466,7 +1457,7 @@
               <w:rPr>
                 <w:sz w:val="14"/>
               </w:rPr>
-              <w:t>33.00</w:t>
+              <w:t>38.00</w:t>
             </w:r>
           </w:p>
         </w:tc>
@@ -1479,7 +1470,7 @@
               <w:rPr>
                 <w:sz w:val="14"/>
               </w:rPr>
-              <w:t>0.484</w:t>
+              <w:t>0.222</w:t>
             </w:r>
           </w:p>
         </w:tc>
@@ -1492,7 +1483,7 @@
               <w:rPr>
                 <w:sz w:val="14"/>
               </w:rPr>
-              <w:t>150.3</w:t>
+              <w:t>23.72</w:t>
             </w:r>
           </w:p>
         </w:tc>
@@ -1505,7 +1496,7 @@
               <w:rPr>
                 <w:sz w:val="14"/>
               </w:rPr>
-              <w:t>rough_retention</w:t>
+              <w:t>smooth_metal</w:t>
             </w:r>
           </w:p>
         </w:tc>
@@ -1533,7 +1524,7 @@
               <w:rPr>
                 <w:sz w:val="14"/>
               </w:rPr>
-              <w:t>26.58</w:t>
+              <w:t>38.58</w:t>
             </w:r>
           </w:p>
         </w:tc>
@@ -1546,7 +1537,7 @@
               <w:rPr>
                 <w:sz w:val="14"/>
               </w:rPr>
-              <w:t>33.00</w:t>
+              <w:t>38.00</w:t>
             </w:r>
           </w:p>
         </w:tc>
@@ -1559,7 +1550,7 @@
               <w:rPr>
                 <w:sz w:val="14"/>
               </w:rPr>
-              <w:t>0.494</w:t>
+              <w:t>0.227</w:t>
             </w:r>
           </w:p>
         </w:tc>
@@ -1572,7 +1563,7 @@
               <w:rPr>
                 <w:sz w:val="14"/>
               </w:rPr>
-              <w:t>124.3</w:t>
+              <w:t>25.11</w:t>
             </w:r>
           </w:p>
         </w:tc>
@@ -1585,7 +1576,7 @@
               <w:rPr>
                 <w:sz w:val="14"/>
               </w:rPr>
-              <w:t>rough_retention</w:t>
+              <w:t>smooth_metal</w:t>
             </w:r>
           </w:p>
         </w:tc>
@@ -1613,7 +1604,7 @@
               <w:rPr>
                 <w:sz w:val="14"/>
               </w:rPr>
-              <w:t>22.11</w:t>
+              <w:t>39.11</w:t>
             </w:r>
           </w:p>
         </w:tc>
@@ -1626,7 +1617,7 @@
               <w:rPr>
                 <w:sz w:val="14"/>
               </w:rPr>
-              <w:t>21.00</w:t>
+              <w:t>40.00</w:t>
             </w:r>
           </w:p>
         </w:tc>
@@ -1639,7 +1630,7 @@
               <w:rPr>
                 <w:sz w:val="14"/>
               </w:rPr>
-              <w:t>0.504</w:t>
+              <w:t>0.231</w:t>
             </w:r>
           </w:p>
         </w:tc>
@@ -1652,7 +1643,7 @@
               <w:rPr>
                 <w:sz w:val="14"/>
               </w:rPr>
-              <w:t>98.30</w:t>
+              <w:t>26.50</w:t>
             </w:r>
           </w:p>
         </w:tc>
@@ -1665,7 +1656,7 @@
               <w:rPr>
                 <w:sz w:val="14"/>
               </w:rPr>
-              <w:t>aged_coated_metal</w:t>
+              <w:t>smooth_metal</w:t>
             </w:r>
           </w:p>
         </w:tc>
@@ -1693,7 +1684,7 @@
               <w:rPr>
                 <w:sz w:val="14"/>
               </w:rPr>
-              <w:t>17.64</w:t>
+              <w:t>39.65</w:t>
             </w:r>
           </w:p>
         </w:tc>
@@ -1706,7 +1697,7 @@
               <w:rPr>
                 <w:sz w:val="14"/>
               </w:rPr>
-              <w:t>21.00</w:t>
+              <w:t>40.00</w:t>
             </w:r>
           </w:p>
         </w:tc>
@@ -1719,7 +1710,7 @@
               <w:rPr>
                 <w:sz w:val="14"/>
               </w:rPr>
-              <w:t>0.514</w:t>
+              <w:t>0.236</w:t>
             </w:r>
           </w:p>
         </w:tc>
@@ -1732,7 +1723,7 @@
               <w:rPr>
                 <w:sz w:val="14"/>
               </w:rPr>
-              <w:t>72.31</w:t>
+              <w:t>27.89</w:t>
             </w:r>
           </w:p>
         </w:tc>
@@ -1745,7 +1736,7 @@
               <w:rPr>
                 <w:sz w:val="14"/>
               </w:rPr>
-              <w:t>aged_coated_metal</w:t>
+              <w:t>smooth_metal</w:t>
             </w:r>
           </w:p>
         </w:tc>
@@ -1773,7 +1764,7 @@
               <w:rPr>
                 <w:sz w:val="14"/>
               </w:rPr>
-              <w:t>13.18</w:t>
+              <w:t>40.19</w:t>
             </w:r>
           </w:p>
         </w:tc>
@@ -1786,7 +1777,7 @@
               <w:rPr>
                 <w:sz w:val="14"/>
               </w:rPr>
-              <w:t>21.00</w:t>
+              <w:t>40.00</w:t>
             </w:r>
           </w:p>
         </w:tc>
@@ -1799,7 +1790,7 @@
               <w:rPr>
                 <w:sz w:val="14"/>
               </w:rPr>
-              <w:t>0.524</w:t>
+              <w:t>0.240</w:t>
             </w:r>
           </w:p>
         </w:tc>
@@ -1812,7 +1803,7 @@
               <w:rPr>
                 <w:sz w:val="14"/>
               </w:rPr>
-              <w:t>46.32</w:t>
+              <w:t>29.28</w:t>
             </w:r>
           </w:p>
         </w:tc>
@@ -1825,7 +1816,7 @@
               <w:rPr>
                 <w:sz w:val="14"/>
               </w:rPr>
-              <w:t>aged_coated_metal</w:t>
+              <w:t>smooth_metal</w:t>
             </w:r>
           </w:p>
         </w:tc>
@@ -1853,7 +1844,7 @@
               <w:rPr>
                 <w:sz w:val="14"/>
               </w:rPr>
-              <w:t>8.710</w:t>
+              <w:t>40.73</w:t>
             </w:r>
           </w:p>
         </w:tc>
@@ -1866,7 +1857,7 @@
               <w:rPr>
                 <w:sz w:val="14"/>
               </w:rPr>
-              <w:t>21.00</w:t>
+              <w:t>40.00</w:t>
             </w:r>
           </w:p>
         </w:tc>
@@ -1879,7 +1870,7 @@
               <w:rPr>
                 <w:sz w:val="14"/>
               </w:rPr>
-              <w:t>0.534</w:t>
+              <w:t>0.245</w:t>
             </w:r>
           </w:p>
         </w:tc>
@@ -1892,7 +1883,7 @@
               <w:rPr>
                 <w:sz w:val="14"/>
               </w:rPr>
-              <w:t>20.33</w:t>
+              <w:t>30.67</w:t>
             </w:r>
           </w:p>
         </w:tc>
@@ -1905,7 +1896,7 @@
               <w:rPr>
                 <w:sz w:val="14"/>
               </w:rPr>
-              <w:t>aged_coated_metal</w:t>
+              <w:t>smooth_metal</w:t>
             </w:r>
           </w:p>
         </w:tc>
@@ -1933,7 +1924,7 @@
               <w:rPr>
                 <w:sz w:val="14"/>
               </w:rPr>
-              <w:t>6.863</w:t>
+              <w:t>39.53</w:t>
             </w:r>
           </w:p>
         </w:tc>
@@ -1946,7 +1937,7 @@
               <w:rPr>
                 <w:sz w:val="14"/>
               </w:rPr>
-              <w:t>12.00</w:t>
+              <w:t>33.00</w:t>
             </w:r>
           </w:p>
         </w:tc>
@@ -1959,7 +1950,7 @@
               <w:rPr>
                 <w:sz w:val="14"/>
               </w:rPr>
-              <w:t>0.526</w:t>
+              <w:t>0.244</w:t>
             </w:r>
           </w:p>
         </w:tc>
@@ -1972,7 +1963,7 @@
               <w:rPr>
                 <w:sz w:val="14"/>
               </w:rPr>
-              <w:t>2.890</w:t>
+              <w:t>30.23</w:t>
             </w:r>
           </w:p>
         </w:tc>
@@ -1985,7 +1976,7 @@
               <w:rPr>
                 <w:sz w:val="14"/>
               </w:rPr>
-              <w:t>aged_coated_metal</w:t>
+              <w:t>smooth_metal</w:t>
             </w:r>
           </w:p>
         </w:tc>
@@ -2013,7 +2004,7 @@
               <w:rPr>
                 <w:sz w:val="14"/>
               </w:rPr>
-              <w:t>10.26</w:t>
+              <w:t>34.86</w:t>
             </w:r>
           </w:p>
         </w:tc>
@@ -2026,7 +2017,7 @@
               <w:rPr>
                 <w:sz w:val="14"/>
               </w:rPr>
-              <w:t>12.00</w:t>
+              <w:t>33.00</w:t>
             </w:r>
           </w:p>
         </w:tc>
@@ -2039,7 +2030,7 @@
               <w:rPr>
                 <w:sz w:val="14"/>
               </w:rPr>
-              <w:t>0.482</w:t>
+              <w:t>0.233</w:t>
             </w:r>
           </w:p>
         </w:tc>
@@ -2052,7 +2043,7 @@
               <w:rPr>
                 <w:sz w:val="14"/>
               </w:rPr>
-              <w:t>2.557</w:t>
+              <w:t>26.14</w:t>
             </w:r>
           </w:p>
         </w:tc>
@@ -2065,7 +2056,7 @@
               <w:rPr>
                 <w:sz w:val="14"/>
               </w:rPr>
-              <w:t>aged_coated_metal</w:t>
+              <w:t>smooth_metal</w:t>
             </w:r>
           </w:p>
         </w:tc>
@@ -2093,7 +2084,7 @@
               <w:rPr>
                 <w:sz w:val="14"/>
               </w:rPr>
-              <w:t>13.65</w:t>
+              <w:t>30.19</w:t>
             </w:r>
           </w:p>
         </w:tc>
@@ -2106,7 +2097,7 @@
               <w:rPr>
                 <w:sz w:val="14"/>
               </w:rPr>
-              <w:t>12.00</w:t>
+              <w:t>33.00</w:t>
             </w:r>
           </w:p>
         </w:tc>
@@ -2119,7 +2110,7 @@
               <w:rPr>
                 <w:sz w:val="14"/>
               </w:rPr>
-              <w:t>0.439</w:t>
+              <w:t>0.222</w:t>
             </w:r>
           </w:p>
         </w:tc>
@@ -2132,7 +2123,7 @@
               <w:rPr>
                 <w:sz w:val="14"/>
               </w:rPr>
-              <w:t>2.224</w:t>
+              <w:t>22.05</w:t>
             </w:r>
           </w:p>
         </w:tc>
@@ -2145,7 +2136,7 @@
               <w:rPr>
                 <w:sz w:val="14"/>
               </w:rPr>
-              <w:t>aged_coated_metal</w:t>
+              <w:t>smooth_metal</w:t>
             </w:r>
           </w:p>
         </w:tc>
@@ -2173,7 +2164,7 @@
               <w:rPr>
                 <w:sz w:val="14"/>
               </w:rPr>
-              <w:t>17.05</w:t>
+              <w:t>25.52</w:t>
             </w:r>
           </w:p>
         </w:tc>
@@ -2186,7 +2177,7 @@
               <w:rPr>
                 <w:sz w:val="14"/>
               </w:rPr>
-              <w:t>12.00</w:t>
+              <w:t>33.00</w:t>
             </w:r>
           </w:p>
         </w:tc>
@@ -2199,7 +2190,7 @@
               <w:rPr>
                 <w:sz w:val="14"/>
               </w:rPr>
-              <w:t>0.395</w:t>
+              <w:t>0.211</w:t>
             </w:r>
           </w:p>
         </w:tc>
@@ -2212,7 +2203,7 @@
               <w:rPr>
                 <w:sz w:val="14"/>
               </w:rPr>
-              <w:t>1.891</w:t>
+              <w:t>17.95</w:t>
             </w:r>
           </w:p>
         </w:tc>
@@ -2225,7 +2216,7 @@
               <w:rPr>
                 <w:sz w:val="14"/>
               </w:rPr>
-              <w:t>aged_coated_metal</w:t>
+              <w:t>smooth_metal</w:t>
             </w:r>
           </w:p>
         </w:tc>
@@ -2253,7 +2244,7 @@
               <w:rPr>
                 <w:sz w:val="14"/>
               </w:rPr>
-              <w:t>20.44</w:t>
+              <w:t>20.86</w:t>
             </w:r>
           </w:p>
         </w:tc>
@@ -2266,7 +2257,7 @@
               <w:rPr>
                 <w:sz w:val="14"/>
               </w:rPr>
-              <w:t>24.00</w:t>
+              <w:t>21.00</w:t>
             </w:r>
           </w:p>
         </w:tc>
@@ -2279,7 +2270,7 @@
               <w:rPr>
                 <w:sz w:val="14"/>
               </w:rPr>
-              <w:t>0.352</w:t>
+              <w:t>0.201</w:t>
             </w:r>
           </w:p>
         </w:tc>
@@ -2292,7 +2283,7 @@
               <w:rPr>
                 <w:sz w:val="14"/>
               </w:rPr>
-              <w:t>1.558</w:t>
+              <w:t>13.86</w:t>
             </w:r>
           </w:p>
         </w:tc>
@@ -2333,7 +2324,7 @@
               <w:rPr>
                 <w:sz w:val="14"/>
               </w:rPr>
-              <w:t>23.84</w:t>
+              <w:t>16.19</w:t>
             </w:r>
           </w:p>
         </w:tc>
@@ -2346,7 +2337,7 @@
               <w:rPr>
                 <w:sz w:val="14"/>
               </w:rPr>
-              <w:t>24.00</w:t>
+              <w:t>21.00</w:t>
             </w:r>
           </w:p>
         </w:tc>
@@ -2359,7 +2350,7 @@
               <w:rPr>
                 <w:sz w:val="14"/>
               </w:rPr>
-              <w:t>0.308</w:t>
+              <w:t>0.190</w:t>
             </w:r>
           </w:p>
         </w:tc>
@@ -2372,7 +2363,7 @@
               <w:rPr>
                 <w:sz w:val="14"/>
               </w:rPr>
-              <w:t>1.225</w:t>
+              <w:t>9.767</w:t>
             </w:r>
           </w:p>
         </w:tc>
@@ -2413,7 +2404,7 @@
               <w:rPr>
                 <w:sz w:val="14"/>
               </w:rPr>
-              <w:t>27.23</w:t>
+              <w:t>11.52</w:t>
             </w:r>
           </w:p>
         </w:tc>
@@ -2426,7 +2417,7 @@
               <w:rPr>
                 <w:sz w:val="14"/>
               </w:rPr>
-              <w:t>24.00</w:t>
+              <w:t>21.00</w:t>
             </w:r>
           </w:p>
         </w:tc>
@@ -2439,7 +2430,7 @@
               <w:rPr>
                 <w:sz w:val="14"/>
               </w:rPr>
-              <w:t>0.265</w:t>
+              <w:t>0.179</w:t>
             </w:r>
           </w:p>
         </w:tc>
@@ -2452,7 +2443,7 @@
               <w:rPr>
                 <w:sz w:val="14"/>
               </w:rPr>
-              <w:t>0.893</w:t>
+              <w:t>5.673</w:t>
             </w:r>
           </w:p>
         </w:tc>
@@ -2493,7 +2484,7 @@
               <w:rPr>
                 <w:sz w:val="14"/>
               </w:rPr>
-              <w:t>30.62</w:t>
+              <w:t>6.848</w:t>
             </w:r>
           </w:p>
         </w:tc>
@@ -2506,7 +2497,7 @@
               <w:rPr>
                 <w:sz w:val="14"/>
               </w:rPr>
-              <w:t>33.00</w:t>
+              <w:t>9.000</w:t>
             </w:r>
           </w:p>
         </w:tc>
@@ -2519,7 +2510,7 @@
               <w:rPr>
                 <w:sz w:val="14"/>
               </w:rPr>
-              <w:t>0.221</w:t>
+              <w:t>0.168</w:t>
             </w:r>
           </w:p>
         </w:tc>
@@ -2532,7 +2523,7 @@
               <w:rPr>
                 <w:sz w:val="14"/>
               </w:rPr>
-              <w:t>0.560</w:t>
+              <w:t>1.580</w:t>
             </w:r>
           </w:p>
         </w:tc>
@@ -2573,7 +2564,7 @@
               <w:rPr>
                 <w:sz w:val="14"/>
               </w:rPr>
-              <w:t>32.84</w:t>
+              <w:t>7.958</w:t>
             </w:r>
           </w:p>
         </w:tc>
@@ -2586,7 +2577,7 @@
               <w:rPr>
                 <w:sz w:val="14"/>
               </w:rPr>
-              <w:t>33.00</w:t>
+              <w:t>9.000</w:t>
             </w:r>
           </w:p>
         </w:tc>
@@ -2599,7 +2590,7 @@
               <w:rPr>
                 <w:sz w:val="14"/>
               </w:rPr>
-              <w:t>0.221</w:t>
+              <w:t>0.179</w:t>
             </w:r>
           </w:p>
         </w:tc>
@@ -2612,7 +2603,7 @@
               <w:rPr>
                 <w:sz w:val="14"/>
               </w:rPr>
-              <w:t>1.181</w:t>
+              <w:t>0.306</w:t>
             </w:r>
           </w:p>
         </w:tc>
@@ -2653,7 +2644,7 @@
               <w:rPr>
                 <w:sz w:val="14"/>
               </w:rPr>
-              <w:t>34.48</w:t>
+              <w:t>11.96</w:t>
             </w:r>
           </w:p>
         </w:tc>
@@ -2666,7 +2657,7 @@
               <w:rPr>
                 <w:sz w:val="14"/>
               </w:rPr>
-              <w:t>33.00</w:t>
+              <w:t>9.000</w:t>
             </w:r>
           </w:p>
         </w:tc>
@@ -2679,7 +2670,7 @@
               <w:rPr>
                 <w:sz w:val="14"/>
               </w:rPr>
-              <w:t>0.241</w:t>
+              <w:t>0.202</w:t>
             </w:r>
           </w:p>
         </w:tc>
@@ -2692,7 +2683,7 @@
               <w:rPr>
                 <w:sz w:val="14"/>
               </w:rPr>
-              <w:t>2.279</w:t>
+              <w:t>0.441</w:t>
             </w:r>
           </w:p>
         </w:tc>
@@ -2733,7 +2724,7 @@
               <w:rPr>
                 <w:sz w:val="14"/>
               </w:rPr>
-              <w:t>36.11</w:t>
+              <w:t>15.96</w:t>
             </w:r>
           </w:p>
         </w:tc>
@@ -2746,7 +2737,7 @@
               <w:rPr>
                 <w:sz w:val="14"/>
               </w:rPr>
-              <w:t>38.00</w:t>
+              <w:t>20.00</w:t>
             </w:r>
           </w:p>
         </w:tc>
@@ -2759,7 +2750,7 @@
               <w:rPr>
                 <w:sz w:val="14"/>
               </w:rPr>
-              <w:t>0.262</w:t>
+              <w:t>0.224</w:t>
             </w:r>
           </w:p>
         </w:tc>
@@ -2772,7 +2763,7 @@
               <w:rPr>
                 <w:sz w:val="14"/>
               </w:rPr>
-              <w:t>3.377</w:t>
+              <w:t>0.576</w:t>
             </w:r>
           </w:p>
         </w:tc>
@@ -2813,7 +2804,7 @@
               <w:rPr>
                 <w:sz w:val="14"/>
               </w:rPr>
-              <w:t>37.74</w:t>
+              <w:t>19.96</w:t>
             </w:r>
           </w:p>
         </w:tc>
@@ -2826,7 +2817,7 @@
               <w:rPr>
                 <w:sz w:val="14"/>
               </w:rPr>
-              <w:t>38.00</w:t>
+              <w:t>20.00</w:t>
             </w:r>
           </w:p>
         </w:tc>
@@ -2839,7 +2830,7 @@
               <w:rPr>
                 <w:sz w:val="14"/>
               </w:rPr>
-              <w:t>0.283</w:t>
+              <w:t>0.246</w:t>
             </w:r>
           </w:p>
         </w:tc>
@@ -2852,7 +2843,7 @@
               <w:rPr>
                 <w:sz w:val="14"/>
               </w:rPr>
-              <w:t>4.475</w:t>
+              <w:t>0.711</w:t>
             </w:r>
           </w:p>
         </w:tc>
@@ -2893,7 +2884,7 @@
               <w:rPr>
                 <w:sz w:val="14"/>
               </w:rPr>
-              <w:t>39.37</w:t>
+              <w:t>23.96</w:t>
             </w:r>
           </w:p>
         </w:tc>
@@ -2906,7 +2897,7 @@
               <w:rPr>
                 <w:sz w:val="14"/>
               </w:rPr>
-              <w:t>38.00</w:t>
+              <w:t>20.00</w:t>
             </w:r>
           </w:p>
         </w:tc>
@@ -2919,7 +2910,7 @@
               <w:rPr>
                 <w:sz w:val="14"/>
               </w:rPr>
-              <w:t>0.304</w:t>
+              <w:t>0.269</w:t>
             </w:r>
           </w:p>
         </w:tc>
@@ -2932,7 +2923,7 @@
               <w:rPr>
                 <w:sz w:val="14"/>
               </w:rPr>
-              <w:t>5.573</w:t>
+              <w:t>0.846</w:t>
             </w:r>
           </w:p>
         </w:tc>
@@ -2973,7 +2964,7 @@
               <w:rPr>
                 <w:sz w:val="14"/>
               </w:rPr>
-              <w:t>41.01</w:t>
+              <w:t>27.96</w:t>
             </w:r>
           </w:p>
         </w:tc>
@@ -2986,7 +2977,7 @@
               <w:rPr>
                 <w:sz w:val="14"/>
               </w:rPr>
-              <w:t>43.00</w:t>
+              <w:t>32.00</w:t>
             </w:r>
           </w:p>
         </w:tc>
@@ -2999,7 +2990,7 @@
               <w:rPr>
                 <w:sz w:val="14"/>
               </w:rPr>
-              <w:t>0.324</w:t>
+              <w:t>0.291</w:t>
             </w:r>
           </w:p>
         </w:tc>
@@ -3012,7 +3003,7 @@
               <w:rPr>
                 <w:sz w:val="14"/>
               </w:rPr>
-              <w:t>6.671</w:t>
+              <w:t>0.981</w:t>
             </w:r>
           </w:p>
         </w:tc>
@@ -3025,7 +3016,7 @@
               <w:rPr>
                 <w:sz w:val="14"/>
               </w:rPr>
-              <w:t>aged_coated_metal</w:t>
+              <w:t>smooth_metal</w:t>
             </w:r>
           </w:p>
         </w:tc>
@@ -3053,7 +3044,7 @@
               <w:rPr>
                 <w:sz w:val="14"/>
               </w:rPr>
-              <w:t>42.64</w:t>
+              <w:t>31.96</w:t>
             </w:r>
           </w:p>
         </w:tc>
@@ -3066,7 +3057,7 @@
               <w:rPr>
                 <w:sz w:val="14"/>
               </w:rPr>
-              <w:t>43.00</w:t>
+              <w:t>32.00</w:t>
             </w:r>
           </w:p>
         </w:tc>
@@ -3079,7 +3070,7 @@
               <w:rPr>
                 <w:sz w:val="14"/>
               </w:rPr>
-              <w:t>0.345</w:t>
+              <w:t>0.313</w:t>
             </w:r>
           </w:p>
         </w:tc>
@@ -3092,7 +3083,7 @@
               <w:rPr>
                 <w:sz w:val="14"/>
               </w:rPr>
-              <w:t>7.768</w:t>
+              <w:t>1.117</w:t>
             </w:r>
           </w:p>
         </w:tc>
@@ -3105,7 +3096,7 @@
               <w:rPr>
                 <w:sz w:val="14"/>
               </w:rPr>
-              <w:t>aged_coated_metal</w:t>
+              <w:t>smooth_metal</w:t>
             </w:r>
           </w:p>
         </w:tc>
@@ -3133,7 +3124,7 @@
               <w:rPr>
                 <w:sz w:val="14"/>
               </w:rPr>
-              <w:t>44.27</w:t>
+              <w:t>35.96</w:t>
             </w:r>
           </w:p>
         </w:tc>
@@ -3146,7 +3137,7 @@
               <w:rPr>
                 <w:sz w:val="14"/>
               </w:rPr>
-              <w:t>43.00</w:t>
+              <w:t>32.00</w:t>
             </w:r>
           </w:p>
         </w:tc>
@@ -3159,7 +3150,7 @@
               <w:rPr>
                 <w:sz w:val="14"/>
               </w:rPr>
-              <w:t>0.366</w:t>
+              <w:t>0.336</w:t>
             </w:r>
           </w:p>
         </w:tc>
@@ -3172,7 +3163,7 @@
               <w:rPr>
                 <w:sz w:val="14"/>
               </w:rPr>
-              <w:t>8.866</w:t>
+              <w:t>1.252</w:t>
             </w:r>
           </w:p>
         </w:tc>
@@ -3185,7 +3176,7 @@
               <w:rPr>
                 <w:sz w:val="14"/>
               </w:rPr>
-              <w:t>aged_coated_metal</w:t>
+              <w:t>smooth_metal</w:t>
             </w:r>
           </w:p>
         </w:tc>
@@ -3427,7 +3418,7 @@
               <w:rPr>
                 <w:sz w:val="14"/>
               </w:rPr>
-              <w:t>3210.6</w:t>
+              <w:t>4547.4</w:t>
             </w:r>
           </w:p>
         </w:tc>
@@ -3440,7 +3431,7 @@
               <w:rPr>
                 <w:sz w:val="14"/>
               </w:rPr>
-              <w:t>40.00</w:t>
+              <w:t>12.28</w:t>
             </w:r>
           </w:p>
         </w:tc>
@@ -3453,7 +3444,7 @@
               <w:rPr>
                 <w:sz w:val="14"/>
               </w:rPr>
-              <w:t>0.013</w:t>
+              <w:t>0.007</w:t>
             </w:r>
           </w:p>
         </w:tc>
@@ -3466,7 +3457,7 @@
               <w:rPr>
                 <w:sz w:val="14"/>
               </w:rPr>
-              <w:t>137.7</w:t>
+              <w:t>248.0</w:t>
             </w:r>
           </w:p>
         </w:tc>
@@ -3572,7 +3563,7 @@
               <w:rPr>
                 <w:sz w:val="14"/>
               </w:rPr>
-              <w:t>3222.3</w:t>
+              <w:t>78.28</w:t>
             </w:r>
           </w:p>
         </w:tc>
@@ -3585,7 +3576,7 @@
               <w:rPr>
                 <w:sz w:val="14"/>
               </w:rPr>
-              <w:t>44.41</w:t>
+              <w:t>78.28</w:t>
             </w:r>
           </w:p>
         </w:tc>
@@ -3598,7 +3589,7 @@
               <w:rPr>
                 <w:sz w:val="14"/>
               </w:rPr>
-              <w:t>0.018</w:t>
+              <w:t>0.017</w:t>
             </w:r>
           </w:p>
         </w:tc>
@@ -3637,7 +3628,7 @@
               <w:rPr>
                 <w:sz w:val="14"/>
               </w:rPr>
-              <w:t>3</w:t>
+              <w:t>0</w:t>
             </w:r>
           </w:p>
         </w:tc>
@@ -3650,7 +3641,7 @@
               <w:rPr>
                 <w:sz w:val="14"/>
               </w:rPr>
-              <w:t>11.68</w:t>
+              <w:t>-4469.1</w:t>
             </w:r>
           </w:p>
         </w:tc>
@@ -3663,7 +3654,7 @@
               <w:rPr>
                 <w:sz w:val="14"/>
               </w:rPr>
-              <w:t>0.364</w:t>
+              <w:t>-98.28</w:t>
             </w:r>
           </w:p>
         </w:tc>
@@ -3676,7 +3667,7 @@
               <w:rPr>
                 <w:sz w:val="14"/>
               </w:rPr>
-              <w:t>4.412</w:t>
+              <w:t>66.00</w:t>
             </w:r>
           </w:p>
         </w:tc>
@@ -3689,7 +3680,7 @@
               <w:rPr>
                 <w:sz w:val="14"/>
               </w:rPr>
-              <w:t>11.03</w:t>
+              <w:t>537.5</w:t>
             </w:r>
           </w:p>
         </w:tc>
@@ -3857,7 +3848,7 @@
               <w:rPr>
                 <w:sz w:val="14"/>
               </w:rPr>
-              <w:t>80.00</w:t>
+              <w:t>40.00</w:t>
             </w:r>
           </w:p>
         </w:tc>
@@ -3870,7 +3861,7 @@
               <w:rPr>
                 <w:sz w:val="14"/>
               </w:rPr>
-              <w:t>80.00</w:t>
+              <w:t>40.00</w:t>
             </w:r>
           </w:p>
         </w:tc>
@@ -3937,7 +3928,7 @@
               <w:rPr>
                 <w:sz w:val="14"/>
               </w:rPr>
-              <w:t>80.00</w:t>
+              <w:t>40.00</w:t>
             </w:r>
           </w:p>
         </w:tc>
@@ -3950,7 +3941,7 @@
               <w:rPr>
                 <w:sz w:val="14"/>
               </w:rPr>
-              <w:t>80.00</w:t>
+              <w:t>40.00</w:t>
             </w:r>
           </w:p>
         </w:tc>
@@ -4017,7 +4008,7 @@
               <w:rPr>
                 <w:sz w:val="14"/>
               </w:rPr>
-              <w:t>80.00</w:t>
+              <w:t>40.00</w:t>
             </w:r>
           </w:p>
         </w:tc>
@@ -4030,7 +4021,7 @@
               <w:rPr>
                 <w:sz w:val="14"/>
               </w:rPr>
-              <w:t>80.00</w:t>
+              <w:t>40.00</w:t>
             </w:r>
           </w:p>
         </w:tc>
@@ -4210,7 +4201,7 @@
               <w:rPr>
                 <w:sz w:val="14"/>
               </w:rPr>
-              <w:t>80.00</w:t>
+              <w:t>40.00</w:t>
             </w:r>
           </w:p>
         </w:tc>
@@ -4223,7 +4214,7 @@
               <w:rPr>
                 <w:sz w:val="14"/>
               </w:rPr>
-              <w:t>80.00</w:t>
+              <w:t>40.00</w:t>
             </w:r>
           </w:p>
         </w:tc>
@@ -4528,7 +4519,7 @@
               <w:rPr>
                 <w:sz w:val="14"/>
               </w:rPr>
-              <w:t>159.7</w:t>
+              <w:t>152.4</w:t>
             </w:r>
           </w:p>
         </w:tc>
@@ -4541,7 +4532,7 @@
               <w:rPr>
                 <w:sz w:val="14"/>
               </w:rPr>
-              <w:t>122.4</w:t>
+              <w:t>123.1</w:t>
             </w:r>
           </w:p>
         </w:tc>
@@ -4554,7 +4545,7 @@
               <w:rPr>
                 <w:sz w:val="14"/>
               </w:rPr>
-              <w:t>2.682</w:t>
+              <w:t>2.089</w:t>
             </w:r>
           </w:p>
         </w:tc>
@@ -4567,7 +4558,7 @@
               <w:rPr>
                 <w:sz w:val="14"/>
               </w:rPr>
-              <w:t>23</w:t>
+              <w:t>17</w:t>
             </w:r>
           </w:p>
         </w:tc>
@@ -4634,7 +4625,7 @@
               <w:rPr>
                 <w:sz w:val="14"/>
               </w:rPr>
-              <w:t>170.5</w:t>
+              <w:t>155.1</w:t>
             </w:r>
           </w:p>
         </w:tc>
@@ -4647,7 +4638,7 @@
               <w:rPr>
                 <w:sz w:val="14"/>
               </w:rPr>
-              <w:t>111.6</w:t>
+              <w:t>115.3</w:t>
             </w:r>
           </w:p>
         </w:tc>
@@ -4660,7 +4651,7 @@
               <w:rPr>
                 <w:sz w:val="14"/>
               </w:rPr>
-              <w:t>1.583</w:t>
+              <w:t>2.089</w:t>
             </w:r>
           </w:p>
         </w:tc>
@@ -4673,7 +4664,7 @@
               <w:rPr>
                 <w:sz w:val="14"/>
               </w:rPr>
-              <w:t>15</w:t>
+              <w:t>16</w:t>
             </w:r>
           </w:p>
         </w:tc>
@@ -4766,7 +4757,7 @@
               <w:rPr>
                 <w:sz w:val="14"/>
               </w:rPr>
-              <w:t>4.944</w:t>
+              <w:t>5.119</w:t>
             </w:r>
           </w:p>
         </w:tc>
@@ -4779,7 +4770,7 @@
               <w:rPr>
                 <w:sz w:val="14"/>
               </w:rPr>
-              <w:t>17</w:t>
+              <w:t>18</w:t>
             </w:r>
           </w:p>
         </w:tc>
@@ -4846,7 +4837,7 @@
               <w:rPr>
                 <w:sz w:val="14"/>
               </w:rPr>
-              <w:t>80.00</w:t>
+              <w:t>40.00</w:t>
             </w:r>
           </w:p>
         </w:tc>
@@ -4859,7 +4850,7 @@
               <w:rPr>
                 <w:sz w:val="14"/>
               </w:rPr>
-              <w:t>80.00</w:t>
+              <w:t>40.00</w:t>
             </w:r>
           </w:p>
         </w:tc>
@@ -4898,7 +4889,7 @@
               <w:rPr>
                 <w:sz w:val="14"/>
               </w:rPr>
-              <w:t>11</w:t>
+              <w:t>3</w:t>
             </w:r>
           </w:p>
         </w:tc>
@@ -4952,7 +4943,7 @@
               <w:rPr>
                 <w:sz w:val="14"/>
               </w:rPr>
-              <w:t>80.00</w:t>
+              <w:t>6417.0</w:t>
             </w:r>
           </w:p>
         </w:tc>
@@ -4965,7 +4956,7 @@
               <w:rPr>
                 <w:sz w:val="14"/>
               </w:rPr>
-              <w:t>80.00</w:t>
+              <w:t>0.000</w:t>
             </w:r>
           </w:p>
         </w:tc>
@@ -5004,7 +4995,7 @@
               <w:rPr>
                 <w:sz w:val="14"/>
               </w:rPr>
-              <w:t>5</w:t>
+              <w:t>6</w:t>
             </w:r>
           </w:p>
         </w:tc>
@@ -5097,6 +5088,19 @@
               <w:rPr>
                 <w:sz w:val="14"/>
               </w:rPr>
+              <w:t>1</w:t>
+            </w:r>
+          </w:p>
+        </w:tc>
+        <w:tc>
+          <w:tcPr>
+            <w:tcW w:type="dxa" w:w="1170"/>
+          </w:tcPr>
+          <w:p>
+            <w:r>
+              <w:rPr>
+                <w:sz w:val="14"/>
+              </w:rPr>
               <w:t>6</w:t>
             </w:r>
           </w:p>
@@ -5110,20 +5114,7 @@
               <w:rPr>
                 <w:sz w:val="14"/>
               </w:rPr>
-              <w:t>1</w:t>
-            </w:r>
-          </w:p>
-        </w:tc>
-        <w:tc>
-          <w:tcPr>
-            <w:tcW w:type="dxa" w:w="1170"/>
-          </w:tcPr>
-          <w:p>
-            <w:r>
-              <w:rPr>
-                <w:sz w:val="14"/>
-              </w:rPr>
-              <w:t>False</w:t>
+              <w:t>True</w:t>
             </w:r>
           </w:p>
         </w:tc>
@@ -5164,7 +5155,7 @@
               <w:rPr>
                 <w:sz w:val="14"/>
               </w:rPr>
-              <w:t>80.00</w:t>
+              <w:t>40.00</w:t>
             </w:r>
           </w:p>
         </w:tc>
@@ -5177,7 +5168,7 @@
               <w:rPr>
                 <w:sz w:val="14"/>
               </w:rPr>
-              <w:t>80.00</w:t>
+              <w:t>40.00</w:t>
             </w:r>
           </w:p>
         </w:tc>
@@ -5190,7 +5181,7 @@
               <w:rPr>
                 <w:sz w:val="14"/>
               </w:rPr>
-              <w:t>1.012</w:t>
+              <w:t>2.008</w:t>
             </w:r>
           </w:p>
         </w:tc>
@@ -5203,7 +5194,7 @@
               <w:rPr>
                 <w:sz w:val="14"/>
               </w:rPr>
-              <w:t>15</w:t>
+              <w:t>23</w:t>
             </w:r>
           </w:p>
         </w:tc>
@@ -5270,7 +5261,7 @@
               <w:rPr>
                 <w:sz w:val="14"/>
               </w:rPr>
-              <w:t>80.00</w:t>
+              <w:t>40.00</w:t>
             </w:r>
           </w:p>
         </w:tc>
@@ -5283,7 +5274,7 @@
               <w:rPr>
                 <w:sz w:val="14"/>
               </w:rPr>
-              <w:t>80.00</w:t>
+              <w:t>40.00</w:t>
             </w:r>
           </w:p>
         </w:tc>
@@ -5296,7 +5287,7 @@
               <w:rPr>
                 <w:sz w:val="14"/>
               </w:rPr>
-              <w:t>1.243</w:t>
+              <w:t>1.976</w:t>
             </w:r>
           </w:p>
         </w:tc>
@@ -5309,7 +5300,7 @@
               <w:rPr>
                 <w:sz w:val="14"/>
               </w:rPr>
-              <w:t>16</w:t>
+              <w:t>22</w:t>
             </w:r>
           </w:p>
         </w:tc>
@@ -5402,7 +5393,7 @@
               <w:rPr>
                 <w:sz w:val="14"/>
               </w:rPr>
-              <w:t>1.794</w:t>
+              <w:t>3.819</w:t>
             </w:r>
           </w:p>
         </w:tc>
@@ -5415,7 +5406,7 @@
               <w:rPr>
                 <w:sz w:val="14"/>
               </w:rPr>
-              <w:t>17</w:t>
+              <w:t>18</w:t>
             </w:r>
           </w:p>
         </w:tc>
@@ -5604,7 +5595,7 @@
               <w:rPr>
                 <w:sz w:val="14"/>
               </w:rPr>
-              <w:t>80.00</w:t>
+              <w:t>40.00</w:t>
             </w:r>
           </w:p>
         </w:tc>
@@ -5617,7 +5608,7 @@
               <w:rPr>
                 <w:sz w:val="14"/>
               </w:rPr>
-              <w:t>80.00</w:t>
+              <w:t>40.00</w:t>
             </w:r>
           </w:p>
         </w:tc>
@@ -5643,7 +5634,7 @@
               <w:rPr>
                 <w:sz w:val="14"/>
               </w:rPr>
-              <w:t>0.654</w:t>
+              <w:t>0.325</w:t>
             </w:r>
           </w:p>
         </w:tc>
@@ -5684,7 +5675,7 @@
               <w:rPr>
                 <w:sz w:val="14"/>
               </w:rPr>
-              <w:t>80.00</w:t>
+              <w:t>40.00</w:t>
             </w:r>
           </w:p>
         </w:tc>
@@ -5697,7 +5688,7 @@
               <w:rPr>
                 <w:sz w:val="14"/>
               </w:rPr>
-              <w:t>80.00</w:t>
+              <w:t>40.00</w:t>
             </w:r>
           </w:p>
         </w:tc>
@@ -5723,7 +5714,7 @@
               <w:rPr>
                 <w:sz w:val="14"/>
               </w:rPr>
-              <w:t>0.654</w:t>
+              <w:t>0.325</w:t>
             </w:r>
           </w:p>
         </w:tc>
@@ -5764,7 +5755,7 @@
               <w:rPr>
                 <w:sz w:val="14"/>
               </w:rPr>
-              <w:t>80.00</w:t>
+              <w:t>40.00</w:t>
             </w:r>
           </w:p>
         </w:tc>
@@ -5777,7 +5768,7 @@
               <w:rPr>
                 <w:sz w:val="14"/>
               </w:rPr>
-              <w:t>80.00</w:t>
+              <w:t>40.00</w:t>
             </w:r>
           </w:p>
         </w:tc>
@@ -5803,7 +5794,7 @@
               <w:rPr>
                 <w:sz w:val="14"/>
               </w:rPr>
-              <w:t>0.654</w:t>
+              <w:t>0.325</w:t>
             </w:r>
           </w:p>
         </w:tc>
@@ -5998,85 +5989,85 @@
               <w:rPr>
                 <w:sz w:val="14"/>
               </w:rPr>
-              <w:t>80.00</w:t>
-            </w:r>
-          </w:p>
-        </w:tc>
-        <w:tc>
-          <w:tcPr>
-            <w:tcW w:type="dxa" w:w="1040"/>
-          </w:tcPr>
-          <w:p>
-            <w:r>
-              <w:rPr>
-                <w:sz w:val="14"/>
-              </w:rPr>
-              <w:t>80.00</w:t>
-            </w:r>
-          </w:p>
-        </w:tc>
-        <w:tc>
-          <w:tcPr>
-            <w:tcW w:type="dxa" w:w="1040"/>
-          </w:tcPr>
-          <w:p>
-            <w:r>
-              <w:rPr>
-                <w:sz w:val="14"/>
-              </w:rPr>
-              <w:t>3010.1</w:t>
-            </w:r>
-          </w:p>
-        </w:tc>
-        <w:tc>
-          <w:tcPr>
-            <w:tcW w:type="dxa" w:w="1040"/>
-          </w:tcPr>
-          <w:p>
-            <w:r>
-              <w:rPr>
-                <w:sz w:val="14"/>
-              </w:rPr>
-              <w:t>1012.6</w:t>
-            </w:r>
-          </w:p>
-        </w:tc>
-        <w:tc>
-          <w:tcPr>
-            <w:tcW w:type="dxa" w:w="1040"/>
-          </w:tcPr>
-          <w:p>
-            <w:r>
-              <w:rPr>
-                <w:sz w:val="14"/>
-              </w:rPr>
-              <w:t>0.116</w:t>
-            </w:r>
-          </w:p>
-        </w:tc>
-        <w:tc>
-          <w:tcPr>
-            <w:tcW w:type="dxa" w:w="1040"/>
-          </w:tcPr>
-          <w:p>
-            <w:r>
-              <w:rPr>
-                <w:sz w:val="14"/>
-              </w:rPr>
-              <w:t>False</w:t>
-            </w:r>
-          </w:p>
-        </w:tc>
-        <w:tc>
-          <w:tcPr>
-            <w:tcW w:type="dxa" w:w="1040"/>
-          </w:tcPr>
-          <w:p>
-            <w:r>
-              <w:rPr>
-                <w:sz w:val="14"/>
-              </w:rPr>
-              <w:t>False</w:t>
+              <w:t>40.00</w:t>
+            </w:r>
+          </w:p>
+        </w:tc>
+        <w:tc>
+          <w:tcPr>
+            <w:tcW w:type="dxa" w:w="1040"/>
+          </w:tcPr>
+          <w:p>
+            <w:r>
+              <w:rPr>
+                <w:sz w:val="14"/>
+              </w:rPr>
+              <w:t>40.00</w:t>
+            </w:r>
+          </w:p>
+        </w:tc>
+        <w:tc>
+          <w:tcPr>
+            <w:tcW w:type="dxa" w:w="1040"/>
+          </w:tcPr>
+          <w:p>
+            <w:r>
+              <w:rPr>
+                <w:sz w:val="14"/>
+              </w:rPr>
+              <w:t>51.89</w:t>
+            </w:r>
+          </w:p>
+        </w:tc>
+        <w:tc>
+          <w:tcPr>
+            <w:tcW w:type="dxa" w:w="1040"/>
+          </w:tcPr>
+          <w:p>
+            <w:r>
+              <w:rPr>
+                <w:sz w:val="14"/>
+              </w:rPr>
+              <w:t>51.89</w:t>
+            </w:r>
+          </w:p>
+        </w:tc>
+        <w:tc>
+          <w:tcPr>
+            <w:tcW w:type="dxa" w:w="1040"/>
+          </w:tcPr>
+          <w:p>
+            <w:r>
+              <w:rPr>
+                <w:sz w:val="14"/>
+              </w:rPr>
+              <w:t>0.000</w:t>
+            </w:r>
+          </w:p>
+        </w:tc>
+        <w:tc>
+          <w:tcPr>
+            <w:tcW w:type="dxa" w:w="1040"/>
+          </w:tcPr>
+          <w:p>
+            <w:r>
+              <w:rPr>
+                <w:sz w:val="14"/>
+              </w:rPr>
+              <w:t>True</w:t>
+            </w:r>
+          </w:p>
+        </w:tc>
+        <w:tc>
+          <w:tcPr>
+            <w:tcW w:type="dxa" w:w="1040"/>
+          </w:tcPr>
+          <w:p>
+            <w:r>
+              <w:rPr>
+                <w:sz w:val="14"/>
+              </w:rPr>
+              <w:t>True</w:t>
             </w:r>
           </w:p>
         </w:tc>
@@ -6117,59 +6108,59 @@
               <w:rPr>
                 <w:sz w:val="14"/>
               </w:rPr>
-              <w:t>80.00</w:t>
-            </w:r>
-          </w:p>
-        </w:tc>
-        <w:tc>
-          <w:tcPr>
-            <w:tcW w:type="dxa" w:w="1040"/>
-          </w:tcPr>
-          <w:p>
-            <w:r>
-              <w:rPr>
-                <w:sz w:val="14"/>
-              </w:rPr>
-              <w:t>80.00</w:t>
-            </w:r>
-          </w:p>
-        </w:tc>
-        <w:tc>
-          <w:tcPr>
-            <w:tcW w:type="dxa" w:w="1040"/>
-          </w:tcPr>
-          <w:p>
-            <w:r>
-              <w:rPr>
-                <w:sz w:val="14"/>
-              </w:rPr>
-              <w:t>2909.3</w:t>
-            </w:r>
-          </w:p>
-        </w:tc>
-        <w:tc>
-          <w:tcPr>
-            <w:tcW w:type="dxa" w:w="1040"/>
-          </w:tcPr>
-          <w:p>
-            <w:r>
-              <w:rPr>
-                <w:sz w:val="14"/>
-              </w:rPr>
-              <w:t>1013.8</w:t>
-            </w:r>
-          </w:p>
-        </w:tc>
-        <w:tc>
-          <w:tcPr>
-            <w:tcW w:type="dxa" w:w="1040"/>
-          </w:tcPr>
-          <w:p>
-            <w:r>
-              <w:rPr>
-                <w:sz w:val="14"/>
-              </w:rPr>
-              <w:t>0.112</w:t>
+              <w:t>40.00</w:t>
+            </w:r>
+          </w:p>
+        </w:tc>
+        <w:tc>
+          <w:tcPr>
+            <w:tcW w:type="dxa" w:w="1040"/>
+          </w:tcPr>
+          <w:p>
+            <w:r>
+              <w:rPr>
+                <w:sz w:val="14"/>
+              </w:rPr>
+              <w:t>40.00</w:t>
+            </w:r>
+          </w:p>
+        </w:tc>
+        <w:tc>
+          <w:tcPr>
+            <w:tcW w:type="dxa" w:w="1040"/>
+          </w:tcPr>
+          <w:p>
+            <w:r>
+              <w:rPr>
+                <w:sz w:val="14"/>
+              </w:rPr>
+              <w:t>53.23</w:t>
+            </w:r>
+          </w:p>
+        </w:tc>
+        <w:tc>
+          <w:tcPr>
+            <w:tcW w:type="dxa" w:w="1040"/>
+          </w:tcPr>
+          <w:p>
+            <w:r>
+              <w:rPr>
+                <w:sz w:val="14"/>
+              </w:rPr>
+              <w:t>53.23</w:t>
+            </w:r>
+          </w:p>
+        </w:tc>
+        <w:tc>
+          <w:tcPr>
+            <w:tcW w:type="dxa" w:w="1040"/>
+          </w:tcPr>
+          <w:p>
+            <w:r>
+              <w:rPr>
+                <w:sz w:val="14"/>
+              </w:rPr>
+              <w:t>0.000</w:t>
             </w:r>
           </w:p>
         </w:tc>
@@ -6236,46 +6227,46 @@
               <w:rPr>
                 <w:sz w:val="14"/>
               </w:rPr>
-              <w:t>80.00</w:t>
-            </w:r>
-          </w:p>
-        </w:tc>
-        <w:tc>
-          <w:tcPr>
-            <w:tcW w:type="dxa" w:w="1040"/>
-          </w:tcPr>
-          <w:p>
-            <w:r>
-              <w:rPr>
-                <w:sz w:val="14"/>
-              </w:rPr>
-              <w:t>80.00</w:t>
-            </w:r>
-          </w:p>
-        </w:tc>
-        <w:tc>
-          <w:tcPr>
-            <w:tcW w:type="dxa" w:w="1040"/>
-          </w:tcPr>
-          <w:p>
-            <w:r>
-              <w:rPr>
-                <w:sz w:val="14"/>
-              </w:rPr>
-              <w:t>103.8</w:t>
-            </w:r>
-          </w:p>
-        </w:tc>
-        <w:tc>
-          <w:tcPr>
-            <w:tcW w:type="dxa" w:w="1040"/>
-          </w:tcPr>
-          <w:p>
-            <w:r>
-              <w:rPr>
-                <w:sz w:val="14"/>
-              </w:rPr>
-              <w:t>103.8</w:t>
+              <w:t>40.00</w:t>
+            </w:r>
+          </w:p>
+        </w:tc>
+        <w:tc>
+          <w:tcPr>
+            <w:tcW w:type="dxa" w:w="1040"/>
+          </w:tcPr>
+          <w:p>
+            <w:r>
+              <w:rPr>
+                <w:sz w:val="14"/>
+              </w:rPr>
+              <w:t>40.00</w:t>
+            </w:r>
+          </w:p>
+        </w:tc>
+        <w:tc>
+          <w:tcPr>
+            <w:tcW w:type="dxa" w:w="1040"/>
+          </w:tcPr>
+          <w:p>
+            <w:r>
+              <w:rPr>
+                <w:sz w:val="14"/>
+              </w:rPr>
+              <w:t>53.05</w:t>
+            </w:r>
+          </w:p>
+        </w:tc>
+        <w:tc>
+          <w:tcPr>
+            <w:tcW w:type="dxa" w:w="1040"/>
+          </w:tcPr>
+          <w:p>
+            <w:r>
+              <w:rPr>
+                <w:sz w:val="14"/>
+              </w:rPr>
+              <w:t>53.05</w:t>
             </w:r>
           </w:p>
         </w:tc>
@@ -6301,20 +6292,20 @@
               <w:rPr>
                 <w:sz w:val="14"/>
               </w:rPr>
-              <w:t>True</w:t>
-            </w:r>
-          </w:p>
-        </w:tc>
-        <w:tc>
-          <w:tcPr>
-            <w:tcW w:type="dxa" w:w="1040"/>
-          </w:tcPr>
-          <w:p>
-            <w:r>
-              <w:rPr>
-                <w:sz w:val="14"/>
-              </w:rPr>
-              <w:t>True</w:t>
+              <w:t>False</w:t>
+            </w:r>
+          </w:p>
+        </w:tc>
+        <w:tc>
+          <w:tcPr>
+            <w:tcW w:type="dxa" w:w="1040"/>
+          </w:tcPr>
+          <w:p>
+            <w:r>
+              <w:rPr>
+                <w:sz w:val="14"/>
+              </w:rPr>
+              <w:t>False</w:t>
             </w:r>
           </w:p>
         </w:tc>
@@ -6355,59 +6346,59 @@
               <w:rPr>
                 <w:sz w:val="14"/>
               </w:rPr>
-              <w:t>80.00</w:t>
-            </w:r>
-          </w:p>
-        </w:tc>
-        <w:tc>
-          <w:tcPr>
-            <w:tcW w:type="dxa" w:w="1040"/>
-          </w:tcPr>
-          <w:p>
-            <w:r>
-              <w:rPr>
-                <w:sz w:val="14"/>
-              </w:rPr>
-              <w:t>80.00</w:t>
-            </w:r>
-          </w:p>
-        </w:tc>
-        <w:tc>
-          <w:tcPr>
-            <w:tcW w:type="dxa" w:w="1040"/>
-          </w:tcPr>
-          <w:p>
-            <w:r>
-              <w:rPr>
-                <w:sz w:val="14"/>
-              </w:rPr>
-              <w:t>104.4</w:t>
-            </w:r>
-          </w:p>
-        </w:tc>
-        <w:tc>
-          <w:tcPr>
-            <w:tcW w:type="dxa" w:w="1040"/>
-          </w:tcPr>
-          <w:p>
-            <w:r>
-              <w:rPr>
-                <w:sz w:val="14"/>
-              </w:rPr>
-              <w:t>103.8</w:t>
-            </w:r>
-          </w:p>
-        </w:tc>
-        <w:tc>
-          <w:tcPr>
-            <w:tcW w:type="dxa" w:w="1040"/>
-          </w:tcPr>
-          <w:p>
-            <w:r>
-              <w:rPr>
-                <w:sz w:val="14"/>
-              </w:rPr>
-              <w:t>0.000</w:t>
+              <w:t>40.00</w:t>
+            </w:r>
+          </w:p>
+        </w:tc>
+        <w:tc>
+          <w:tcPr>
+            <w:tcW w:type="dxa" w:w="1040"/>
+          </w:tcPr>
+          <w:p>
+            <w:r>
+              <w:rPr>
+                <w:sz w:val="14"/>
+              </w:rPr>
+              <w:t>40.00</w:t>
+            </w:r>
+          </w:p>
+        </w:tc>
+        <w:tc>
+          <w:tcPr>
+            <w:tcW w:type="dxa" w:w="1040"/>
+          </w:tcPr>
+          <w:p>
+            <w:r>
+              <w:rPr>
+                <w:sz w:val="14"/>
+              </w:rPr>
+              <w:t>5816.7</w:t>
+            </w:r>
+          </w:p>
+        </w:tc>
+        <w:tc>
+          <w:tcPr>
+            <w:tcW w:type="dxa" w:w="1040"/>
+          </w:tcPr>
+          <w:p>
+            <w:r>
+              <w:rPr>
+                <w:sz w:val="14"/>
+              </w:rPr>
+              <w:t>2726.6</w:t>
+            </w:r>
+          </w:p>
+        </w:tc>
+        <w:tc>
+          <w:tcPr>
+            <w:tcW w:type="dxa" w:w="1040"/>
+          </w:tcPr>
+          <w:p>
+            <w:r>
+              <w:rPr>
+                <w:sz w:val="14"/>
+              </w:rPr>
+              <w:t>0.216</w:t>
             </w:r>
           </w:p>
         </w:tc>
@@ -6474,46 +6465,46 @@
               <w:rPr>
                 <w:sz w:val="14"/>
               </w:rPr>
-              <w:t>80.00</w:t>
-            </w:r>
-          </w:p>
-        </w:tc>
-        <w:tc>
-          <w:tcPr>
-            <w:tcW w:type="dxa" w:w="1040"/>
-          </w:tcPr>
-          <w:p>
-            <w:r>
-              <w:rPr>
-                <w:sz w:val="14"/>
-              </w:rPr>
-              <w:t>80.00</w:t>
-            </w:r>
-          </w:p>
-        </w:tc>
-        <w:tc>
-          <w:tcPr>
-            <w:tcW w:type="dxa" w:w="1040"/>
-          </w:tcPr>
-          <w:p>
-            <w:r>
-              <w:rPr>
-                <w:sz w:val="14"/>
-              </w:rPr>
-              <w:t>103.8</w:t>
-            </w:r>
-          </w:p>
-        </w:tc>
-        <w:tc>
-          <w:tcPr>
-            <w:tcW w:type="dxa" w:w="1040"/>
-          </w:tcPr>
-          <w:p>
-            <w:r>
-              <w:rPr>
-                <w:sz w:val="14"/>
-              </w:rPr>
-              <w:t>103.8</w:t>
+              <w:t>40.00</w:t>
+            </w:r>
+          </w:p>
+        </w:tc>
+        <w:tc>
+          <w:tcPr>
+            <w:tcW w:type="dxa" w:w="1040"/>
+          </w:tcPr>
+          <w:p>
+            <w:r>
+              <w:rPr>
+                <w:sz w:val="14"/>
+              </w:rPr>
+              <w:t>40.00</w:t>
+            </w:r>
+          </w:p>
+        </w:tc>
+        <w:tc>
+          <w:tcPr>
+            <w:tcW w:type="dxa" w:w="1040"/>
+          </w:tcPr>
+          <w:p>
+            <w:r>
+              <w:rPr>
+                <w:sz w:val="14"/>
+              </w:rPr>
+              <w:t>51.89</w:t>
+            </w:r>
+          </w:p>
+        </w:tc>
+        <w:tc>
+          <w:tcPr>
+            <w:tcW w:type="dxa" w:w="1040"/>
+          </w:tcPr>
+          <w:p>
+            <w:r>
+              <w:rPr>
+                <w:sz w:val="14"/>
+              </w:rPr>
+              <w:t>51.89</w:t>
             </w:r>
           </w:p>
         </w:tc>
@@ -6593,46 +6584,46 @@
               <w:rPr>
                 <w:sz w:val="14"/>
               </w:rPr>
-              <w:t>80.00</w:t>
-            </w:r>
-          </w:p>
-        </w:tc>
-        <w:tc>
-          <w:tcPr>
-            <w:tcW w:type="dxa" w:w="1040"/>
-          </w:tcPr>
-          <w:p>
-            <w:r>
-              <w:rPr>
-                <w:sz w:val="14"/>
-              </w:rPr>
-              <w:t>80.00</w:t>
-            </w:r>
-          </w:p>
-        </w:tc>
-        <w:tc>
-          <w:tcPr>
-            <w:tcW w:type="dxa" w:w="1040"/>
-          </w:tcPr>
-          <w:p>
-            <w:r>
-              <w:rPr>
-                <w:sz w:val="14"/>
-              </w:rPr>
-              <w:t>103.8</w:t>
-            </w:r>
-          </w:p>
-        </w:tc>
-        <w:tc>
-          <w:tcPr>
-            <w:tcW w:type="dxa" w:w="1040"/>
-          </w:tcPr>
-          <w:p>
-            <w:r>
-              <w:rPr>
-                <w:sz w:val="14"/>
-              </w:rPr>
-              <w:t>103.8</w:t>
+              <w:t>40.00</w:t>
+            </w:r>
+          </w:p>
+        </w:tc>
+        <w:tc>
+          <w:tcPr>
+            <w:tcW w:type="dxa" w:w="1040"/>
+          </w:tcPr>
+          <w:p>
+            <w:r>
+              <w:rPr>
+                <w:sz w:val="14"/>
+              </w:rPr>
+              <w:t>40.00</w:t>
+            </w:r>
+          </w:p>
+        </w:tc>
+        <w:tc>
+          <w:tcPr>
+            <w:tcW w:type="dxa" w:w="1040"/>
+          </w:tcPr>
+          <w:p>
+            <w:r>
+              <w:rPr>
+                <w:sz w:val="14"/>
+              </w:rPr>
+              <w:t>51.89</w:t>
+            </w:r>
+          </w:p>
+        </w:tc>
+        <w:tc>
+          <w:tcPr>
+            <w:tcW w:type="dxa" w:w="1040"/>
+          </w:tcPr>
+          <w:p>
+            <w:r>
+              <w:rPr>
+                <w:sz w:val="14"/>
+              </w:rPr>
+              <w:t>51.89</w:t>
             </w:r>
           </w:p>
         </w:tc>
@@ -6712,59 +6703,59 @@
               <w:rPr>
                 <w:sz w:val="14"/>
               </w:rPr>
-              <w:t>80.00</w:t>
-            </w:r>
-          </w:p>
-        </w:tc>
-        <w:tc>
-          <w:tcPr>
-            <w:tcW w:type="dxa" w:w="1040"/>
-          </w:tcPr>
-          <w:p>
-            <w:r>
-              <w:rPr>
-                <w:sz w:val="14"/>
-              </w:rPr>
-              <w:t>80.00</w:t>
-            </w:r>
-          </w:p>
-        </w:tc>
-        <w:tc>
-          <w:tcPr>
-            <w:tcW w:type="dxa" w:w="1040"/>
-          </w:tcPr>
-          <w:p>
-            <w:r>
-              <w:rPr>
-                <w:sz w:val="14"/>
-              </w:rPr>
-              <w:t>110.1</w:t>
-            </w:r>
-          </w:p>
-        </w:tc>
-        <w:tc>
-          <w:tcPr>
-            <w:tcW w:type="dxa" w:w="1040"/>
-          </w:tcPr>
-          <w:p>
-            <w:r>
-              <w:rPr>
-                <w:sz w:val="14"/>
-              </w:rPr>
-              <w:t>110.1</w:t>
-            </w:r>
-          </w:p>
-        </w:tc>
-        <w:tc>
-          <w:tcPr>
-            <w:tcW w:type="dxa" w:w="1040"/>
-          </w:tcPr>
-          <w:p>
-            <w:r>
-              <w:rPr>
-                <w:sz w:val="14"/>
-              </w:rPr>
-              <w:t>0.000</w:t>
+              <w:t>40.00</w:t>
+            </w:r>
+          </w:p>
+        </w:tc>
+        <w:tc>
+          <w:tcPr>
+            <w:tcW w:type="dxa" w:w="1040"/>
+          </w:tcPr>
+          <w:p>
+            <w:r>
+              <w:rPr>
+                <w:sz w:val="14"/>
+              </w:rPr>
+              <w:t>40.00</w:t>
+            </w:r>
+          </w:p>
+        </w:tc>
+        <w:tc>
+          <w:tcPr>
+            <w:tcW w:type="dxa" w:w="1040"/>
+          </w:tcPr>
+          <w:p>
+            <w:r>
+              <w:rPr>
+                <w:sz w:val="14"/>
+              </w:rPr>
+              <w:t>4723.9</w:t>
+            </w:r>
+          </w:p>
+        </w:tc>
+        <w:tc>
+          <w:tcPr>
+            <w:tcW w:type="dxa" w:w="1040"/>
+          </w:tcPr>
+          <w:p>
+            <w:r>
+              <w:rPr>
+                <w:sz w:val="14"/>
+              </w:rPr>
+              <w:t>1248.8</w:t>
+            </w:r>
+          </w:p>
+        </w:tc>
+        <w:tc>
+          <w:tcPr>
+            <w:tcW w:type="dxa" w:w="1040"/>
+          </w:tcPr>
+          <w:p>
+            <w:r>
+              <w:rPr>
+                <w:sz w:val="14"/>
+              </w:rPr>
+              <w:t>0.140</w:t>
             </w:r>
           </w:p>
         </w:tc>
@@ -6831,59 +6822,59 @@
               <w:rPr>
                 <w:sz w:val="14"/>
               </w:rPr>
-              <w:t>80.00</w:t>
-            </w:r>
-          </w:p>
-        </w:tc>
-        <w:tc>
-          <w:tcPr>
-            <w:tcW w:type="dxa" w:w="1040"/>
-          </w:tcPr>
-          <w:p>
-            <w:r>
-              <w:rPr>
-                <w:sz w:val="14"/>
-              </w:rPr>
-              <w:t>80.00</w:t>
-            </w:r>
-          </w:p>
-        </w:tc>
-        <w:tc>
-          <w:tcPr>
-            <w:tcW w:type="dxa" w:w="1040"/>
-          </w:tcPr>
-          <w:p>
-            <w:r>
-              <w:rPr>
-                <w:sz w:val="14"/>
-              </w:rPr>
-              <w:t>627.2</w:t>
-            </w:r>
-          </w:p>
-        </w:tc>
-        <w:tc>
-          <w:tcPr>
-            <w:tcW w:type="dxa" w:w="1040"/>
-          </w:tcPr>
-          <w:p>
-            <w:r>
-              <w:rPr>
-                <w:sz w:val="14"/>
-              </w:rPr>
-              <w:t>510.1</w:t>
-            </w:r>
-          </w:p>
-        </w:tc>
-        <w:tc>
-          <w:tcPr>
-            <w:tcW w:type="dxa" w:w="1040"/>
-          </w:tcPr>
-          <w:p>
-            <w:r>
-              <w:rPr>
-                <w:sz w:val="14"/>
-              </w:rPr>
-              <w:t>0.040</w:t>
+              <w:t>40.00</w:t>
+            </w:r>
+          </w:p>
+        </w:tc>
+        <w:tc>
+          <w:tcPr>
+            <w:tcW w:type="dxa" w:w="1040"/>
+          </w:tcPr>
+          <w:p>
+            <w:r>
+              <w:rPr>
+                <w:sz w:val="14"/>
+              </w:rPr>
+              <w:t>40.00</w:t>
+            </w:r>
+          </w:p>
+        </w:tc>
+        <w:tc>
+          <w:tcPr>
+            <w:tcW w:type="dxa" w:w="1040"/>
+          </w:tcPr>
+          <w:p>
+            <w:r>
+              <w:rPr>
+                <w:sz w:val="14"/>
+              </w:rPr>
+              <w:t>55.82</w:t>
+            </w:r>
+          </w:p>
+        </w:tc>
+        <w:tc>
+          <w:tcPr>
+            <w:tcW w:type="dxa" w:w="1040"/>
+          </w:tcPr>
+          <w:p>
+            <w:r>
+              <w:rPr>
+                <w:sz w:val="14"/>
+              </w:rPr>
+              <w:t>55.21</w:t>
+            </w:r>
+          </w:p>
+        </w:tc>
+        <w:tc>
+          <w:tcPr>
+            <w:tcW w:type="dxa" w:w="1040"/>
+          </w:tcPr>
+          <w:p>
+            <w:r>
+              <w:rPr>
+                <w:sz w:val="14"/>
+              </w:rPr>
+              <w:t>0.000</w:t>
             </w:r>
           </w:p>
         </w:tc>
@@ -6950,59 +6941,59 @@
               <w:rPr>
                 <w:sz w:val="14"/>
               </w:rPr>
-              <w:t>80.00</w:t>
-            </w:r>
-          </w:p>
-        </w:tc>
-        <w:tc>
-          <w:tcPr>
-            <w:tcW w:type="dxa" w:w="1040"/>
-          </w:tcPr>
-          <w:p>
-            <w:r>
-              <w:rPr>
-                <w:sz w:val="14"/>
-              </w:rPr>
-              <w:t>80.00</w:t>
-            </w:r>
-          </w:p>
-        </w:tc>
-        <w:tc>
-          <w:tcPr>
-            <w:tcW w:type="dxa" w:w="1040"/>
-          </w:tcPr>
-          <w:p>
-            <w:r>
-              <w:rPr>
-                <w:sz w:val="14"/>
-              </w:rPr>
-              <w:t>114.4</w:t>
-            </w:r>
-          </w:p>
-        </w:tc>
-        <w:tc>
-          <w:tcPr>
-            <w:tcW w:type="dxa" w:w="1040"/>
-          </w:tcPr>
-          <w:p>
-            <w:r>
-              <w:rPr>
-                <w:sz w:val="14"/>
-              </w:rPr>
-              <w:t>111.9</w:t>
-            </w:r>
-          </w:p>
-        </w:tc>
-        <w:tc>
-          <w:tcPr>
-            <w:tcW w:type="dxa" w:w="1040"/>
-          </w:tcPr>
-          <w:p>
-            <w:r>
-              <w:rPr>
-                <w:sz w:val="14"/>
-              </w:rPr>
-              <w:t>0.000</w:t>
+              <w:t>40.00</w:t>
+            </w:r>
+          </w:p>
+        </w:tc>
+        <w:tc>
+          <w:tcPr>
+            <w:tcW w:type="dxa" w:w="1040"/>
+          </w:tcPr>
+          <w:p>
+            <w:r>
+              <w:rPr>
+                <w:sz w:val="14"/>
+              </w:rPr>
+              <w:t>40.00</w:t>
+            </w:r>
+          </w:p>
+        </w:tc>
+        <w:tc>
+          <w:tcPr>
+            <w:tcW w:type="dxa" w:w="1040"/>
+          </w:tcPr>
+          <w:p>
+            <w:r>
+              <w:rPr>
+                <w:sz w:val="14"/>
+              </w:rPr>
+              <w:t>5190.1</w:t>
+            </w:r>
+          </w:p>
+        </w:tc>
+        <w:tc>
+          <w:tcPr>
+            <w:tcW w:type="dxa" w:w="1040"/>
+          </w:tcPr>
+          <w:p>
+            <w:r>
+              <w:rPr>
+                <w:sz w:val="14"/>
+              </w:rPr>
+              <w:t>1152.8</w:t>
+            </w:r>
+          </w:p>
+        </w:tc>
+        <w:tc>
+          <w:tcPr>
+            <w:tcW w:type="dxa" w:w="1040"/>
+          </w:tcPr>
+          <w:p>
+            <w:r>
+              <w:rPr>
+                <w:sz w:val="14"/>
+              </w:rPr>
+              <w:t>0.164</w:t>
             </w:r>
           </w:p>
         </w:tc>
@@ -7069,59 +7060,59 @@
               <w:rPr>
                 <w:sz w:val="14"/>
               </w:rPr>
-              <w:t>80.00</w:t>
-            </w:r>
-          </w:p>
-        </w:tc>
-        <w:tc>
-          <w:tcPr>
-            <w:tcW w:type="dxa" w:w="1040"/>
-          </w:tcPr>
-          <w:p>
-            <w:r>
-              <w:rPr>
-                <w:sz w:val="14"/>
-              </w:rPr>
-              <w:t>80.00</w:t>
-            </w:r>
-          </w:p>
-        </w:tc>
-        <w:tc>
-          <w:tcPr>
-            <w:tcW w:type="dxa" w:w="1040"/>
-          </w:tcPr>
-          <w:p>
-            <w:r>
-              <w:rPr>
-                <w:sz w:val="14"/>
-              </w:rPr>
-              <w:t>103.8</w:t>
-            </w:r>
-          </w:p>
-        </w:tc>
-        <w:tc>
-          <w:tcPr>
-            <w:tcW w:type="dxa" w:w="1040"/>
-          </w:tcPr>
-          <w:p>
-            <w:r>
-              <w:rPr>
-                <w:sz w:val="14"/>
-              </w:rPr>
-              <w:t>103.8</w:t>
-            </w:r>
-          </w:p>
-        </w:tc>
-        <w:tc>
-          <w:tcPr>
-            <w:tcW w:type="dxa" w:w="1040"/>
-          </w:tcPr>
-          <w:p>
-            <w:r>
-              <w:rPr>
-                <w:sz w:val="14"/>
-              </w:rPr>
-              <w:t>0.000</w:t>
+              <w:t>4547.4</w:t>
+            </w:r>
+          </w:p>
+        </w:tc>
+        <w:tc>
+          <w:tcPr>
+            <w:tcW w:type="dxa" w:w="1040"/>
+          </w:tcPr>
+          <w:p>
+            <w:r>
+              <w:rPr>
+                <w:sz w:val="14"/>
+              </w:rPr>
+              <w:t>12.28</w:t>
+            </w:r>
+          </w:p>
+        </w:tc>
+        <w:tc>
+          <w:tcPr>
+            <w:tcW w:type="dxa" w:w="1040"/>
+          </w:tcPr>
+          <w:p>
+            <w:r>
+              <w:rPr>
+                <w:sz w:val="14"/>
+              </w:rPr>
+              <w:t>5929.2</w:t>
+            </w:r>
+          </w:p>
+        </w:tc>
+        <w:tc>
+          <w:tcPr>
+            <w:tcW w:type="dxa" w:w="1040"/>
+          </w:tcPr>
+          <w:p>
+            <w:r>
+              <w:rPr>
+                <w:sz w:val="14"/>
+              </w:rPr>
+              <w:t>997.2</w:t>
+            </w:r>
+          </w:p>
+        </w:tc>
+        <w:tc>
+          <w:tcPr>
+            <w:tcW w:type="dxa" w:w="1040"/>
+          </w:tcPr>
+          <w:p>
+            <w:r>
+              <w:rPr>
+                <w:sz w:val="14"/>
+              </w:rPr>
+              <w:t>0.972</w:t>
             </w:r>
           </w:p>
         </w:tc>
@@ -7147,7 +7138,7 @@
               <w:rPr>
                 <w:sz w:val="14"/>
               </w:rPr>
-              <w:t>True</w:t>
+              <w:t>False</w:t>
             </w:r>
           </w:p>
         </w:tc>
@@ -7188,46 +7179,7 @@
               <w:rPr>
                 <w:sz w:val="14"/>
               </w:rPr>
-              <w:t>80.00</w:t>
-            </w:r>
-          </w:p>
-        </w:tc>
-        <w:tc>
-          <w:tcPr>
-            <w:tcW w:type="dxa" w:w="1040"/>
-          </w:tcPr>
-          <w:p>
-            <w:r>
-              <w:rPr>
-                <w:sz w:val="14"/>
-              </w:rPr>
-              <w:t>80.00</w:t>
-            </w:r>
-          </w:p>
-        </w:tc>
-        <w:tc>
-          <w:tcPr>
-            <w:tcW w:type="dxa" w:w="1040"/>
-          </w:tcPr>
-          <w:p>
-            <w:r>
-              <w:rPr>
-                <w:sz w:val="14"/>
-              </w:rPr>
-              <w:t>103.8</w:t>
-            </w:r>
-          </w:p>
-        </w:tc>
-        <w:tc>
-          <w:tcPr>
-            <w:tcW w:type="dxa" w:w="1040"/>
-          </w:tcPr>
-          <w:p>
-            <w:r>
-              <w:rPr>
-                <w:sz w:val="14"/>
-              </w:rPr>
-              <w:t>103.8</w:t>
+              <w:t>6417.0</w:t>
             </w:r>
           </w:p>
         </w:tc>
@@ -7253,6 +7205,45 @@
               <w:rPr>
                 <w:sz w:val="14"/>
               </w:rPr>
+              <w:t>8324.5</w:t>
+            </w:r>
+          </w:p>
+        </w:tc>
+        <w:tc>
+          <w:tcPr>
+            <w:tcW w:type="dxa" w:w="1040"/>
+          </w:tcPr>
+          <w:p>
+            <w:r>
+              <w:rPr>
+                <w:sz w:val="14"/>
+              </w:rPr>
+              <w:t>0.000</w:t>
+            </w:r>
+          </w:p>
+        </w:tc>
+        <w:tc>
+          <w:tcPr>
+            <w:tcW w:type="dxa" w:w="1040"/>
+          </w:tcPr>
+          <w:p>
+            <w:r>
+              <w:rPr>
+                <w:sz w:val="14"/>
+              </w:rPr>
+              <w:t>1.000</w:t>
+            </w:r>
+          </w:p>
+        </w:tc>
+        <w:tc>
+          <w:tcPr>
+            <w:tcW w:type="dxa" w:w="1040"/>
+          </w:tcPr>
+          <w:p>
+            <w:r>
+              <w:rPr>
+                <w:sz w:val="14"/>
+              </w:rPr>
               <w:t>False</w:t>
             </w:r>
           </w:p>
@@ -7266,7 +7257,7 @@
               <w:rPr>
                 <w:sz w:val="14"/>
               </w:rPr>
-              <w:t>True</w:t>
+              <w:t>False</w:t>
             </w:r>
           </w:p>
         </w:tc>
@@ -7307,46 +7298,46 @@
               <w:rPr>
                 <w:sz w:val="14"/>
               </w:rPr>
-              <w:t>3210.6</w:t>
-            </w:r>
-          </w:p>
-        </w:tc>
-        <w:tc>
-          <w:tcPr>
-            <w:tcW w:type="dxa" w:w="1040"/>
-          </w:tcPr>
-          <w:p>
-            <w:r>
-              <w:rPr>
-                <w:sz w:val="14"/>
-              </w:rPr>
-              <w:t>40.00</w:t>
-            </w:r>
-          </w:p>
-        </w:tc>
-        <w:tc>
-          <w:tcPr>
-            <w:tcW w:type="dxa" w:w="1040"/>
-          </w:tcPr>
-          <w:p>
-            <w:r>
-              <w:rPr>
-                <w:sz w:val="14"/>
-              </w:rPr>
-              <w:t>4200.4</w:t>
-            </w:r>
-          </w:p>
-        </w:tc>
-        <w:tc>
-          <w:tcPr>
-            <w:tcW w:type="dxa" w:w="1040"/>
-          </w:tcPr>
-          <w:p>
-            <w:r>
-              <w:rPr>
-                <w:sz w:val="14"/>
-              </w:rPr>
-              <w:t>226.0</w:t>
+              <w:t>6417.0</w:t>
+            </w:r>
+          </w:p>
+        </w:tc>
+        <w:tc>
+          <w:tcPr>
+            <w:tcW w:type="dxa" w:w="1040"/>
+          </w:tcPr>
+          <w:p>
+            <w:r>
+              <w:rPr>
+                <w:sz w:val="14"/>
+              </w:rPr>
+              <w:t>0.000</w:t>
+            </w:r>
+          </w:p>
+        </w:tc>
+        <w:tc>
+          <w:tcPr>
+            <w:tcW w:type="dxa" w:w="1040"/>
+          </w:tcPr>
+          <w:p>
+            <w:r>
+              <w:rPr>
+                <w:sz w:val="14"/>
+              </w:rPr>
+              <w:t>8324.5</w:t>
+            </w:r>
+          </w:p>
+        </w:tc>
+        <w:tc>
+          <w:tcPr>
+            <w:tcW w:type="dxa" w:w="1040"/>
+          </w:tcPr>
+          <w:p>
+            <w:r>
+              <w:rPr>
+                <w:sz w:val="14"/>
+              </w:rPr>
+              <w:t>0.000</w:t>
             </w:r>
           </w:p>
         </w:tc>
@@ -7545,59 +7536,59 @@
               <w:rPr>
                 <w:sz w:val="14"/>
               </w:rPr>
-              <w:t>80.00</w:t>
-            </w:r>
-          </w:p>
-        </w:tc>
-        <w:tc>
-          <w:tcPr>
-            <w:tcW w:type="dxa" w:w="1040"/>
-          </w:tcPr>
-          <w:p>
-            <w:r>
-              <w:rPr>
-                <w:sz w:val="14"/>
-              </w:rPr>
-              <w:t>80.00</w:t>
-            </w:r>
-          </w:p>
-        </w:tc>
-        <w:tc>
-          <w:tcPr>
-            <w:tcW w:type="dxa" w:w="1040"/>
-          </w:tcPr>
-          <w:p>
-            <w:r>
-              <w:rPr>
-                <w:sz w:val="14"/>
-              </w:rPr>
-              <w:t>7465.5</w:t>
-            </w:r>
-          </w:p>
-        </w:tc>
-        <w:tc>
-          <w:tcPr>
-            <w:tcW w:type="dxa" w:w="1040"/>
-          </w:tcPr>
-          <w:p>
-            <w:r>
-              <w:rPr>
-                <w:sz w:val="14"/>
-              </w:rPr>
-              <w:t>5482.6</w:t>
-            </w:r>
-          </w:p>
-        </w:tc>
-        <w:tc>
-          <w:tcPr>
-            <w:tcW w:type="dxa" w:w="1040"/>
-          </w:tcPr>
-          <w:p>
-            <w:r>
-              <w:rPr>
-                <w:sz w:val="14"/>
-              </w:rPr>
-              <w:t>0.432</w:t>
+              <w:t>40.00</w:t>
+            </w:r>
+          </w:p>
+        </w:tc>
+        <w:tc>
+          <w:tcPr>
+            <w:tcW w:type="dxa" w:w="1040"/>
+          </w:tcPr>
+          <w:p>
+            <w:r>
+              <w:rPr>
+                <w:sz w:val="14"/>
+              </w:rPr>
+              <w:t>40.00</w:t>
+            </w:r>
+          </w:p>
+        </w:tc>
+        <w:tc>
+          <w:tcPr>
+            <w:tcW w:type="dxa" w:w="1040"/>
+          </w:tcPr>
+          <w:p>
+            <w:r>
+              <w:rPr>
+                <w:sz w:val="14"/>
+              </w:rPr>
+              <w:t>51.89</w:t>
+            </w:r>
+          </w:p>
+        </w:tc>
+        <w:tc>
+          <w:tcPr>
+            <w:tcW w:type="dxa" w:w="1040"/>
+          </w:tcPr>
+          <w:p>
+            <w:r>
+              <w:rPr>
+                <w:sz w:val="14"/>
+              </w:rPr>
+              <w:t>51.89</w:t>
+            </w:r>
+          </w:p>
+        </w:tc>
+        <w:tc>
+          <w:tcPr>
+            <w:tcW w:type="dxa" w:w="1040"/>
+          </w:tcPr>
+          <w:p>
+            <w:r>
+              <w:rPr>
+                <w:sz w:val="14"/>
+              </w:rPr>
+              <w:t>0.000</w:t>
             </w:r>
           </w:p>
         </w:tc>
@@ -7623,7 +7614,7 @@
               <w:rPr>
                 <w:sz w:val="14"/>
               </w:rPr>
-              <w:t>False</w:t>
+              <w:t>True</w:t>
             </w:r>
           </w:p>
         </w:tc>
@@ -7664,46 +7655,46 @@
               <w:rPr>
                 <w:sz w:val="14"/>
               </w:rPr>
-              <w:t>80.00</w:t>
-            </w:r>
-          </w:p>
-        </w:tc>
-        <w:tc>
-          <w:tcPr>
-            <w:tcW w:type="dxa" w:w="1040"/>
-          </w:tcPr>
-          <w:p>
-            <w:r>
-              <w:rPr>
-                <w:sz w:val="14"/>
-              </w:rPr>
-              <w:t>80.00</w:t>
-            </w:r>
-          </w:p>
-        </w:tc>
-        <w:tc>
-          <w:tcPr>
-            <w:tcW w:type="dxa" w:w="1040"/>
-          </w:tcPr>
-          <w:p>
-            <w:r>
-              <w:rPr>
-                <w:sz w:val="14"/>
-              </w:rPr>
-              <w:t>103.8</w:t>
-            </w:r>
-          </w:p>
-        </w:tc>
-        <w:tc>
-          <w:tcPr>
-            <w:tcW w:type="dxa" w:w="1040"/>
-          </w:tcPr>
-          <w:p>
-            <w:r>
-              <w:rPr>
-                <w:sz w:val="14"/>
-              </w:rPr>
-              <w:t>103.8</w:t>
+              <w:t>40.00</w:t>
+            </w:r>
+          </w:p>
+        </w:tc>
+        <w:tc>
+          <w:tcPr>
+            <w:tcW w:type="dxa" w:w="1040"/>
+          </w:tcPr>
+          <w:p>
+            <w:r>
+              <w:rPr>
+                <w:sz w:val="14"/>
+              </w:rPr>
+              <w:t>40.00</w:t>
+            </w:r>
+          </w:p>
+        </w:tc>
+        <w:tc>
+          <w:tcPr>
+            <w:tcW w:type="dxa" w:w="1040"/>
+          </w:tcPr>
+          <w:p>
+            <w:r>
+              <w:rPr>
+                <w:sz w:val="14"/>
+              </w:rPr>
+              <w:t>51.89</w:t>
+            </w:r>
+          </w:p>
+        </w:tc>
+        <w:tc>
+          <w:tcPr>
+            <w:tcW w:type="dxa" w:w="1040"/>
+          </w:tcPr>
+          <w:p>
+            <w:r>
+              <w:rPr>
+                <w:sz w:val="14"/>
+              </w:rPr>
+              <w:t>51.89</w:t>
             </w:r>
           </w:p>
         </w:tc>
@@ -7783,59 +7774,59 @@
               <w:rPr>
                 <w:sz w:val="14"/>
               </w:rPr>
-              <w:t>80.00</w:t>
-            </w:r>
-          </w:p>
-        </w:tc>
-        <w:tc>
-          <w:tcPr>
-            <w:tcW w:type="dxa" w:w="1040"/>
-          </w:tcPr>
-          <w:p>
-            <w:r>
-              <w:rPr>
-                <w:sz w:val="14"/>
-              </w:rPr>
-              <w:t>80.00</w:t>
-            </w:r>
-          </w:p>
-        </w:tc>
-        <w:tc>
-          <w:tcPr>
-            <w:tcW w:type="dxa" w:w="1040"/>
-          </w:tcPr>
-          <w:p>
-            <w:r>
-              <w:rPr>
-                <w:sz w:val="14"/>
-              </w:rPr>
-              <w:t>2211.4</w:t>
-            </w:r>
-          </w:p>
-        </w:tc>
-        <w:tc>
-          <w:tcPr>
-            <w:tcW w:type="dxa" w:w="1040"/>
-          </w:tcPr>
-          <w:p>
-            <w:r>
-              <w:rPr>
-                <w:sz w:val="14"/>
-              </w:rPr>
-              <w:t>655.8</w:t>
-            </w:r>
-          </w:p>
-        </w:tc>
-        <w:tc>
-          <w:tcPr>
-            <w:tcW w:type="dxa" w:w="1040"/>
-          </w:tcPr>
-          <w:p>
-            <w:r>
-              <w:rPr>
-                <w:sz w:val="14"/>
-              </w:rPr>
-              <w:t>0.068</w:t>
+              <w:t>40.00</w:t>
+            </w:r>
+          </w:p>
+        </w:tc>
+        <w:tc>
+          <w:tcPr>
+            <w:tcW w:type="dxa" w:w="1040"/>
+          </w:tcPr>
+          <w:p>
+            <w:r>
+              <w:rPr>
+                <w:sz w:val="14"/>
+              </w:rPr>
+              <w:t>40.00</w:t>
+            </w:r>
+          </w:p>
+        </w:tc>
+        <w:tc>
+          <w:tcPr>
+            <w:tcW w:type="dxa" w:w="1040"/>
+          </w:tcPr>
+          <w:p>
+            <w:r>
+              <w:rPr>
+                <w:sz w:val="14"/>
+              </w:rPr>
+              <w:t>51.89</w:t>
+            </w:r>
+          </w:p>
+        </w:tc>
+        <w:tc>
+          <w:tcPr>
+            <w:tcW w:type="dxa" w:w="1040"/>
+          </w:tcPr>
+          <w:p>
+            <w:r>
+              <w:rPr>
+                <w:sz w:val="14"/>
+              </w:rPr>
+              <w:t>51.89</w:t>
+            </w:r>
+          </w:p>
+        </w:tc>
+        <w:tc>
+          <w:tcPr>
+            <w:tcW w:type="dxa" w:w="1040"/>
+          </w:tcPr>
+          <w:p>
+            <w:r>
+              <w:rPr>
+                <w:sz w:val="14"/>
+              </w:rPr>
+              <w:t>0.000</w:t>
             </w:r>
           </w:p>
         </w:tc>
@@ -7861,7 +7852,7 @@
               <w:rPr>
                 <w:sz w:val="14"/>
               </w:rPr>
-              <w:t>False</w:t>
+              <w:t>True</w:t>
             </w:r>
           </w:p>
         </w:tc>
@@ -8655,20 +8646,20 @@
               <w:rPr>
                 <w:sz w:val="14"/>
               </w:rPr>
-              <w:t>0.000</w:t>
-            </w:r>
-          </w:p>
-        </w:tc>
-        <w:tc>
-          <w:tcPr>
-            <w:tcW w:type="dxa" w:w="1040"/>
-          </w:tcPr>
-          <w:p>
-            <w:r>
-              <w:rPr>
-                <w:sz w:val="14"/>
-              </w:rPr>
-              <w:t>1.000</w:t>
+              <w:t>382.1</w:t>
+            </w:r>
+          </w:p>
+        </w:tc>
+        <w:tc>
+          <w:tcPr>
+            <w:tcW w:type="dxa" w:w="1040"/>
+          </w:tcPr>
+          <w:p>
+            <w:r>
+              <w:rPr>
+                <w:sz w:val="14"/>
+              </w:rPr>
+              <w:t>0.992</w:t>
             </w:r>
           </w:p>
         </w:tc>
@@ -8774,20 +8765,20 @@
               <w:rPr>
                 <w:sz w:val="14"/>
               </w:rPr>
-              <w:t>900.9</w:t>
-            </w:r>
-          </w:p>
-        </w:tc>
-        <w:tc>
-          <w:tcPr>
-            <w:tcW w:type="dxa" w:w="1040"/>
-          </w:tcPr>
-          <w:p>
-            <w:r>
-              <w:rPr>
-                <w:sz w:val="14"/>
-              </w:rPr>
-              <w:t>0.984</w:t>
+              <w:t>0.000</w:t>
+            </w:r>
+          </w:p>
+        </w:tc>
+        <w:tc>
+          <w:tcPr>
+            <w:tcW w:type="dxa" w:w="1040"/>
+          </w:tcPr>
+          <w:p>
+            <w:r>
+              <w:rPr>
+                <w:sz w:val="14"/>
+              </w:rPr>
+              <w:t>1.000</w:t>
             </w:r>
           </w:p>
         </w:tc>
@@ -9153,20 +9144,20 @@
               <w:rPr>
                 <w:sz w:val="14"/>
               </w:rPr>
-              <w:t>3760.0</w:t>
-            </w:r>
-          </w:p>
-        </w:tc>
-        <w:tc>
-          <w:tcPr>
-            <w:tcW w:type="dxa" w:w="1040"/>
-          </w:tcPr>
-          <w:p>
-            <w:r>
-              <w:rPr>
-                <w:sz w:val="14"/>
-              </w:rPr>
-              <w:t>10.88</w:t>
+              <w:t>5612.9</w:t>
+            </w:r>
+          </w:p>
+        </w:tc>
+        <w:tc>
+          <w:tcPr>
+            <w:tcW w:type="dxa" w:w="1040"/>
+          </w:tcPr>
+          <w:p>
+            <w:r>
+              <w:rPr>
+                <w:sz w:val="14"/>
+              </w:rPr>
+              <w:t>16.24</w:t>
             </w:r>
           </w:p>
         </w:tc>
@@ -9192,20 +9183,20 @@
               <w:rPr>
                 <w:sz w:val="14"/>
               </w:rPr>
-              <w:t>175.6</w:t>
-            </w:r>
-          </w:p>
-        </w:tc>
-        <w:tc>
-          <w:tcPr>
-            <w:tcW w:type="dxa" w:w="1040"/>
-          </w:tcPr>
-          <w:p>
-            <w:r>
-              <w:rPr>
-                <w:sz w:val="14"/>
-              </w:rPr>
-              <w:t>49.19</w:t>
+              <w:t>114.0</w:t>
+            </w:r>
+          </w:p>
+        </w:tc>
+        <w:tc>
+          <w:tcPr>
+            <w:tcW w:type="dxa" w:w="1040"/>
+          </w:tcPr>
+          <w:p>
+            <w:r>
+              <w:rPr>
+                <w:sz w:val="14"/>
+              </w:rPr>
+              <w:t>67.01</w:t>
             </w:r>
           </w:p>
         </w:tc>
@@ -9272,20 +9263,20 @@
               <w:rPr>
                 <w:sz w:val="14"/>
               </w:rPr>
-              <w:t>3903.8</w:t>
-            </w:r>
-          </w:p>
-        </w:tc>
-        <w:tc>
-          <w:tcPr>
-            <w:tcW w:type="dxa" w:w="1040"/>
-          </w:tcPr>
-          <w:p>
-            <w:r>
-              <w:rPr>
-                <w:sz w:val="14"/>
-              </w:rPr>
-              <w:t>11.62</w:t>
+              <w:t>5603.9</w:t>
+            </w:r>
+          </w:p>
+        </w:tc>
+        <w:tc>
+          <w:tcPr>
+            <w:tcW w:type="dxa" w:w="1040"/>
+          </w:tcPr>
+          <w:p>
+            <w:r>
+              <w:rPr>
+                <w:sz w:val="14"/>
+              </w:rPr>
+              <w:t>16.68</w:t>
             </w:r>
           </w:p>
         </w:tc>
@@ -9311,20 +9302,20 @@
               <w:rPr>
                 <w:sz w:val="14"/>
               </w:rPr>
-              <w:t>168.0</w:t>
-            </w:r>
-          </w:p>
-        </w:tc>
-        <w:tc>
-          <w:tcPr>
-            <w:tcW w:type="dxa" w:w="1040"/>
-          </w:tcPr>
-          <w:p>
-            <w:r>
-              <w:rPr>
-                <w:sz w:val="14"/>
-              </w:rPr>
-              <w:t>50.00</w:t>
+              <w:t>106.0</w:t>
+            </w:r>
+          </w:p>
+        </w:tc>
+        <w:tc>
+          <w:tcPr>
+            <w:tcW w:type="dxa" w:w="1040"/>
+          </w:tcPr>
+          <w:p>
+            <w:r>
+              <w:rPr>
+                <w:sz w:val="14"/>
+              </w:rPr>
+              <w:t>68.45</w:t>
             </w:r>
           </w:p>
         </w:tc>
@@ -9391,20 +9382,20 @@
               <w:rPr>
                 <w:sz w:val="14"/>
               </w:rPr>
-              <w:t>3151.5</w:t>
-            </w:r>
-          </w:p>
-        </w:tc>
-        <w:tc>
-          <w:tcPr>
-            <w:tcW w:type="dxa" w:w="1040"/>
-          </w:tcPr>
-          <w:p>
-            <w:r>
-              <w:rPr>
-                <w:sz w:val="14"/>
-              </w:rPr>
-              <w:t>10.26</w:t>
+              <w:t>5064.1</w:t>
+            </w:r>
+          </w:p>
+        </w:tc>
+        <w:tc>
+          <w:tcPr>
+            <w:tcW w:type="dxa" w:w="1040"/>
+          </w:tcPr>
+          <w:p>
+            <w:r>
+              <w:rPr>
+                <w:sz w:val="14"/>
+              </w:rPr>
+              <w:t>16.48</w:t>
             </w:r>
           </w:p>
         </w:tc>
@@ -9430,20 +9421,20 @@
               <w:rPr>
                 <w:sz w:val="14"/>
               </w:rPr>
-              <w:t>153.6</w:t>
-            </w:r>
-          </w:p>
-        </w:tc>
-        <w:tc>
-          <w:tcPr>
-            <w:tcW w:type="dxa" w:w="1040"/>
-          </w:tcPr>
-          <w:p>
-            <w:r>
-              <w:rPr>
-                <w:sz w:val="14"/>
-              </w:rPr>
-              <w:t>50.00</w:t>
+              <w:t>97.60</w:t>
+            </w:r>
+          </w:p>
+        </w:tc>
+        <w:tc>
+          <w:tcPr>
+            <w:tcW w:type="dxa" w:w="1040"/>
+          </w:tcPr>
+          <w:p>
+            <w:r>
+              <w:rPr>
+                <w:sz w:val="14"/>
+              </w:rPr>
+              <w:t>68.23</w:t>
             </w:r>
           </w:p>
         </w:tc>
@@ -9510,20 +9501,20 @@
               <w:rPr>
                 <w:sz w:val="14"/>
               </w:rPr>
-              <w:t>2910.6</w:t>
-            </w:r>
-          </w:p>
-        </w:tc>
-        <w:tc>
-          <w:tcPr>
-            <w:tcW w:type="dxa" w:w="1040"/>
-          </w:tcPr>
-          <w:p>
-            <w:r>
-              <w:rPr>
-                <w:sz w:val="14"/>
-              </w:rPr>
-              <w:t>9.187</w:t>
+              <w:t>4278.4</w:t>
+            </w:r>
+          </w:p>
+        </w:tc>
+        <w:tc>
+          <w:tcPr>
+            <w:tcW w:type="dxa" w:w="1040"/>
+          </w:tcPr>
+          <w:p>
+            <w:r>
+              <w:rPr>
+                <w:sz w:val="14"/>
+              </w:rPr>
+              <w:t>13.50</w:t>
             </w:r>
           </w:p>
         </w:tc>
@@ -9549,20 +9540,20 @@
               <w:rPr>
                 <w:sz w:val="14"/>
               </w:rPr>
-              <w:t>158.4</w:t>
-            </w:r>
-          </w:p>
-        </w:tc>
-        <w:tc>
-          <w:tcPr>
-            <w:tcW w:type="dxa" w:w="1040"/>
-          </w:tcPr>
-          <w:p>
-            <w:r>
-              <w:rPr>
-                <w:sz w:val="14"/>
-              </w:rPr>
-              <w:t>50.00</w:t>
+              <w:t>92.40</w:t>
+            </w:r>
+          </w:p>
+        </w:tc>
+        <w:tc>
+          <w:tcPr>
+            <w:tcW w:type="dxa" w:w="1040"/>
+          </w:tcPr>
+          <w:p>
+            <w:r>
+              <w:rPr>
+                <w:sz w:val="14"/>
+              </w:rPr>
+              <w:t>70.83</w:t>
             </w:r>
           </w:p>
         </w:tc>
@@ -9629,20 +9620,20 @@
               <w:rPr>
                 <w:sz w:val="14"/>
               </w:rPr>
-              <w:t>2282.4</w:t>
-            </w:r>
-          </w:p>
-        </w:tc>
-        <w:tc>
-          <w:tcPr>
-            <w:tcW w:type="dxa" w:w="1040"/>
-          </w:tcPr>
-          <w:p>
-            <w:r>
-              <w:rPr>
-                <w:sz w:val="14"/>
-              </w:rPr>
-              <w:t>5.058</w:t>
+              <w:t>3682.3</w:t>
+            </w:r>
+          </w:p>
+        </w:tc>
+        <w:tc>
+          <w:tcPr>
+            <w:tcW w:type="dxa" w:w="1040"/>
+          </w:tcPr>
+          <w:p>
+            <w:r>
+              <w:rPr>
+                <w:sz w:val="14"/>
+              </w:rPr>
+              <w:t>8.161</w:t>
             </w:r>
           </w:p>
         </w:tc>
@@ -9668,20 +9659,20 @@
               <w:rPr>
                 <w:sz w:val="14"/>
               </w:rPr>
-              <w:t>225.6</w:t>
-            </w:r>
-          </w:p>
-        </w:tc>
-        <w:tc>
-          <w:tcPr>
-            <w:tcW w:type="dxa" w:w="1040"/>
-          </w:tcPr>
-          <w:p>
-            <w:r>
-              <w:rPr>
-                <w:sz w:val="14"/>
-              </w:rPr>
-              <w:t>50.00</w:t>
+              <w:t>131.6</w:t>
+            </w:r>
+          </w:p>
+        </w:tc>
+        <w:tc>
+          <w:tcPr>
+            <w:tcW w:type="dxa" w:w="1040"/>
+          </w:tcPr>
+          <w:p>
+            <w:r>
+              <w:rPr>
+                <w:sz w:val="14"/>
+              </w:rPr>
+              <w:t>70.83</w:t>
             </w:r>
           </w:p>
         </w:tc>
@@ -9748,20 +9739,20 @@
               <w:rPr>
                 <w:sz w:val="14"/>
               </w:rPr>
-              <w:t>563.2</w:t>
-            </w:r>
-          </w:p>
-        </w:tc>
-        <w:tc>
-          <w:tcPr>
-            <w:tcW w:type="dxa" w:w="1040"/>
-          </w:tcPr>
-          <w:p>
-            <w:r>
-              <w:rPr>
-                <w:sz w:val="14"/>
-              </w:rPr>
-              <w:t>2.023</w:t>
+              <w:t>1729.7</w:t>
+            </w:r>
+          </w:p>
+        </w:tc>
+        <w:tc>
+          <w:tcPr>
+            <w:tcW w:type="dxa" w:w="1040"/>
+          </w:tcPr>
+          <w:p>
+            <w:r>
+              <w:rPr>
+                <w:sz w:val="14"/>
+              </w:rPr>
+              <w:t>6.213</w:t>
             </w:r>
           </w:p>
         </w:tc>
@@ -9787,20 +9778,20 @@
               <w:rPr>
                 <w:sz w:val="14"/>
               </w:rPr>
-              <w:t>139.6</w:t>
-            </w:r>
-          </w:p>
-        </w:tc>
-        <w:tc>
-          <w:tcPr>
-            <w:tcW w:type="dxa" w:w="1040"/>
-          </w:tcPr>
-          <w:p>
-            <w:r>
-              <w:rPr>
-                <w:sz w:val="14"/>
-              </w:rPr>
-              <w:t>49.86</w:t>
+              <w:t>81.60</w:t>
+            </w:r>
+          </w:p>
+        </w:tc>
+        <w:tc>
+          <w:tcPr>
+            <w:tcW w:type="dxa" w:w="1040"/>
+          </w:tcPr>
+          <w:p>
+            <w:r>
+              <w:rPr>
+                <w:sz w:val="14"/>
+              </w:rPr>
+              <w:t>70.69</w:t>
             </w:r>
           </w:p>
         </w:tc>
@@ -9867,20 +9858,20 @@
               <w:rPr>
                 <w:sz w:val="14"/>
               </w:rPr>
-              <w:t>2570.7</w:t>
-            </w:r>
-          </w:p>
-        </w:tc>
-        <w:tc>
-          <w:tcPr>
-            <w:tcW w:type="dxa" w:w="1040"/>
-          </w:tcPr>
-          <w:p>
-            <w:r>
-              <w:rPr>
-                <w:sz w:val="14"/>
-              </w:rPr>
-              <w:t>5.150</w:t>
+              <w:t>3701.6</w:t>
+            </w:r>
+          </w:p>
+        </w:tc>
+        <w:tc>
+          <w:tcPr>
+            <w:tcW w:type="dxa" w:w="1040"/>
+          </w:tcPr>
+          <w:p>
+            <w:r>
+              <w:rPr>
+                <w:sz w:val="14"/>
+              </w:rPr>
+              <w:t>7.415</w:t>
             </w:r>
           </w:p>
         </w:tc>
@@ -9906,20 +9897,20 @@
               <w:rPr>
                 <w:sz w:val="14"/>
               </w:rPr>
-              <w:t>254.8</w:t>
-            </w:r>
-          </w:p>
-        </w:tc>
-        <w:tc>
-          <w:tcPr>
-            <w:tcW w:type="dxa" w:w="1040"/>
-          </w:tcPr>
-          <w:p>
-            <w:r>
-              <w:rPr>
-                <w:sz w:val="14"/>
-              </w:rPr>
-              <w:t>48.96</w:t>
+              <w:t>145.6</w:t>
+            </w:r>
+          </w:p>
+        </w:tc>
+        <w:tc>
+          <w:tcPr>
+            <w:tcW w:type="dxa" w:w="1040"/>
+          </w:tcPr>
+          <w:p>
+            <w:r>
+              <w:rPr>
+                <w:sz w:val="14"/>
+              </w:rPr>
+              <w:t>70.83</w:t>
             </w:r>
           </w:p>
         </w:tc>
@@ -9986,20 +9977,20 @@
               <w:rPr>
                 <w:sz w:val="14"/>
               </w:rPr>
-              <w:t>1728.7</w:t>
-            </w:r>
-          </w:p>
-        </w:tc>
-        <w:tc>
-          <w:tcPr>
-            <w:tcW w:type="dxa" w:w="1040"/>
-          </w:tcPr>
-          <w:p>
-            <w:r>
-              <w:rPr>
-                <w:sz w:val="14"/>
-              </w:rPr>
-              <w:t>6.209</w:t>
+              <w:t>3372.6</w:t>
+            </w:r>
+          </w:p>
+        </w:tc>
+        <w:tc>
+          <w:tcPr>
+            <w:tcW w:type="dxa" w:w="1040"/>
+          </w:tcPr>
+          <w:p>
+            <w:r>
+              <w:rPr>
+                <w:sz w:val="14"/>
+              </w:rPr>
+              <w:t>12.11</w:t>
             </w:r>
           </w:p>
         </w:tc>
@@ -10025,20 +10016,20 @@
               <w:rPr>
                 <w:sz w:val="14"/>
               </w:rPr>
-              <w:t>139.2</w:t>
-            </w:r>
-          </w:p>
-        </w:tc>
-        <w:tc>
-          <w:tcPr>
-            <w:tcW w:type="dxa" w:w="1040"/>
-          </w:tcPr>
-          <w:p>
-            <w:r>
-              <w:rPr>
-                <w:sz w:val="14"/>
-              </w:rPr>
-              <w:t>50.00</w:t>
+              <w:t>81.20</w:t>
+            </w:r>
+          </w:p>
+        </w:tc>
+        <w:tc>
+          <w:tcPr>
+            <w:tcW w:type="dxa" w:w="1040"/>
+          </w:tcPr>
+          <w:p>
+            <w:r>
+              <w:rPr>
+                <w:sz w:val="14"/>
+              </w:rPr>
+              <w:t>70.83</w:t>
             </w:r>
           </w:p>
         </w:tc>
@@ -10105,20 +10096,20 @@
               <w:rPr>
                 <w:sz w:val="14"/>
               </w:rPr>
-              <w:t>787.8</w:t>
-            </w:r>
-          </w:p>
-        </w:tc>
-        <w:tc>
-          <w:tcPr>
-            <w:tcW w:type="dxa" w:w="1040"/>
-          </w:tcPr>
-          <w:p>
-            <w:r>
-              <w:rPr>
-                <w:sz w:val="14"/>
-              </w:rPr>
-              <w:t>2.830</w:t>
+              <w:t>2376.7</w:t>
+            </w:r>
+          </w:p>
+        </w:tc>
+        <w:tc>
+          <w:tcPr>
+            <w:tcW w:type="dxa" w:w="1040"/>
+          </w:tcPr>
+          <w:p>
+            <w:r>
+              <w:rPr>
+                <w:sz w:val="14"/>
+              </w:rPr>
+              <w:t>8.537</w:t>
             </w:r>
           </w:p>
         </w:tc>
@@ -10144,20 +10135,20 @@
               <w:rPr>
                 <w:sz w:val="14"/>
               </w:rPr>
-              <w:t>139.2</w:t>
-            </w:r>
-          </w:p>
-        </w:tc>
-        <w:tc>
-          <w:tcPr>
-            <w:tcW w:type="dxa" w:w="1040"/>
-          </w:tcPr>
-          <w:p>
-            <w:r>
-              <w:rPr>
-                <w:sz w:val="14"/>
-              </w:rPr>
-              <w:t>50.00</w:t>
+              <w:t>81.20</w:t>
+            </w:r>
+          </w:p>
+        </w:tc>
+        <w:tc>
+          <w:tcPr>
+            <w:tcW w:type="dxa" w:w="1040"/>
+          </w:tcPr>
+          <w:p>
+            <w:r>
+              <w:rPr>
+                <w:sz w:val="14"/>
+              </w:rPr>
+              <w:t>70.83</w:t>
             </w:r>
           </w:p>
         </w:tc>
@@ -10224,20 +10215,20 @@
               <w:rPr>
                 <w:sz w:val="14"/>
               </w:rPr>
-              <w:t>1140.7</w:t>
-            </w:r>
-          </w:p>
-        </w:tc>
-        <w:tc>
-          <w:tcPr>
-            <w:tcW w:type="dxa" w:w="1040"/>
-          </w:tcPr>
-          <w:p>
-            <w:r>
-              <w:rPr>
-                <w:sz w:val="14"/>
-              </w:rPr>
-              <w:t>2.971</w:t>
+              <w:t>2319.6</w:t>
+            </w:r>
+          </w:p>
+        </w:tc>
+        <w:tc>
+          <w:tcPr>
+            <w:tcW w:type="dxa" w:w="1040"/>
+          </w:tcPr>
+          <w:p>
+            <w:r>
+              <w:rPr>
+                <w:sz w:val="14"/>
+              </w:rPr>
+              <w:t>6.041</w:t>
             </w:r>
           </w:p>
         </w:tc>
@@ -10263,20 +10254,20 @@
               <w:rPr>
                 <w:sz w:val="14"/>
               </w:rPr>
-              <w:t>192.0</w:t>
-            </w:r>
-          </w:p>
-        </w:tc>
-        <w:tc>
-          <w:tcPr>
-            <w:tcW w:type="dxa" w:w="1040"/>
-          </w:tcPr>
-          <w:p>
-            <w:r>
-              <w:rPr>
-                <w:sz w:val="14"/>
-              </w:rPr>
-              <w:t>50.00</w:t>
+              <w:t>112.0</w:t>
+            </w:r>
+          </w:p>
+        </w:tc>
+        <w:tc>
+          <w:tcPr>
+            <w:tcW w:type="dxa" w:w="1040"/>
+          </w:tcPr>
+          <w:p>
+            <w:r>
+              <w:rPr>
+                <w:sz w:val="14"/>
+              </w:rPr>
+              <w:t>70.83</w:t>
             </w:r>
           </w:p>
         </w:tc>
@@ -10343,20 +10334,20 @@
               <w:rPr>
                 <w:sz w:val="14"/>
               </w:rPr>
-              <w:t>749.0</w:t>
-            </w:r>
-          </w:p>
-        </w:tc>
-        <w:tc>
-          <w:tcPr>
-            <w:tcW w:type="dxa" w:w="1040"/>
-          </w:tcPr>
-          <w:p>
-            <w:r>
-              <w:rPr>
-                <w:sz w:val="14"/>
-              </w:rPr>
-              <w:t>1.660</w:t>
+              <w:t>1349.8</w:t>
+            </w:r>
+          </w:p>
+        </w:tc>
+        <w:tc>
+          <w:tcPr>
+            <w:tcW w:type="dxa" w:w="1040"/>
+          </w:tcPr>
+          <w:p>
+            <w:r>
+              <w:rPr>
+                <w:sz w:val="14"/>
+              </w:rPr>
+              <w:t>2.992</w:t>
             </w:r>
           </w:p>
         </w:tc>
@@ -10382,20 +10373,20 @@
               <w:rPr>
                 <w:sz w:val="14"/>
               </w:rPr>
-              <w:t>224.4</w:t>
-            </w:r>
-          </w:p>
-        </w:tc>
-        <w:tc>
-          <w:tcPr>
-            <w:tcW w:type="dxa" w:w="1040"/>
-          </w:tcPr>
-          <w:p>
-            <w:r>
-              <w:rPr>
-                <w:sz w:val="14"/>
-              </w:rPr>
-              <w:t>50.00</w:t>
+              <w:t>130.9</w:t>
+            </w:r>
+          </w:p>
+        </w:tc>
+        <w:tc>
+          <w:tcPr>
+            <w:tcW w:type="dxa" w:w="1040"/>
+          </w:tcPr>
+          <w:p>
+            <w:r>
+              <w:rPr>
+                <w:sz w:val="14"/>
+              </w:rPr>
+              <w:t>70.83</w:t>
             </w:r>
           </w:p>
         </w:tc>
@@ -10462,20 +10453,20 @@
               <w:rPr>
                 <w:sz w:val="14"/>
               </w:rPr>
-              <w:t>441.2</w:t>
-            </w:r>
-          </w:p>
-        </w:tc>
-        <w:tc>
-          <w:tcPr>
-            <w:tcW w:type="dxa" w:w="1040"/>
-          </w:tcPr>
-          <w:p>
-            <w:r>
-              <w:rPr>
-                <w:sz w:val="14"/>
-              </w:rPr>
-              <w:t>1.209</w:t>
+              <w:t>1037.3</w:t>
+            </w:r>
+          </w:p>
+        </w:tc>
+        <w:tc>
+          <w:tcPr>
+            <w:tcW w:type="dxa" w:w="1040"/>
+          </w:tcPr>
+          <w:p>
+            <w:r>
+              <w:rPr>
+                <w:sz w:val="14"/>
+              </w:rPr>
+              <w:t>2.843</w:t>
             </w:r>
           </w:p>
         </w:tc>
@@ -10501,20 +10492,20 @@
               <w:rPr>
                 <w:sz w:val="14"/>
               </w:rPr>
-              <w:t>178.9</w:t>
-            </w:r>
-          </w:p>
-        </w:tc>
-        <w:tc>
-          <w:tcPr>
-            <w:tcW w:type="dxa" w:w="1040"/>
-          </w:tcPr>
-          <w:p>
-            <w:r>
-              <w:rPr>
-                <w:sz w:val="14"/>
-              </w:rPr>
-              <w:t>50.00</w:t>
+              <w:t>104.4</w:t>
+            </w:r>
+          </w:p>
+        </w:tc>
+        <w:tc>
+          <w:tcPr>
+            <w:tcW w:type="dxa" w:w="1040"/>
+          </w:tcPr>
+          <w:p>
+            <w:r>
+              <w:rPr>
+                <w:sz w:val="14"/>
+              </w:rPr>
+              <w:t>70.83</w:t>
             </w:r>
           </w:p>
         </w:tc>

</xml_diff>